<commit_message>
Added more to report
Added another 1000 words
</commit_message>
<xml_diff>
--- a/HonoursStageFinal.docx
+++ b/HonoursStageFinal.docx
@@ -5831,10 +5831,7 @@
         </w:numPr>
       </w:pPr>
       <w:r>
-        <w:t xml:space="preserve">The model must be able to use several different bands to form a prediction </w:t>
-      </w:r>
-      <w:r>
-        <w:t xml:space="preserve">to mitigate false positives </w:t>
+        <w:t xml:space="preserve">The model must be able to use several different bands to form a prediction to mitigate false positives </w:t>
       </w:r>
     </w:p>
     <w:p>
@@ -5945,6 +5942,9 @@
           <w:numId w:val="4"/>
         </w:numPr>
       </w:pPr>
+      <w:r>
+        <w:t>The interface must be able to explain to the user the errors that have occured</w:t>
+      </w:r>
     </w:p>
     <w:p/>
     <w:p>
@@ -6027,13 +6027,28 @@
     </w:p>
     <w:p>
       <w:r>
-        <w:t xml:space="preserve">The dataset will be extracted in tiles of the same size from the google earth engine. This ensures that the data will be </w:t>
+        <w:t xml:space="preserve">The dataset should include data from a specific fire in the chosen region, the fire must be available in the google earth engine. </w:t>
+      </w:r>
+      <w:r>
+        <w:t xml:space="preserve">The dataset will </w:t>
+      </w:r>
+      <w:r>
+        <w:t xml:space="preserve">then </w:t>
+      </w:r>
+      <w:r>
+        <w:t xml:space="preserve">be extracted in tiles of the same size from the google earth engine. This ensures that the data will be </w:t>
       </w:r>
       <w:r>
         <w:t>a</w:t>
       </w:r>
       <w:r>
-        <w:t xml:space="preserve"> consistent shape allowing for effective pattern recognition by a model.</w:t>
+        <w:t xml:space="preserve"> consistent shape allowing for effective </w:t>
+      </w:r>
+      <w:r>
+        <w:t>feature</w:t>
+      </w:r>
+      <w:r>
+        <w:t xml:space="preserve"> recognition by a model.</w:t>
       </w:r>
       <w:r>
         <w:t xml:space="preserve"> </w:t>
@@ -6048,7 +6063,42 @@
       <w:r>
         <w:t>Splitting the data into 4 distinct categories will allow the model to sort each tile inputted into it into a category.  This means that the patterns present in the training data can be learnt from and tiles can be predicted to be in a category based upon the patterns found in the data, patterns present before fires will help in fire prediction as if the conditions of an area before a fire occur in another area then it is likely that area will experience a fire.</w:t>
       </w:r>
-    </w:p>
+      <w:r>
+        <w:t xml:space="preserve"> </w:t>
+      </w:r>
+    </w:p>
+    <w:p>
+      <w:r>
+        <w:t>Furthermore, having categories for the model to predict instead of a percentage or score means that it is clearer to the user as a user with no prior knowledge will not be able to interpret a percentage of 35% of a fire occurring for example. Instead using a category-based system a user would be able to understand any output such as very likely for a fire to occur for example. It also allows for suggested actions based on the category rather than the user taking actions based on only a probability.</w:t>
+      </w:r>
+    </w:p>
+    <w:p>
+      <w:r>
+        <w:t>Since the dataset will be in a category-based approach, this means that data for each category will need to be captured. Unfortunately,</w:t>
+      </w:r>
+      <w:r>
+        <w:t xml:space="preserve"> due to the nature of the satellite data from the immediate vicinity to the during data cannot be collected as the satellite has a </w:t>
+      </w:r>
+      <w:r>
+        <w:t>sixteen-day</w:t>
+      </w:r>
+      <w:r>
+        <w:t xml:space="preserve"> revisit interval. This means that </w:t>
+      </w:r>
+      <w:r>
+        <w:t xml:space="preserve">the data will include sixteen days before, sixteen days after, during and a time with no recent fire to gather all stages of a fire possible from the </w:t>
+      </w:r>
+      <w:r>
+        <w:t>engine</w:t>
+      </w:r>
+      <w:r>
+        <w:t xml:space="preserve">. </w:t>
+      </w:r>
+      <w:r>
+        <w:t xml:space="preserve"> This means that the fire captured needs to last over a week for the data to be accurate. From this data a dataset can be extracted and used in predictions.</w:t>
+      </w:r>
+    </w:p>
+    <w:p/>
     <w:p>
       <w:pPr>
         <w:pStyle w:val="Heading2"/>
@@ -6062,6 +6112,55 @@
         <w:t xml:space="preserve"> design</w:t>
       </w:r>
       <w:bookmarkEnd w:id="22"/>
+    </w:p>
+    <w:p>
+      <w:r>
+        <w:t>Since the program does not need to take in any user data at any point the user does not need to log into the program or input any data other than to make a prediction on that data. This means that the interface can start on the home page.</w:t>
+      </w:r>
+    </w:p>
+    <w:p>
+      <w:r>
+        <w:t xml:space="preserve">The home page will present the user with several options these including a page to train the model and an about page which will explain to the user how to operate the program if they are unsure. Following training the model the user will be presented with the option to navigate to a prediction page which will allow the user to select a file on their local storage devices to input into the program. Once the user has inputted a file the interface will </w:t>
+      </w:r>
+      <w:r>
+        <w:t xml:space="preserve">navigate to a results page </w:t>
+      </w:r>
+      <w:r>
+        <w:t>then present the user with the rgb image of the data as well as the prediction made by the model. The user will be given suggested actions based on the outcome of the prediction as well as an option to return to the prediction screen to input another piece of data.</w:t>
+      </w:r>
+      <w:r>
+        <w:t xml:space="preserve"> The prediction page will also give an option to </w:t>
+      </w:r>
+      <w:r>
+        <w:lastRenderedPageBreak/>
+        <w:t>display a page explaining how to create suitable data for the model to predict on as incorrect data will not be able to be used which could result in a fire occurring due to the time sensitive nature of making a prediction before a fire could occur.</w:t>
+      </w:r>
+    </w:p>
+    <w:p>
+      <w:pPr>
+        <w:rPr>
+          <w:u w:val="single"/>
+        </w:rPr>
+      </w:pPr>
+      <w:r>
+        <w:rPr>
+          <w:u w:val="single"/>
+        </w:rPr>
+        <w:t>Interface design 1</w:t>
+      </w:r>
+    </w:p>
+    <w:p>
+      <w:pPr>
+        <w:rPr>
+          <w:u w:val="single"/>
+        </w:rPr>
+      </w:pPr>
+      <w:r>
+        <w:rPr>
+          <w:u w:val="single"/>
+        </w:rPr>
+        <w:t>Interface design 2</w:t>
+      </w:r>
     </w:p>
     <w:p>
       <w:pPr>
@@ -6109,7 +6208,13 @@
         <w:t xml:space="preserve">it is region I chose </w:t>
       </w:r>
       <w:r>
-        <w:t>to collect data from.</w:t>
+        <w:t>to collect data from</w:t>
+      </w:r>
+      <w:r>
+        <w:t xml:space="preserve"> due to its frequency of fires that regularly endanger </w:t>
+      </w:r>
+      <w:r>
+        <w:t>people as discussed in my literature review.</w:t>
       </w:r>
     </w:p>
     <w:p>
@@ -6306,7 +6411,6 @@
       </w:pPr>
       <w:bookmarkStart w:id="27" w:name="_Toc194327719"/>
       <w:r>
-        <w:lastRenderedPageBreak/>
         <w:t>Extracting data</w:t>
       </w:r>
       <w:bookmarkEnd w:id="27"/>
@@ -6403,13 +6507,13 @@
     </w:p>
     <w:p>
       <w:r>
-        <w:t xml:space="preserve">Additionally, a large number of bands are not that useful for making a prediction. There is </w:t>
-      </w:r>
-      <w:r>
-        <w:t>seventeen</w:t>
-      </w:r>
-      <w:r>
-        <w:t xml:space="preserve"> bands available in Landsat 9 so the data needed to be processed would be quite large. This means that taking a smaller portion of the bands that directly influence the chance of a fire will make training the model efficient and remove redundant data.</w:t>
+        <w:t>Additionally, a large number of bands are not that useful for making a prediction. There</w:t>
+      </w:r>
+      <w:r>
+        <w:t>’s seventeen layers and eleven bands in the data</w:t>
+      </w:r>
+      <w:r>
+        <w:t xml:space="preserve"> available in Landsat 9 so the data needed to be processed would be quite large. This means that taking a smaller portion of the bands that directly influence the chance of a fire will make training the model efficient and remove redundant data.</w:t>
       </w:r>
     </w:p>
     <w:p/>
@@ -6424,7 +6528,6 @@
       </w:pPr>
       <w:bookmarkStart w:id="29" w:name="_Toc194327721"/>
       <w:r>
-        <w:lastRenderedPageBreak/>
         <w:t xml:space="preserve">Model </w:t>
       </w:r>
       <w:r>
@@ -6615,6 +6718,7 @@
     </w:p>
     <w:p>
       <w:r>
+        <w:lastRenderedPageBreak/>
         <w:t xml:space="preserve">The output shape has to be </w:t>
       </w:r>
       <w:r>
@@ -6635,7 +6739,6 @@
     </w:p>
     <w:p>
       <w:r>
-        <w:lastRenderedPageBreak/>
         <w:t xml:space="preserve">My model has </w:t>
       </w:r>
       <w:r>
@@ -6731,6 +6834,19 @@
       </w:pPr>
       <w:r>
         <w:t>Model Testing</w:t>
+      </w:r>
+    </w:p>
+    <w:p>
+      <w:pPr>
+        <w:rPr>
+          <w:u w:val="single"/>
+        </w:rPr>
+      </w:pPr>
+      <w:r>
+        <w:rPr>
+          <w:u w:val="single"/>
+        </w:rPr>
+        <w:t>Training results</w:t>
       </w:r>
     </w:p>
     <w:p>
@@ -6828,7 +6944,24 @@
       </w:r>
       <w:bookmarkEnd w:id="35"/>
     </w:p>
-    <w:p/>
+    <w:p>
+      <w:r>
+        <w:t>Due to government agencies often being funded by the taxpayer this means that false predictions where actions have been put in place to prevent a falsely predicted fire will cost the taxpayer as the money will be wasted preventing a fire that was not going to happen. Not only will it cost the authorities money it will also take up the time of the local authorities which could have been spent on other events that have happened.</w:t>
+      </w:r>
+    </w:p>
+    <w:p>
+      <w:r>
+        <w:t xml:space="preserve">Additionally, some wildfires </w:t>
+      </w:r>
+      <w:r>
+        <w:t>are necessary to rejuvenate ecosystems and prevent larger fires from taking place. Some trees such as the Jack pine tree, although not present in California, require the presence of a fire as the temperature helps to release their seeds to plant more trees naturally. Preventing these types of fire could cause much more damage to the environment instead of letting them burn however, these fires should also be prevented but only if it endangers people or buildings. Preventing too many fires may also require local fire services to do controlled burns much more often than currently, this would simulate the smaller fires and prevent much larger dangerous fires.</w:t>
+      </w:r>
+    </w:p>
+    <w:p>
+      <w:r>
+        <w:t>The program does not need to take into account user data protection laws as at no point in operating the program does it handle user data. It only handles data extracted from the google earth engine or other ways of collecting landsat 9 data.</w:t>
+      </w:r>
+    </w:p>
     <w:p>
       <w:pPr>
         <w:pStyle w:val="Heading2"/>
@@ -6847,6 +6980,22 @@
       <w:r>
         <w:t>the google earth engine then the program cannot be used to profit from as the data used</w:t>
       </w:r>
+      <w:r>
+        <w:t xml:space="preserve"> was not originally created by me. I only extracted the data from the google earth engine.</w:t>
+      </w:r>
+    </w:p>
+    <w:p>
+      <w:pPr>
+        <w:jc w:val="both"/>
+      </w:pPr>
+      <w:r>
+        <w:t>Locking this program behind a paywall also means that some fires may not be prevented if users cannot access the program due to not paying for it which defeats the purpose of the program and may cost the environment and people much more than a fee to buy the program.</w:t>
+      </w:r>
+    </w:p>
+    <w:p>
+      <w:pPr>
+        <w:jc w:val="both"/>
+      </w:pPr>
     </w:p>
     <w:p>
       <w:pPr>
@@ -6891,6 +7040,9 @@
         <w:t>Issues with Landsat 9</w:t>
       </w:r>
       <w:bookmarkEnd w:id="38"/>
+      <w:r>
+        <w:t xml:space="preserve"> data</w:t>
+      </w:r>
     </w:p>
     <w:p>
       <w:r>
@@ -6903,13 +7055,40 @@
         <w:t xml:space="preserve"> days. Any thermal activity or disturbances will not be able to be collected and thus no prediction can be made. These blind spots mean that fires that start within that window of time may not have been able to be predicted whatsoever and have slipped through. </w:t>
       </w:r>
     </w:p>
-    <w:p/>
+    <w:p>
+      <w:r>
+        <w:t>Additionally, since the data does not include the day that it was taken it is difficult to calculate whether the data is in the day or night from solar angles available in the data. I could calculate this in the dataset I made however the data taken from the user may not include the date the data was taken by the sensor on. This can result in predictions not being as accurate depending on the time of day</w:t>
+      </w:r>
+      <w:r>
+        <w:t xml:space="preserve"> and season</w:t>
+      </w:r>
+      <w:r>
+        <w:t xml:space="preserve"> the data was taken on as it is hard to take that into account so for this </w:t>
+      </w:r>
+      <w:r>
+        <w:t>project,</w:t>
+      </w:r>
+      <w:r>
+        <w:t xml:space="preserve"> I have ignored time of day and used thermal readings and vegetation quality to form a prediction.</w:t>
+      </w:r>
+      <w:r>
+        <w:t xml:space="preserve"> </w:t>
+      </w:r>
+    </w:p>
     <w:p>
       <w:pPr>
         <w:pStyle w:val="Heading2"/>
       </w:pPr>
       <w:r>
         <w:t>Evaluation</w:t>
+      </w:r>
+    </w:p>
+    <w:p>
+      <w:r>
+        <w:t>Overall,</w:t>
+      </w:r>
+      <w:r>
+        <w:t xml:space="preserve"> this project has been</w:t>
       </w:r>
     </w:p>
     <w:p>
@@ -10185,10 +10364,12 @@
   </w:compat>
   <w:rsids>
     <w:rsidRoot w:val="004C6E87"/>
+    <w:rsid w:val="00077713"/>
     <w:rsid w:val="000B329E"/>
     <w:rsid w:val="000F3AC7"/>
     <w:rsid w:val="001D481F"/>
     <w:rsid w:val="00240D0F"/>
+    <w:rsid w:val="002B578D"/>
     <w:rsid w:val="004C6E87"/>
     <w:rsid w:val="005402E5"/>
     <w:rsid w:val="0059222A"/>
@@ -10202,6 +10383,7 @@
     <w:rsid w:val="00B534F8"/>
     <w:rsid w:val="00C704FB"/>
     <w:rsid w:val="00D2233E"/>
+    <w:rsid w:val="00F56188"/>
   </w:rsids>
   <m:mathPr>
     <m:mathFont m:val="Cambria Math"/>

</xml_diff>

<commit_message>
Added evaluation code back in and into report
Renamed categories + 1000 words in the report and evaluation code added back in
</commit_message>
<xml_diff>
--- a/HonoursStageFinal.docx
+++ b/HonoursStageFinal.docx
@@ -4376,50 +4376,206 @@
     </w:p>
     <w:p>
       <w:pPr>
+        <w:pStyle w:val="Heading3"/>
+      </w:pPr>
+      <w:r>
+        <w:t>Aim</w:t>
+      </w:r>
+      <w:r>
+        <w:t>s</w:t>
+      </w:r>
+    </w:p>
+    <w:p>
+      <w:pPr>
+        <w:pStyle w:val="ListParagraph"/>
+        <w:numPr>
+          <w:ilvl w:val="0"/>
+          <w:numId w:val="6"/>
+        </w:numPr>
+      </w:pPr>
+      <w:r>
+        <w:t>The program should assist local authorities in becoming prepared for wildfires by providing them with early warnings about possible fires.</w:t>
+      </w:r>
+    </w:p>
+    <w:p>
+      <w:pPr>
+        <w:pStyle w:val="ListParagraph"/>
+        <w:numPr>
+          <w:ilvl w:val="0"/>
+          <w:numId w:val="6"/>
+        </w:numPr>
+      </w:pPr>
+      <w:r>
+        <w:t>A created dataset should be shared with the scientific community to further improve research and development past this project.</w:t>
+      </w:r>
+    </w:p>
+    <w:p>
+      <w:pPr>
+        <w:pStyle w:val="ListParagraph"/>
+        <w:numPr>
+          <w:ilvl w:val="0"/>
+          <w:numId w:val="6"/>
+        </w:numPr>
+      </w:pPr>
+      <w:r>
+        <w:t>A dataset should include multiple different features that could be important to fire prediction.</w:t>
+      </w:r>
+    </w:p>
+    <w:p>
+      <w:pPr>
+        <w:pStyle w:val="ListParagraph"/>
+        <w:numPr>
+          <w:ilvl w:val="0"/>
+          <w:numId w:val="6"/>
+        </w:numPr>
+      </w:pPr>
+    </w:p>
+    <w:p/>
+    <w:p/>
+    <w:p/>
+    <w:p/>
+    <w:p/>
+    <w:p/>
+    <w:p/>
+    <w:p/>
+    <w:p>
+      <w:pPr>
+        <w:pStyle w:val="Heading3"/>
+      </w:pPr>
+      <w:r>
+        <w:lastRenderedPageBreak/>
+        <w:t>Objectives</w:t>
+      </w:r>
+    </w:p>
+    <w:p>
+      <w:pPr>
+        <w:pStyle w:val="NoSpacing"/>
+        <w:numPr>
+          <w:ilvl w:val="0"/>
+          <w:numId w:val="6"/>
+        </w:numPr>
+        <w:jc w:val="both"/>
+      </w:pPr>
+      <w:r>
+        <w:t>A machine learning</w:t>
+      </w:r>
+      <w:r>
+        <w:t xml:space="preserve"> model </w:t>
+      </w:r>
+      <w:r>
+        <w:t xml:space="preserve">should be created </w:t>
+      </w:r>
+      <w:r>
+        <w:t>to predict wildfires would decrease the chance and impact of fires as being able to</w:t>
+      </w:r>
+      <w:r>
+        <w:t xml:space="preserve"> </w:t>
+      </w:r>
+      <w:r>
+        <w:t>predict or forecast such an event from happening could reduce or even remove the effects of such a</w:t>
+      </w:r>
+      <w:r>
+        <w:t xml:space="preserve"> </w:t>
+      </w:r>
+      <w:r>
+        <w:t>disaster. This would enable authorities to put the proper</w:t>
+      </w:r>
+      <w:r>
+        <w:t xml:space="preserve"> </w:t>
+      </w:r>
+      <w:r>
+        <w:t>procedures in place before the fire</w:t>
+      </w:r>
+      <w:r>
+        <w:t xml:space="preserve"> </w:t>
+      </w:r>
+      <w:r>
+        <w:t>happens.</w:t>
+      </w:r>
+      <w:r>
+        <w:t xml:space="preserve"> </w:t>
+      </w:r>
+    </w:p>
+    <w:p/>
+    <w:p>
+      <w:pPr>
+        <w:pStyle w:val="NoSpacing"/>
+        <w:numPr>
+          <w:ilvl w:val="0"/>
+          <w:numId w:val="6"/>
+        </w:numPr>
+        <w:jc w:val="both"/>
+      </w:pPr>
+      <w:r>
+        <w:t xml:space="preserve">A </w:t>
+      </w:r>
+      <w:r>
+        <w:t>dataset must be created that includes areas in different states of a wildfire such as before, during and after the fire. This will allow a model to</w:t>
+      </w:r>
+      <w:r>
+        <w:t xml:space="preserve"> be trained and therefore</w:t>
+      </w:r>
+      <w:r>
+        <w:t xml:space="preserve"> predict the chances of a fire by allowing it to learn the differences between each sta</w:t>
+      </w:r>
+      <w:r>
+        <w:t>ge of a fire so</w:t>
+      </w:r>
+      <w:r>
+        <w:t xml:space="preserve"> the model would be able to predict the likelihood of a fire happening in that region. </w:t>
+      </w:r>
+    </w:p>
+    <w:p>
+      <w:pPr>
         <w:pStyle w:val="NoSpacing"/>
         <w:jc w:val="both"/>
       </w:pPr>
-      <w:r>
-        <w:t xml:space="preserve">The </w:t>
-      </w:r>
-      <w:r>
-        <w:t xml:space="preserve">main </w:t>
-      </w:r>
-      <w:r>
-        <w:t>aim of the project is to create a</w:t>
-      </w:r>
-      <w:r>
-        <w:t xml:space="preserve"> machine learning</w:t>
-      </w:r>
-      <w:r>
-        <w:t xml:space="preserve"> model to predict wildfires would decrease the chance and impact of fires as being able to</w:t>
-      </w:r>
-      <w:r>
-        <w:t xml:space="preserve"> </w:t>
-      </w:r>
-      <w:r>
-        <w:t>predict or forecast such an event from happening could reduce or even remove the effects of such a</w:t>
-      </w:r>
-      <w:r>
-        <w:t xml:space="preserve"> </w:t>
-      </w:r>
-      <w:r>
-        <w:t>disaster. This would enable authorities to put the proper</w:t>
-      </w:r>
-      <w:r>
-        <w:t xml:space="preserve"> </w:t>
-      </w:r>
-      <w:r>
-        <w:t>procedures in place before the fire</w:t>
-      </w:r>
-      <w:r>
-        <w:t xml:space="preserve"> </w:t>
-      </w:r>
-      <w:r>
-        <w:t>happens.</w:t>
-      </w:r>
-      <w:r>
-        <w:t xml:space="preserve"> </w:t>
+    </w:p>
+    <w:p>
+      <w:pPr>
+        <w:pStyle w:val="NoSpacing"/>
+        <w:numPr>
+          <w:ilvl w:val="0"/>
+          <w:numId w:val="6"/>
+        </w:numPr>
+        <w:jc w:val="both"/>
+      </w:pPr>
+      <w:r>
+        <w:t>The dataset</w:t>
+      </w:r>
+      <w:r>
+        <w:t xml:space="preserve"> must include</w:t>
+      </w:r>
+      <w:r>
+        <w:t xml:space="preserve"> high quality</w:t>
+      </w:r>
+      <w:r>
+        <w:t xml:space="preserve"> data that covers a wide range of factors that may contribute to a fire such as temperature </w:t>
+      </w:r>
+      <w:r>
+        <w:t xml:space="preserve">readings as well as </w:t>
+      </w:r>
+      <w:r>
+        <w:t xml:space="preserve">the </w:t>
+      </w:r>
+      <w:r>
+        <w:t>Normalized Difference Vegetation Index</w:t>
+      </w:r>
+      <w:r>
+        <w:t xml:space="preserve"> for example. This means that the data collected must be satellite data as the sensors on the satellite’s either pick up this data or the data needed can be calculated from the satellite data.</w:t>
+      </w:r>
+    </w:p>
+    <w:p>
+      <w:pPr>
+        <w:pStyle w:val="NoSpacing"/>
+        <w:numPr>
+          <w:ilvl w:val="0"/>
+          <w:numId w:val="6"/>
+        </w:numPr>
+        <w:jc w:val="both"/>
+      </w:pPr>
+      <w:r>
+        <w:t>The model should be fine-tuned to prevent misclassifications which may cause false alarms or fires to slip through undetected.</w:t>
       </w:r>
     </w:p>
     <w:p>
@@ -4433,9 +4589,6 @@
         <w:pStyle w:val="NoSpacing"/>
         <w:jc w:val="both"/>
       </w:pPr>
-      <w:r>
-        <w:t xml:space="preserve">To do this a dataset must be created that includes areas in different states of a wildfire such as before, during and after the fire. This will allow a model to predict the chances of a fire by allowing it to learn the differences between each state therefore, the model would be able to predict the likelihood of a fire happening in that region. </w:t>
-      </w:r>
     </w:p>
     <w:p>
       <w:pPr>
@@ -4448,18 +4601,12 @@
         <w:pStyle w:val="NoSpacing"/>
         <w:jc w:val="both"/>
       </w:pPr>
-      <w:r>
-        <w:t>The dataset</w:t>
-      </w:r>
-      <w:r>
-        <w:t xml:space="preserve"> must include data that covers a wide range of factors that may contribute to a fire such as the surface temperature, cloud cover and the </w:t>
-      </w:r>
-      <w:r>
-        <w:t>Normalized Difference Vegetation Index</w:t>
-      </w:r>
-      <w:r>
-        <w:t xml:space="preserve"> for example. This means that the data collected must be satellite data as the sensors on the satellite’s either pick up this data or the data needed can be calculated from the satellite data.</w:t>
-      </w:r>
+    </w:p>
+    <w:p>
+      <w:pPr>
+        <w:pStyle w:val="NoSpacing"/>
+        <w:jc w:val="both"/>
+      </w:pPr>
     </w:p>
     <w:p>
       <w:pPr>
@@ -4498,8 +4645,13 @@
         <w:jc w:val="both"/>
       </w:pPr>
       <w:r>
-        <w:lastRenderedPageBreak/>
-        <w:t xml:space="preserve">If the answer to the research question at the end of the project is yes then this program may be invaluable to local governments and ecosystems as it will hopefully allow </w:t>
+        <w:t xml:space="preserve">If the answer to the research question at the end of the project is </w:t>
+      </w:r>
+      <w:r>
+        <w:t>yes,</w:t>
+      </w:r>
+      <w:r>
+        <w:t xml:space="preserve"> then this program may be invaluable to local governments and ecosystems as it will hopefully allow </w:t>
       </w:r>
       <w:r>
         <w:t>local authorities to implement preventative measures that can reduce or eliminate the damages that wildfires cause.</w:t>
@@ -4896,13 +5048,29 @@
         <w:jc w:val="both"/>
       </w:pPr>
       <w:r>
-        <w:t>The MODIS sensors on board the Terra and Aqua satellites provide data in 36 spectral bands in wavelengths ranging from 0.4 to 14.4 μm, with ground resolution</w:t>
+        <w:t>The MODIS sensors on board the Terra and Aqua satellites provide data in 36 spectral bands in wavelengths ranging from 0.4 to 14.4 </w:t>
+      </w:r>
+      <w:proofErr w:type="spellStart"/>
+      <w:r>
+        <w:t>μm</w:t>
+      </w:r>
+      <w:proofErr w:type="spellEnd"/>
+      <w:r>
+        <w:t>, with ground resolution</w:t>
       </w:r>
       <w:r>
         <w:t xml:space="preserve"> being around </w:t>
       </w:r>
       <w:r>
-        <w:t xml:space="preserve">1000 m.  Reflective Solar Bands which include Bands 1–19 and 26 and can detect Wavelengths between 0.4 to 2.1 μm. These bands are used for Monitoring vegetation, observing snow and ice and Detecting aerosols and clouds. Additionally, MODIS also has Thermal Emissive Bands </w:t>
+        <w:t xml:space="preserve">1000 m.  Reflective Solar Bands which include Bands 1–19 and 26 and can detect Wavelengths between 0.4 to 2.1 </w:t>
+      </w:r>
+      <w:proofErr w:type="spellStart"/>
+      <w:r>
+        <w:t>μm</w:t>
+      </w:r>
+      <w:proofErr w:type="spellEnd"/>
+      <w:r>
+        <w:t xml:space="preserve">. These bands are used for Monitoring vegetation, observing snow and ice and Detecting aerosols and clouds. Additionally, MODIS also has Thermal Emissive Bands </w:t>
       </w:r>
       <w:r>
         <w:t>which include</w:t>
@@ -4951,7 +5119,23 @@
               <w:rFonts w:ascii="Calibri" w:eastAsia="Times New Roman" w:hAnsi="Calibri" w:cs="Calibri"/>
               <w:color w:val="000000"/>
             </w:rPr>
-            <w:t>(D. Rashkovetsky et al., 2021)</w:t>
+            <w:t xml:space="preserve">(D. </w:t>
+          </w:r>
+          <w:proofErr w:type="spellStart"/>
+          <w:r>
+            <w:rPr>
+              <w:rFonts w:ascii="Calibri" w:eastAsia="Times New Roman" w:hAnsi="Calibri" w:cs="Calibri"/>
+              <w:color w:val="000000"/>
+            </w:rPr>
+            <w:t>Rashkovetsky</w:t>
+          </w:r>
+          <w:proofErr w:type="spellEnd"/>
+          <w:r>
+            <w:rPr>
+              <w:rFonts w:ascii="Calibri" w:eastAsia="Times New Roman" w:hAnsi="Calibri" w:cs="Calibri"/>
+              <w:color w:val="000000"/>
+            </w:rPr>
+            <w:t xml:space="preserve"> et al., 2021)</w:t>
           </w:r>
         </w:sdtContent>
       </w:sdt>
@@ -5665,10 +5849,50 @@
     </w:p>
     <w:p>
       <w:r>
-        <w:t>The program will use many different libraries such as tensorflow</w:t>
-      </w:r>
-      <w:r>
-        <w:t xml:space="preserve"> and sklearn, additionally the interface will also be programmed in python for ease of programming as I can import the functions in one python file into another to be accessed seamlessly by an interface.</w:t>
+        <w:t xml:space="preserve">The program will use many different libraries such as </w:t>
+      </w:r>
+      <w:proofErr w:type="spellStart"/>
+      <w:r>
+        <w:t>tensorflow</w:t>
+      </w:r>
+      <w:proofErr w:type="spellEnd"/>
+      <w:r>
+        <w:t xml:space="preserve"> and </w:t>
+      </w:r>
+      <w:proofErr w:type="spellStart"/>
+      <w:r>
+        <w:t>sklearn</w:t>
+      </w:r>
+      <w:proofErr w:type="spellEnd"/>
+      <w:r>
+        <w:t xml:space="preserve">, additionally the interface will also be programmed in python for ease of programming </w:t>
+      </w:r>
+      <w:r>
+        <w:t>as the</w:t>
+      </w:r>
+      <w:r>
+        <w:t xml:space="preserve">re </w:t>
+      </w:r>
+      <w:r>
+        <w:t>can be important</w:t>
+      </w:r>
+      <w:r>
+        <w:t xml:space="preserve"> </w:t>
+      </w:r>
+      <w:r>
+        <w:t xml:space="preserve">functions in one python </w:t>
+      </w:r>
+      <w:r>
+        <w:t xml:space="preserve">which can </w:t>
+      </w:r>
+      <w:r>
+        <w:t>be</w:t>
+      </w:r>
+      <w:r>
+        <w:t xml:space="preserve"> imported so it can be</w:t>
+      </w:r>
+      <w:r>
+        <w:t xml:space="preserve"> accessed seamlessly by an interface.</w:t>
       </w:r>
     </w:p>
     <w:p>
@@ -5702,7 +5926,24 @@
         </w:numPr>
       </w:pPr>
       <w:r>
-        <w:t>The dataset must include historical fire data</w:t>
+        <w:t xml:space="preserve">The dataset </w:t>
+      </w:r>
+      <w:bookmarkStart w:id="17" w:name="_Hlk194505261"/>
+      <w:r>
+        <w:t>must</w:t>
+      </w:r>
+      <w:bookmarkEnd w:id="17"/>
+      <w:r>
+        <w:t xml:space="preserve"> </w:t>
+      </w:r>
+      <w:r>
+        <w:t xml:space="preserve">include </w:t>
+      </w:r>
+      <w:r>
+        <w:t xml:space="preserve">recent </w:t>
+      </w:r>
+      <w:r>
+        <w:t>historical fire data</w:t>
       </w:r>
       <w:r>
         <w:t>.</w:t>
@@ -5717,7 +5958,13 @@
         </w:numPr>
       </w:pPr>
       <w:r>
-        <w:t>The dataset must include data that includes factors that can contribute to a fire such as thermal readings and vegetation health.</w:t>
+        <w:t xml:space="preserve">The dataset </w:t>
+      </w:r>
+      <w:r>
+        <w:t>must</w:t>
+      </w:r>
+      <w:r>
+        <w:t xml:space="preserve"> include data that includes factors that can contribute to a fire such as thermal readings and vegetation health.</w:t>
       </w:r>
     </w:p>
     <w:p>
@@ -5729,7 +5976,22 @@
         </w:numPr>
       </w:pPr>
       <w:r>
-        <w:t xml:space="preserve">The dataset must only include data from the selected region of interest. </w:t>
+        <w:t xml:space="preserve">The dataset </w:t>
+      </w:r>
+      <w:r>
+        <w:t>must</w:t>
+      </w:r>
+      <w:r>
+        <w:t xml:space="preserve"> </w:t>
+      </w:r>
+      <w:r>
+        <w:t>only include data from the selected region of interest</w:t>
+      </w:r>
+      <w:r>
+        <w:t xml:space="preserve"> ensuring data outside of the range of coordinates is not considered</w:t>
+      </w:r>
+      <w:r>
+        <w:t xml:space="preserve">. </w:t>
       </w:r>
     </w:p>
     <w:p>
@@ -5741,7 +6003,16 @@
         </w:numPr>
       </w:pPr>
       <w:r>
-        <w:t>The dataset must not be imbalanced to ensure correct training.</w:t>
+        <w:t xml:space="preserve">The dataset </w:t>
+      </w:r>
+      <w:r>
+        <w:t>must</w:t>
+      </w:r>
+      <w:r>
+        <w:t xml:space="preserve"> have an equal ratio of data to prevent imbalances</w:t>
+      </w:r>
+      <w:r>
+        <w:t>.</w:t>
       </w:r>
     </w:p>
     <w:p>
@@ -5753,7 +6024,16 @@
         </w:numPr>
       </w:pPr>
       <w:r>
-        <w:t>No data will be stored by the program once it has been shut down and closed.</w:t>
+        <w:t xml:space="preserve">No data </w:t>
+      </w:r>
+      <w:r>
+        <w:t>must</w:t>
+      </w:r>
+      <w:r>
+        <w:t xml:space="preserve"> </w:t>
+      </w:r>
+      <w:r>
+        <w:t>be stored by the program once it has been shut down and closed.</w:t>
       </w:r>
     </w:p>
     <w:p>
@@ -5766,14 +6046,14 @@
         <w:pStyle w:val="Heading2"/>
         <w:jc w:val="both"/>
       </w:pPr>
-      <w:bookmarkStart w:id="17" w:name="_Toc194327709"/>
+      <w:bookmarkStart w:id="18" w:name="_Toc194327709"/>
       <w:r>
         <w:t>Input</w:t>
       </w:r>
       <w:r>
         <w:t xml:space="preserve"> requirements</w:t>
       </w:r>
-      <w:bookmarkEnd w:id="17"/>
+      <w:bookmarkEnd w:id="18"/>
     </w:p>
     <w:p>
       <w:pPr>
@@ -5784,7 +6064,21 @@
         </w:numPr>
       </w:pPr>
       <w:r>
-        <w:t>The program should be able to handle .tif files and extract necessary data to make a prediction</w:t>
+        <w:t xml:space="preserve">The program </w:t>
+      </w:r>
+      <w:r>
+        <w:t>must</w:t>
+      </w:r>
+      <w:r>
+        <w:t xml:space="preserve"> be able to handle .</w:t>
+      </w:r>
+      <w:proofErr w:type="spellStart"/>
+      <w:r>
+        <w:t>tif</w:t>
+      </w:r>
+      <w:proofErr w:type="spellEnd"/>
+      <w:r>
+        <w:t xml:space="preserve"> files and extract necessary data to make a prediction</w:t>
       </w:r>
       <w:r>
         <w:t>.</w:t>
@@ -5799,7 +6093,13 @@
         </w:numPr>
       </w:pPr>
       <w:r>
-        <w:t>The program must be able to handle incorrect inputs/data.</w:t>
+        <w:t xml:space="preserve">The program </w:t>
+      </w:r>
+      <w:r>
+        <w:t>must</w:t>
+      </w:r>
+      <w:r>
+        <w:t xml:space="preserve"> be able to handle incorrect inputs/data.</w:t>
       </w:r>
     </w:p>
     <w:p>
@@ -5819,7 +6119,16 @@
         </w:numPr>
       </w:pPr>
       <w:r>
-        <w:t>The model must be able to must be able to train efficiently so the model can train on machines without a dedicated graphics card.</w:t>
+        <w:t xml:space="preserve">The model </w:t>
+      </w:r>
+      <w:r>
+        <w:t>must</w:t>
+      </w:r>
+      <w:r>
+        <w:t xml:space="preserve"> </w:t>
+      </w:r>
+      <w:r>
+        <w:t>be able to must be able to train efficiently so the model can train on machines without a dedicated graphics card.</w:t>
       </w:r>
     </w:p>
     <w:p>
@@ -5831,7 +6140,25 @@
         </w:numPr>
       </w:pPr>
       <w:r>
-        <w:t xml:space="preserve">The model must be able to use several different bands to form a prediction to mitigate false positives </w:t>
+        <w:t>The model</w:t>
+      </w:r>
+      <w:r>
+        <w:t xml:space="preserve"> </w:t>
+      </w:r>
+      <w:r>
+        <w:t xml:space="preserve">must </w:t>
+      </w:r>
+      <w:r>
+        <w:t xml:space="preserve">be able to use several different </w:t>
+      </w:r>
+      <w:r>
+        <w:t xml:space="preserve">factors </w:t>
+      </w:r>
+      <w:r>
+        <w:t>to form a prediction to mitigate false positives</w:t>
+      </w:r>
+      <w:r>
+        <w:t>.</w:t>
       </w:r>
     </w:p>
     <w:p>
@@ -5843,27 +6170,28 @@
         </w:numPr>
       </w:pPr>
       <w:r>
-        <w:t>The model must be able to predict to an accuracy of above 80% on data taken from the region of interest</w:t>
-      </w:r>
-    </w:p>
-    <w:p>
-      <w:pPr>
-        <w:pStyle w:val="ListParagraph"/>
-      </w:pPr>
+        <w:t xml:space="preserve">The model </w:t>
+      </w:r>
+      <w:r>
+        <w:t>must</w:t>
+      </w:r>
+      <w:r>
+        <w:t xml:space="preserve"> be able to predict to an accuracy of above 80% on data taken from the region of interest</w:t>
+      </w:r>
     </w:p>
     <w:p>
       <w:pPr>
         <w:pStyle w:val="Heading2"/>
         <w:jc w:val="both"/>
       </w:pPr>
-      <w:bookmarkStart w:id="18" w:name="_Toc194327710"/>
+      <w:bookmarkStart w:id="19" w:name="_Toc194327710"/>
       <w:r>
         <w:t>Interface</w:t>
       </w:r>
       <w:r>
         <w:t xml:space="preserve"> requirements</w:t>
       </w:r>
-      <w:bookmarkEnd w:id="18"/>
+      <w:bookmarkEnd w:id="19"/>
     </w:p>
     <w:p>
       <w:pPr>
@@ -5874,7 +6202,19 @@
         </w:numPr>
       </w:pPr>
       <w:r>
-        <w:t>The interface must be able to show the user how to extract data that is suitable for use</w:t>
+        <w:t>The interface</w:t>
+      </w:r>
+      <w:r>
+        <w:t xml:space="preserve"> </w:t>
+      </w:r>
+      <w:r>
+        <w:t>must</w:t>
+      </w:r>
+      <w:r>
+        <w:t xml:space="preserve"> </w:t>
+      </w:r>
+      <w:r>
+        <w:t>be able to show the user how to extract data that is suitable for use</w:t>
       </w:r>
     </w:p>
     <w:p>
@@ -5886,7 +6226,16 @@
         </w:numPr>
       </w:pPr>
       <w:r>
-        <w:t xml:space="preserve">The interface must be </w:t>
+        <w:t>The interface</w:t>
+      </w:r>
+      <w:r>
+        <w:t xml:space="preserve"> </w:t>
+      </w:r>
+      <w:r>
+        <w:t xml:space="preserve">must </w:t>
+      </w:r>
+      <w:r>
+        <w:t xml:space="preserve">be </w:t>
       </w:r>
       <w:r>
         <w:t xml:space="preserve">easy to navigate and understand for new users </w:t>
@@ -5904,10 +6253,19 @@
         <w:t>The interface</w:t>
       </w:r>
       <w:r>
-        <w:t xml:space="preserve"> does</w:t>
-      </w:r>
-      <w:r>
-        <w:t xml:space="preserve"> not require a login page as the program does not need to save user information.</w:t>
+        <w:t xml:space="preserve"> </w:t>
+      </w:r>
+      <w:r>
+        <w:t>must</w:t>
+      </w:r>
+      <w:r>
+        <w:t xml:space="preserve"> not </w:t>
+      </w:r>
+      <w:r>
+        <w:t xml:space="preserve">have </w:t>
+      </w:r>
+      <w:r>
+        <w:t>a login page as the program does not need to save user information.</w:t>
       </w:r>
     </w:p>
     <w:p>
@@ -5919,7 +6277,13 @@
         </w:numPr>
       </w:pPr>
       <w:r>
-        <w:t>The interface must display the image in a viewable format along with the prediction</w:t>
+        <w:t xml:space="preserve">The interface </w:t>
+      </w:r>
+      <w:r>
+        <w:t>must</w:t>
+      </w:r>
+      <w:r>
+        <w:t xml:space="preserve"> display the image in a viewable format along with the prediction</w:t>
       </w:r>
     </w:p>
     <w:p>
@@ -5931,7 +6295,19 @@
         </w:numPr>
       </w:pPr>
       <w:r>
-        <w:t>The interface must suggest ways to follow up on a prediction such as directing them to the necessary authorities or suggesting methods to prevent a fire</w:t>
+        <w:t>The interface</w:t>
+      </w:r>
+      <w:r>
+        <w:t xml:space="preserve"> </w:t>
+      </w:r>
+      <w:r>
+        <w:t xml:space="preserve">must </w:t>
+      </w:r>
+      <w:r>
+        <w:t>suggest ways to follow up on a prediction such as directing them to the necessary authorities or suggesting methods to prevent a fire</w:t>
+      </w:r>
+      <w:r>
+        <w:t>.</w:t>
       </w:r>
     </w:p>
     <w:p>
@@ -5943,7 +6319,19 @@
         </w:numPr>
       </w:pPr>
       <w:r>
-        <w:t>The interface must be able to explain to the user the errors that have occured</w:t>
+        <w:t xml:space="preserve">The interface </w:t>
+      </w:r>
+      <w:r>
+        <w:t>must</w:t>
+      </w:r>
+      <w:r>
+        <w:t xml:space="preserve"> be able to explain to the user the errors that have </w:t>
+      </w:r>
+      <w:r>
+        <w:t>occurred</w:t>
+      </w:r>
+      <w:r>
+        <w:t>.</w:t>
       </w:r>
     </w:p>
     <w:p/>
@@ -5952,12 +6340,12 @@
         <w:pStyle w:val="Heading2"/>
         <w:jc w:val="both"/>
       </w:pPr>
-      <w:bookmarkStart w:id="19" w:name="_Toc194327711"/>
+      <w:bookmarkStart w:id="20" w:name="_Toc194327711"/>
       <w:r>
         <w:lastRenderedPageBreak/>
         <w:t>Design constraints</w:t>
       </w:r>
-      <w:bookmarkEnd w:id="19"/>
+      <w:bookmarkEnd w:id="20"/>
     </w:p>
     <w:p>
       <w:r>
@@ -6004,26 +6392,26 @@
         <w:pStyle w:val="Heading1"/>
         <w:jc w:val="both"/>
       </w:pPr>
-      <w:bookmarkStart w:id="20" w:name="_Toc194327712"/>
+      <w:bookmarkStart w:id="21" w:name="_Toc194327712"/>
       <w:r>
         <w:lastRenderedPageBreak/>
         <w:t>Design</w:t>
       </w:r>
-      <w:bookmarkEnd w:id="20"/>
+      <w:bookmarkEnd w:id="21"/>
     </w:p>
     <w:p>
       <w:pPr>
         <w:pStyle w:val="Heading2"/>
         <w:jc w:val="both"/>
       </w:pPr>
-      <w:bookmarkStart w:id="21" w:name="_Toc194327713"/>
+      <w:bookmarkStart w:id="22" w:name="_Toc194327713"/>
       <w:r>
         <w:t>Dataset</w:t>
       </w:r>
       <w:r>
         <w:t xml:space="preserve"> design</w:t>
       </w:r>
-      <w:bookmarkEnd w:id="21"/>
+      <w:bookmarkEnd w:id="22"/>
     </w:p>
     <w:p>
       <w:r>
@@ -6061,7 +6449,13 @@
     </w:p>
     <w:p>
       <w:r>
-        <w:t>Splitting the data into 4 distinct categories will allow the model to sort each tile inputted into it into a category.  This means that the patterns present in the training data can be learnt from and tiles can be predicted to be in a category based upon the patterns found in the data, patterns present before fires will help in fire prediction as if the conditions of an area before a fire occur in another area then it is likely that area will experience a fire.</w:t>
+        <w:t xml:space="preserve">Splitting the data into 4 distinct categories will allow the model to sort each tile inputted into it into a category.  This means that the patterns present in the training data can be learnt from and tiles can be predicted to be in a category based upon the patterns found in the data, patterns present before fires will help in fire prediction as if the conditions of an area before a fire occur in another </w:t>
+      </w:r>
+      <w:r>
+        <w:t>area,</w:t>
+      </w:r>
+      <w:r>
+        <w:t xml:space="preserve"> then it is likely that area will experience a fire.</w:t>
       </w:r>
       <w:r>
         <w:t xml:space="preserve"> </w:t>
@@ -6074,19 +6468,7 @@
     </w:p>
     <w:p>
       <w:r>
-        <w:t>Since the dataset will be in a category-based approach, this means that data for each category will need to be captured. Unfortunately,</w:t>
-      </w:r>
-      <w:r>
-        <w:t xml:space="preserve"> due to the nature of the satellite data from the immediate vicinity to the during data cannot be collected as the satellite has a </w:t>
-      </w:r>
-      <w:r>
-        <w:t>sixteen-day</w:t>
-      </w:r>
-      <w:r>
-        <w:t xml:space="preserve"> revisit interval. This means that </w:t>
-      </w:r>
-      <w:r>
-        <w:t xml:space="preserve">the data will include sixteen days before, sixteen days after, during and a time with no recent fire to gather all stages of a fire possible from the </w:t>
+        <w:t xml:space="preserve">Since the dataset will be in a category-based approach, this means that data for each category will need to be captured. Unfortunately, due to the nature of the satellite data from the immediate vicinity to the during data cannot be collected as the satellite has a sixteen-day revisit interval. This means that the data will include sixteen days before, sixteen days after, during and a time with no recent fire to gather all stages of a fire possible from the </w:t>
       </w:r>
       <w:r>
         <w:t>engine</w:t>
@@ -6104,14 +6486,14 @@
         <w:pStyle w:val="Heading2"/>
         <w:jc w:val="both"/>
       </w:pPr>
-      <w:bookmarkStart w:id="22" w:name="_Toc194327714"/>
+      <w:bookmarkStart w:id="23" w:name="_Toc194327714"/>
       <w:r>
         <w:t>Interface</w:t>
       </w:r>
       <w:r>
         <w:t xml:space="preserve"> design</w:t>
       </w:r>
-      <w:bookmarkEnd w:id="22"/>
+      <w:bookmarkEnd w:id="23"/>
     </w:p>
     <w:p>
       <w:r>
@@ -6126,7 +6508,15 @@
         <w:t xml:space="preserve">navigate to a results page </w:t>
       </w:r>
       <w:r>
-        <w:t>then present the user with the rgb image of the data as well as the prediction made by the model. The user will be given suggested actions based on the outcome of the prediction as well as an option to return to the prediction screen to input another piece of data.</w:t>
+        <w:t xml:space="preserve">then present the user with the </w:t>
+      </w:r>
+      <w:proofErr w:type="spellStart"/>
+      <w:r>
+        <w:t>rgb</w:t>
+      </w:r>
+      <w:proofErr w:type="spellEnd"/>
+      <w:r>
+        <w:t xml:space="preserve"> image of the data as well as the prediction made by the model. The user will be given suggested actions based on the outcome of the prediction as well as an option to return to the prediction screen to input another piece of data.</w:t>
       </w:r>
       <w:r>
         <w:t xml:space="preserve"> The prediction page will also give an option to </w:t>
@@ -6167,12 +6557,12 @@
         <w:pStyle w:val="Heading1"/>
         <w:jc w:val="both"/>
       </w:pPr>
-      <w:bookmarkStart w:id="23" w:name="_Toc194327715"/>
+      <w:bookmarkStart w:id="24" w:name="_Toc194327715"/>
       <w:r>
         <w:lastRenderedPageBreak/>
         <w:t>Implementation</w:t>
       </w:r>
-      <w:bookmarkEnd w:id="23"/>
+      <w:bookmarkEnd w:id="24"/>
       <w:r>
         <w:t xml:space="preserve"> </w:t>
       </w:r>
@@ -6181,31 +6571,55 @@
       <w:pPr>
         <w:pStyle w:val="Heading2"/>
       </w:pPr>
-      <w:bookmarkStart w:id="24" w:name="_Toc194327716"/>
+      <w:bookmarkStart w:id="25" w:name="_Toc194327716"/>
       <w:r>
         <w:t>Dataset Creation</w:t>
       </w:r>
-      <w:bookmarkEnd w:id="24"/>
+      <w:bookmarkEnd w:id="25"/>
     </w:p>
     <w:p>
       <w:pPr>
         <w:pStyle w:val="Heading3"/>
       </w:pPr>
-      <w:bookmarkStart w:id="25" w:name="_Toc194327717"/>
+      <w:bookmarkStart w:id="26" w:name="_Toc194327717"/>
       <w:r>
         <w:t>Selecting a region</w:t>
       </w:r>
-      <w:bookmarkEnd w:id="25"/>
+      <w:bookmarkEnd w:id="26"/>
     </w:p>
     <w:p>
       <w:r>
         <w:t xml:space="preserve">To begin creating the dataset it must first be captured and exported from the google earth engine. </w:t>
       </w:r>
       <w:r>
-        <w:t xml:space="preserve">To do this, I first selected California as </w:t>
-      </w:r>
-      <w:r>
-        <w:t xml:space="preserve">it is region I chose </w:t>
+        <w:t xml:space="preserve">To do this, </w:t>
+      </w:r>
+      <w:r>
+        <w:t xml:space="preserve"> </w:t>
+      </w:r>
+      <w:r>
+        <w:t>California</w:t>
+      </w:r>
+      <w:r>
+        <w:t xml:space="preserve"> was</w:t>
+      </w:r>
+      <w:r>
+        <w:t xml:space="preserve"> first selected as </w:t>
+      </w:r>
+      <w:r>
+        <w:t xml:space="preserve">it is </w:t>
+      </w:r>
+      <w:r>
+        <w:t xml:space="preserve">the </w:t>
+      </w:r>
+      <w:r>
+        <w:t>region chose</w:t>
+      </w:r>
+      <w:r>
+        <w:t>n</w:t>
+      </w:r>
+      <w:r>
+        <w:t xml:space="preserve"> </w:t>
       </w:r>
       <w:r>
         <w:t>to collect data from</w:t>
@@ -6214,7 +6628,13 @@
         <w:t xml:space="preserve"> due to its frequency of fires that regularly endanger </w:t>
       </w:r>
       <w:r>
-        <w:t>people as discussed in my literature review.</w:t>
+        <w:t xml:space="preserve">people as discussed in </w:t>
+      </w:r>
+      <w:r>
+        <w:t xml:space="preserve">the </w:t>
+      </w:r>
+      <w:r>
+        <w:t>literature review.</w:t>
       </w:r>
     </w:p>
     <w:p>
@@ -6353,15 +6773,16 @@
         <w:t>.</w:t>
       </w:r>
     </w:p>
+    <w:p/>
     <w:p>
       <w:pPr>
         <w:pStyle w:val="Heading3"/>
       </w:pPr>
-      <w:bookmarkStart w:id="26" w:name="_Toc194327718"/>
+      <w:bookmarkStart w:id="27" w:name="_Toc194327718"/>
       <w:r>
         <w:t>Finding a fire</w:t>
       </w:r>
-      <w:bookmarkEnd w:id="26"/>
+      <w:bookmarkEnd w:id="27"/>
     </w:p>
     <w:p>
       <w:r>
@@ -6371,13 +6792,40 @@
         <w:t>sixteen</w:t>
       </w:r>
       <w:r>
-        <w:t xml:space="preserve"> days. This means that the number of fires that can be found is dramatically reduced as the fire must be active in the area on the day of the satellite orbiting above it. To achieve this, I set out to find fires that were quite large due to the spatial resolution being </w:t>
+        <w:t xml:space="preserve"> days. This means that the number of fires that can be found is dramatically reduced as the fire must be active in the area on the day of the satellite orbiting above it. To achieve this,  fires that were quite large</w:t>
+      </w:r>
+      <w:r>
+        <w:t xml:space="preserve"> needed to be found</w:t>
+      </w:r>
+      <w:r>
+        <w:t xml:space="preserve"> due to the spatial resolution being </w:t>
       </w:r>
       <w:r>
         <w:t>thirty</w:t>
       </w:r>
       <w:r>
-        <w:t xml:space="preserve"> metres, this means that small fires may only appear as very few pixels. Once I had a list of notable fires I checked if data was available on a day the fire was active, if there was data, I then applied a heatmap of pixel values to the area to confirm that a fire was present.</w:t>
+        <w:t xml:space="preserve"> metres, this means that small fires may only appear as very few pixels. Once a list of notable fires</w:t>
+      </w:r>
+      <w:r>
+        <w:t xml:space="preserve"> was created the data was </w:t>
+      </w:r>
+      <w:r>
+        <w:t xml:space="preserve">checked if </w:t>
+      </w:r>
+      <w:r>
+        <w:t xml:space="preserve">it </w:t>
+      </w:r>
+      <w:r>
+        <w:t>was available on a day the fire was active, if there was data, then</w:t>
+      </w:r>
+      <w:r>
+        <w:t xml:space="preserve"> </w:t>
+      </w:r>
+      <w:r>
+        <w:t>a heatmap of pixel values was</w:t>
+      </w:r>
+      <w:r>
+        <w:t xml:space="preserve"> applied to the area to confirm that a fire was present.</w:t>
       </w:r>
     </w:p>
     <w:p>
@@ -6409,11 +6857,11 @@
       <w:pPr>
         <w:pStyle w:val="Heading3"/>
       </w:pPr>
-      <w:bookmarkStart w:id="27" w:name="_Toc194327719"/>
+      <w:bookmarkStart w:id="28" w:name="_Toc194327719"/>
       <w:r>
         <w:t>Extracting data</w:t>
       </w:r>
-      <w:bookmarkEnd w:id="27"/>
+      <w:bookmarkEnd w:id="28"/>
     </w:p>
     <w:p>
       <w:r>
@@ -6428,7 +6876,31 @@
     </w:p>
     <w:p>
       <w:r>
-        <w:t xml:space="preserve">To extract the data the area of interest must first be selected. I found the graphical coordinates of the centre of the pacific palisades and drew a rectangle over the area ensuring that as little sea as possible is present in the data due to the area’s proximity to the coast. Removing as much ocean as possible is useful as the data will be redundant to the task of fire prediction as the water cannot physically catch fire unless oil is spilled over the area and that is very unlikely to occur on the coastline. I then tiled the rectangle into smaller, equal size regions to reduce the size of the files and </w:t>
+        <w:t>To extract the data the area of interest must first be selected.</w:t>
+      </w:r>
+      <w:r>
+        <w:t xml:space="preserve"> The graphical coordinates</w:t>
+      </w:r>
+      <w:r>
+        <w:t xml:space="preserve"> </w:t>
+      </w:r>
+      <w:r>
+        <w:t xml:space="preserve">were </w:t>
+      </w:r>
+      <w:r>
+        <w:t>found of the centre of the pacific palisades and a rectangle</w:t>
+      </w:r>
+      <w:r>
+        <w:t xml:space="preserve"> was drawn</w:t>
+      </w:r>
+      <w:r>
+        <w:t xml:space="preserve"> over the area ensuring that as little sea as possible is present in the data due to the area’s proximity to the coast. Removing as much ocean as possible is useful as the data will be redundant to the task of fire prediction as the water cannot physically catch fire unless oil is spilled over the area and that is very unlikely to occur on the coastline. </w:t>
+      </w:r>
+      <w:r>
+        <w:t xml:space="preserve">The area was then </w:t>
+      </w:r>
+      <w:r>
+        <w:t xml:space="preserve">tiled into smaller, equal size regions to reduce the size of the files and </w:t>
       </w:r>
       <w:r>
         <w:t xml:space="preserve">allow the model to detect finer details allowing for smaller anomalies to be detected. This is useful as the Landsat 9 satellite has a </w:t>
@@ -6454,12 +6926,89 @@
         <w:t>having fire like conditions therefore removing some misclassifications.</w:t>
       </w:r>
     </w:p>
-    <w:p/>
+    <w:p>
+      <w:r>
+        <w:t>Additionally,  the data does not include the day that it was taken only the solar angles when the images were captured. This means that time of day cannot be considered as for the time of day to be calculated using solar angles the data would also need to include world coordinates which is not present in the data. This means that the model may struggle with thermal anomalies at night as they may be seen as regular thermal readings in the daytime.</w:t>
+      </w:r>
+    </w:p>
+    <w:p>
+      <w:r>
+        <w:t>The dataset meets the project’s requirements as it has an equal amount of data in each category</w:t>
+      </w:r>
+      <w:r>
+        <w:t>, this being 72 tiles,</w:t>
+      </w:r>
+      <w:r>
+        <w:t xml:space="preserve"> ensuring that there is no imbalance in the data and </w:t>
+      </w:r>
+      <w:r>
+        <w:t xml:space="preserve">thus it </w:t>
+      </w:r>
+      <w:r>
+        <w:t xml:space="preserve">should not adversely affect training. Additionally, the dataset includes recent historical data that includes a wide range of factors such as thermal readings </w:t>
+      </w:r>
+      <w:r>
+        <w:t xml:space="preserve">and other factors such as the Landsat </w:t>
+      </w:r>
+      <w:r>
+        <w:t>Normalized Difference Vegetation Index</w:t>
+      </w:r>
+      <w:r>
+        <w:t xml:space="preserve"> can be calculated from the extracted data.</w:t>
+      </w:r>
+      <w:r>
+        <w:rPr>
+          <w:b/>
+          <w:bCs/>
+        </w:rPr>
+        <w:t> </w:t>
+      </w:r>
+    </w:p>
+    <w:p>
+      <w:r>
+        <w:lastRenderedPageBreak/>
+        <w:drawing>
+          <wp:inline distT="0" distB="0" distL="0" distR="0" wp14:anchorId="558C310D" wp14:editId="79D7E77B">
+            <wp:extent cx="5731510" cy="2597785"/>
+            <wp:effectExtent l="0" t="0" r="2540" b="0"/>
+            <wp:docPr id="1675126283" name="Picture 1" descr="A screenshot of a computer&#10;&#10;AI-generated content may be incorrect."/>
+            <wp:cNvGraphicFramePr>
+              <a:graphicFrameLocks xmlns:a="http://schemas.openxmlformats.org/drawingml/2006/main" noChangeAspect="1"/>
+            </wp:cNvGraphicFramePr>
+            <a:graphic xmlns:a="http://schemas.openxmlformats.org/drawingml/2006/main">
+              <a:graphicData uri="http://schemas.openxmlformats.org/drawingml/2006/picture">
+                <pic:pic xmlns:pic="http://schemas.openxmlformats.org/drawingml/2006/picture">
+                  <pic:nvPicPr>
+                    <pic:cNvPr id="1675126283" name="Picture 1" descr="A screenshot of a computer&#10;&#10;AI-generated content may be incorrect."/>
+                    <pic:cNvPicPr/>
+                  </pic:nvPicPr>
+                  <pic:blipFill>
+                    <a:blip r:embed="rId13"/>
+                    <a:stretch>
+                      <a:fillRect/>
+                    </a:stretch>
+                  </pic:blipFill>
+                  <pic:spPr>
+                    <a:xfrm>
+                      <a:off x="0" y="0"/>
+                      <a:ext cx="5731510" cy="2597785"/>
+                    </a:xfrm>
+                    <a:prstGeom prst="rect">
+                      <a:avLst/>
+                    </a:prstGeom>
+                  </pic:spPr>
+                </pic:pic>
+              </a:graphicData>
+            </a:graphic>
+          </wp:inline>
+        </w:drawing>
+      </w:r>
+    </w:p>
     <w:p>
       <w:pPr>
         <w:pStyle w:val="Heading3"/>
       </w:pPr>
-      <w:bookmarkStart w:id="28" w:name="_Toc194327720"/>
+      <w:bookmarkStart w:id="29" w:name="_Toc194327720"/>
       <w:r>
         <w:t>D</w:t>
       </w:r>
@@ -6469,14 +7018,20 @@
       <w:r>
         <w:t>preprocessing</w:t>
       </w:r>
-      <w:bookmarkEnd w:id="28"/>
+      <w:bookmarkEnd w:id="29"/>
     </w:p>
     <w:p>
       <w:r>
         <w:t>The data must be normalised to be processed as the raw satellite data is not</w:t>
       </w:r>
       <w:r>
-        <w:t xml:space="preserve"> in a format suitable for direct use in machine learning models or statistical analysis. Normalization ensures that the features have a consistent scal</w:t>
+        <w:t xml:space="preserve"> in a format suitable for direct use in machine learning models or statistical analysis</w:t>
+      </w:r>
+      <w:r>
+        <w:t xml:space="preserve"> due to its large size</w:t>
+      </w:r>
+      <w:r>
+        <w:t>. Normalization ensures that the features have a consistent scal</w:t>
       </w:r>
       <w:r>
         <w:t xml:space="preserve">e for easier processing. </w:t>
@@ -6487,7 +7042,19 @@
         <w:t xml:space="preserve">As there is no baseline to normalize the values to </w:t>
       </w:r>
       <w:r>
-        <w:t xml:space="preserve">for fires, I will normalize the data to the highest and lowest values in the data. This means that the data will be scaled to between </w:t>
+        <w:t xml:space="preserve">for fires, </w:t>
+      </w:r>
+      <w:r>
+        <w:t>the data</w:t>
+      </w:r>
+      <w:r>
+        <w:t xml:space="preserve"> will </w:t>
+      </w:r>
+      <w:r>
+        <w:t>be normalized to</w:t>
+      </w:r>
+      <w:r>
+        <w:t xml:space="preserve"> the highest and lowest values in the data. This means that the data will be scaled to between </w:t>
       </w:r>
       <w:r>
         <w:t xml:space="preserve">zero </w:t>
@@ -6521,29 +7088,36 @@
     <w:p/>
     <w:p/>
     <w:p/>
+    <w:p/>
+    <w:p/>
+    <w:p/>
+    <w:p/>
+    <w:p/>
+    <w:p/>
     <w:p>
       <w:pPr>
         <w:pStyle w:val="Heading2"/>
         <w:jc w:val="both"/>
       </w:pPr>
-      <w:bookmarkStart w:id="29" w:name="_Toc194327721"/>
-      <w:r>
+      <w:bookmarkStart w:id="30" w:name="_Toc194327721"/>
+      <w:r>
+        <w:lastRenderedPageBreak/>
         <w:t xml:space="preserve">Model </w:t>
       </w:r>
       <w:r>
         <w:t>Implementation</w:t>
       </w:r>
-      <w:bookmarkEnd w:id="29"/>
+      <w:bookmarkEnd w:id="30"/>
     </w:p>
     <w:p>
       <w:pPr>
         <w:pStyle w:val="Heading3"/>
       </w:pPr>
-      <w:bookmarkStart w:id="30" w:name="_Toc194327722"/>
+      <w:bookmarkStart w:id="31" w:name="_Toc194327722"/>
       <w:r>
         <w:t>Important Bands in Landsat 9</w:t>
       </w:r>
-      <w:bookmarkEnd w:id="30"/>
+      <w:bookmarkEnd w:id="31"/>
     </w:p>
     <w:p>
       <w:r>
@@ -6646,17 +7220,35 @@
       <w:pPr>
         <w:pStyle w:val="Heading3"/>
       </w:pPr>
-      <w:bookmarkStart w:id="31" w:name="_Toc194327723"/>
+      <w:bookmarkStart w:id="32" w:name="_Toc194327723"/>
       <w:r>
         <w:t>Convolutional Neural Network (CNN)</w:t>
       </w:r>
-      <w:bookmarkEnd w:id="31"/>
+      <w:bookmarkEnd w:id="32"/>
     </w:p>
     <w:p>
       <w:r>
         <w:t xml:space="preserve">After selecting the useful bands in the tiles and normalising them they are ready to be used to train a CNN. </w:t>
       </w:r>
-    </w:p>
+      <w:r>
+        <w:t>The model architecture must first be created and then fine-tuned to the problem. As t</w:t>
+      </w:r>
+      <w:r>
+        <w:t>he shape of the data has three layers currently as two thermal infrared bands are used along with the calculated NDVI band. This means that the input shape of the model must take in the shape of each layer as well as the three layers themselves.</w:t>
+      </w:r>
+    </w:p>
+    <w:p>
+      <w:r>
+        <w:t>The output shape has to be four as the CNN is a classification model and there is four categories present in the data</w:t>
+      </w:r>
+      <w:r>
+        <w:t xml:space="preserve"> for the model to predict between</w:t>
+      </w:r>
+      <w:r>
+        <w:t xml:space="preserve">. </w:t>
+      </w:r>
+    </w:p>
+    <w:p/>
     <w:p>
       <w:r>
         <w:rPr>
@@ -6678,7 +7270,7 @@
                     <pic:cNvPicPr/>
                   </pic:nvPicPr>
                   <pic:blipFill>
-                    <a:blip r:embed="rId13"/>
+                    <a:blip r:embed="rId14"/>
                     <a:stretch>
                       <a:fillRect/>
                     </a:stretch>
@@ -6701,50 +7293,16 @@
     </w:p>
     <w:p>
       <w:r>
-        <w:t xml:space="preserve">The shape of the data has </w:t>
+        <w:lastRenderedPageBreak/>
+        <w:t>The</w:t>
+      </w:r>
+      <w:r>
+        <w:t xml:space="preserve"> model has </w:t>
       </w:r>
       <w:r>
         <w:t>three</w:t>
       </w:r>
       <w:r>
-        <w:t xml:space="preserve"> layers currently as two thermal infrared bands are used along with the calculated NDVI band. This means that the input shape of the model must take in the shape of each layer as well as the </w:t>
-      </w:r>
-      <w:r>
-        <w:t>three</w:t>
-      </w:r>
-      <w:r>
-        <w:t xml:space="preserve"> layers themselves.</w:t>
-      </w:r>
-    </w:p>
-    <w:p>
-      <w:r>
-        <w:lastRenderedPageBreak/>
-        <w:t xml:space="preserve">The output shape has to be </w:t>
-      </w:r>
-      <w:r>
-        <w:t>four</w:t>
-      </w:r>
-      <w:r>
-        <w:t xml:space="preserve"> as the CNN is a classification model and there is </w:t>
-      </w:r>
-      <w:r>
-        <w:t>four</w:t>
-      </w:r>
-      <w:r>
-        <w:t xml:space="preserve"> categories present in the data</w:t>
-      </w:r>
-      <w:r>
-        <w:t xml:space="preserve">. </w:t>
-      </w:r>
-    </w:p>
-    <w:p>
-      <w:r>
-        <w:t xml:space="preserve">My model has </w:t>
-      </w:r>
-      <w:r>
-        <w:t>three</w:t>
-      </w:r>
-      <w:r>
         <w:t xml:space="preserve"> convolutional blocks with increasing sizes of filters </w:t>
       </w:r>
       <w:r>
@@ -6802,32 +7360,303 @@
       <w:pPr>
         <w:pStyle w:val="Heading3"/>
       </w:pPr>
-      <w:bookmarkStart w:id="32" w:name="_Toc194327724"/>
+      <w:bookmarkStart w:id="33" w:name="_Toc194327724"/>
       <w:r>
         <w:t>User Interface</w:t>
       </w:r>
-      <w:bookmarkEnd w:id="32"/>
-    </w:p>
-    <w:p>
-      <w:r>
-        <w:t xml:space="preserve">Since python is used for most machine learning tasks programming a GUI in tkinter is a good choice to use as tkinter is very lightweight and </w:t>
+      <w:bookmarkEnd w:id="33"/>
+    </w:p>
+    <w:p>
+      <w:r>
+        <w:t xml:space="preserve">Since python is used for most machine learning tasks programming a GUI in </w:t>
+      </w:r>
+      <w:proofErr w:type="spellStart"/>
+      <w:r>
+        <w:t>tkinter</w:t>
+      </w:r>
+      <w:proofErr w:type="spellEnd"/>
+      <w:r>
+        <w:t xml:space="preserve"> is a good choice to use as </w:t>
+      </w:r>
+      <w:proofErr w:type="spellStart"/>
+      <w:r>
+        <w:t>tkinter</w:t>
+      </w:r>
+      <w:proofErr w:type="spellEnd"/>
+      <w:r>
+        <w:t xml:space="preserve"> is very lightweight and </w:t>
       </w:r>
       <w:r>
         <w:t>is an open-source library meaning that is completely free to use without any licensing.</w:t>
       </w:r>
     </w:p>
+    <w:p/>
+    <w:p/>
+    <w:p/>
+    <w:p/>
+    <w:p/>
+    <w:p/>
+    <w:p/>
+    <w:p/>
+    <w:p/>
+    <w:p/>
+    <w:p/>
+    <w:p/>
+    <w:p/>
     <w:p/>
     <w:p>
       <w:pPr>
         <w:pStyle w:val="Heading2"/>
         <w:jc w:val="both"/>
       </w:pPr>
-      <w:bookmarkStart w:id="33" w:name="_Toc194327725"/>
-      <w:r>
+      <w:bookmarkStart w:id="34" w:name="_Toc194327725"/>
+      <w:r>
+        <w:lastRenderedPageBreak/>
         <w:t>Testing</w:t>
       </w:r>
-      <w:bookmarkEnd w:id="33"/>
-    </w:p>
+      <w:bookmarkEnd w:id="34"/>
+    </w:p>
+    <w:p>
+      <w:pPr>
+        <w:pStyle w:val="Heading3"/>
+      </w:pPr>
+      <w:r>
+        <w:t>Model Training Performance</w:t>
+      </w:r>
+    </w:p>
+    <w:p>
+      <w:r>
+        <w:t>To train the model the dataset is split into two portions. One being 85% of the dataset which will be used for training, the remaining 15% of the dataset will be used to evaluate the model’s performance on the unseen data. Due to the dataset created containing only 288 files a larger number of evaluation data cannot be used as it will diminish the amount of data that the model will train on. Additionally, this means that the model must be carefully tuned to prevent overfitting and memorisation of the data.</w:t>
+      </w:r>
+      <w:r>
+        <w:t xml:space="preserve"> </w:t>
+      </w:r>
+    </w:p>
+    <w:p>
+      <w:r>
+        <w:rPr>
+          <w:noProof/>
+        </w:rPr>
+        <w:drawing>
+          <wp:inline distT="0" distB="0" distL="0" distR="0" wp14:anchorId="64FA2DD6" wp14:editId="761A23F9">
+            <wp:extent cx="3677279" cy="2604977"/>
+            <wp:effectExtent l="0" t="0" r="0" b="5080"/>
+            <wp:docPr id="214240581" name="Picture 1" descr="A diagram of a heatmap&#10;&#10;AI-generated content may be incorrect."/>
+            <wp:cNvGraphicFramePr>
+              <a:graphicFrameLocks xmlns:a="http://schemas.openxmlformats.org/drawingml/2006/main" noChangeAspect="1"/>
+            </wp:cNvGraphicFramePr>
+            <a:graphic xmlns:a="http://schemas.openxmlformats.org/drawingml/2006/main">
+              <a:graphicData uri="http://schemas.openxmlformats.org/drawingml/2006/picture">
+                <pic:pic xmlns:pic="http://schemas.openxmlformats.org/drawingml/2006/picture">
+                  <pic:nvPicPr>
+                    <pic:cNvPr id="214240581" name="Picture 1" descr="A diagram of a heatmap&#10;&#10;AI-generated content may be incorrect."/>
+                    <pic:cNvPicPr/>
+                  </pic:nvPicPr>
+                  <pic:blipFill>
+                    <a:blip r:embed="rId15"/>
+                    <a:stretch>
+                      <a:fillRect/>
+                    </a:stretch>
+                  </pic:blipFill>
+                  <pic:spPr>
+                    <a:xfrm>
+                      <a:off x="0" y="0"/>
+                      <a:ext cx="3685827" cy="2611033"/>
+                    </a:xfrm>
+                    <a:prstGeom prst="rect">
+                      <a:avLst/>
+                    </a:prstGeom>
+                  </pic:spPr>
+                </pic:pic>
+              </a:graphicData>
+            </a:graphic>
+          </wp:inline>
+        </w:drawing>
+      </w:r>
+    </w:p>
+    <w:p>
+      <w:r>
+        <w:t>The heatmap of the performance of the model on the test data split suggests that the model is performing well on the data and is able to categorize the data correctly as a large majority of the data was predicted correctly. Forty out of forty-three satellite images were predicted correctly which shows that the model has been able to effectively learn the differences between each state of a fire.</w:t>
+      </w:r>
+    </w:p>
+    <w:p>
+      <w:r>
+        <w:t xml:space="preserve">However, some of the data was predicted to be in the wrong category, this may be because of the revisit times of the satellite which may cause confusion in the predictions. Due to the high chance category including data as close to before a fire as possible given the satellite’s revisit time and the live fire category including data from sixteen days later which may mean that the fire is slowing down if the fire occurred closer to the before fire data than the live fire data. </w:t>
+      </w:r>
+    </w:p>
+    <w:p/>
+    <w:p/>
+    <w:p/>
+    <w:p/>
+    <w:p/>
+    <w:p/>
+    <w:p/>
+    <w:p/>
+    <w:p/>
+    <w:p>
+      <w:r>
+        <w:rPr>
+          <w:noProof/>
+        </w:rPr>
+        <w:lastRenderedPageBreak/>
+        <w:drawing>
+          <wp:anchor distT="0" distB="0" distL="114300" distR="114300" simplePos="0" relativeHeight="251658240" behindDoc="1" locked="0" layoutInCell="1" allowOverlap="1" wp14:anchorId="1AB72E62" wp14:editId="783DA4F6">
+            <wp:simplePos x="0" y="0"/>
+            <wp:positionH relativeFrom="column">
+              <wp:posOffset>233562</wp:posOffset>
+            </wp:positionH>
+            <wp:positionV relativeFrom="paragraph">
+              <wp:posOffset>222</wp:posOffset>
+            </wp:positionV>
+            <wp:extent cx="3965575" cy="2429510"/>
+            <wp:effectExtent l="0" t="0" r="0" b="8890"/>
+            <wp:wrapTight wrapText="bothSides">
+              <wp:wrapPolygon edited="0">
+                <wp:start x="0" y="0"/>
+                <wp:lineTo x="0" y="21510"/>
+                <wp:lineTo x="21479" y="21510"/>
+                <wp:lineTo x="21479" y="0"/>
+                <wp:lineTo x="0" y="0"/>
+              </wp:wrapPolygon>
+            </wp:wrapTight>
+            <wp:docPr id="703313161" name="Picture 1" descr="A graph with a line and a line&#10;&#10;AI-generated content may be incorrect."/>
+            <wp:cNvGraphicFramePr>
+              <a:graphicFrameLocks xmlns:a="http://schemas.openxmlformats.org/drawingml/2006/main" noChangeAspect="1"/>
+            </wp:cNvGraphicFramePr>
+            <a:graphic xmlns:a="http://schemas.openxmlformats.org/drawingml/2006/main">
+              <a:graphicData uri="http://schemas.openxmlformats.org/drawingml/2006/picture">
+                <pic:pic xmlns:pic="http://schemas.openxmlformats.org/drawingml/2006/picture">
+                  <pic:nvPicPr>
+                    <pic:cNvPr id="703313161" name="Picture 1" descr="A graph with a line and a line&#10;&#10;AI-generated content may be incorrect."/>
+                    <pic:cNvPicPr/>
+                  </pic:nvPicPr>
+                  <pic:blipFill>
+                    <a:blip r:embed="rId16">
+                      <a:extLst>
+                        <a:ext uri="{28A0092B-C50C-407E-A947-70E740481C1C}">
+                          <a14:useLocalDpi xmlns:a14="http://schemas.microsoft.com/office/drawing/2010/main" val="0"/>
+                        </a:ext>
+                      </a:extLst>
+                    </a:blip>
+                    <a:stretch>
+                      <a:fillRect/>
+                    </a:stretch>
+                  </pic:blipFill>
+                  <pic:spPr>
+                    <a:xfrm>
+                      <a:off x="0" y="0"/>
+                      <a:ext cx="3965575" cy="2429510"/>
+                    </a:xfrm>
+                    <a:prstGeom prst="rect">
+                      <a:avLst/>
+                    </a:prstGeom>
+                  </pic:spPr>
+                </pic:pic>
+              </a:graphicData>
+            </a:graphic>
+          </wp:anchor>
+        </w:drawing>
+      </w:r>
+    </w:p>
+    <w:p/>
+    <w:p/>
+    <w:p/>
+    <w:p/>
+    <w:p/>
+    <w:p/>
+    <w:p/>
+    <w:p/>
+    <w:p>
+      <w:r>
+        <w:t>The accuracy of the model increases with the number of epochs in both the train</w:t>
+      </w:r>
+      <w:r>
+        <w:t>ing</w:t>
+      </w:r>
+      <w:r>
+        <w:t xml:space="preserve"> and test</w:t>
+      </w:r>
+      <w:r>
+        <w:t>ing and shows no significant signs of overfitting this means that the model is effective at learning. The test line does fluctuate a lot more than the train accuracy because the test data has not been seen before by the model. The training line does decrease at the eighth epoch, this may be because the model is starting to generalise the data incorrectly however, the testing accuracy continues to increase.</w:t>
+      </w:r>
+    </w:p>
+    <w:p>
+      <w:r>
+        <w:t>The model also managed to achieve an accuracy of 80% on the test set as well as the training set despite training accuracy falling slightly at the last epoch. This meets one of the project’s requirements</w:t>
+      </w:r>
+      <w:r>
+        <w:t xml:space="preserve"> as the model has been able to train to a high degree of accuracy.</w:t>
+      </w:r>
+    </w:p>
+    <w:p/>
+    <w:p>
+      <w:r>
+        <w:rPr>
+          <w:noProof/>
+        </w:rPr>
+        <w:drawing>
+          <wp:inline distT="0" distB="0" distL="0" distR="0" wp14:anchorId="326E4C62" wp14:editId="498B1CF0">
+            <wp:extent cx="4805386" cy="1477925"/>
+            <wp:effectExtent l="0" t="0" r="0" b="8255"/>
+            <wp:docPr id="2034528584" name="Picture 1" descr="A graph of a line&#10;&#10;AI-generated content may be incorrect."/>
+            <wp:cNvGraphicFramePr>
+              <a:graphicFrameLocks xmlns:a="http://schemas.openxmlformats.org/drawingml/2006/main" noChangeAspect="1"/>
+            </wp:cNvGraphicFramePr>
+            <a:graphic xmlns:a="http://schemas.openxmlformats.org/drawingml/2006/main">
+              <a:graphicData uri="http://schemas.openxmlformats.org/drawingml/2006/picture">
+                <pic:pic xmlns:pic="http://schemas.openxmlformats.org/drawingml/2006/picture">
+                  <pic:nvPicPr>
+                    <pic:cNvPr id="2034528584" name="Picture 1" descr="A graph of a line&#10;&#10;AI-generated content may be incorrect."/>
+                    <pic:cNvPicPr/>
+                  </pic:nvPicPr>
+                  <pic:blipFill>
+                    <a:blip r:embed="rId17"/>
+                    <a:stretch>
+                      <a:fillRect/>
+                    </a:stretch>
+                  </pic:blipFill>
+                  <pic:spPr>
+                    <a:xfrm>
+                      <a:off x="0" y="0"/>
+                      <a:ext cx="4811542" cy="1479818"/>
+                    </a:xfrm>
+                    <a:prstGeom prst="rect">
+                      <a:avLst/>
+                    </a:prstGeom>
+                  </pic:spPr>
+                </pic:pic>
+              </a:graphicData>
+            </a:graphic>
+          </wp:inline>
+        </w:drawing>
+      </w:r>
+    </w:p>
+    <w:p>
+      <w:r>
+        <w:t>Over the course of the epochs the loss graph also shows that the model is learning as the loss decreases in both the training and testing.</w:t>
+      </w:r>
+      <w:r>
+        <w:t xml:space="preserve"> The test loss decreases at a greater rate than the training loss which suggests that the model is able to generalize well and learn patterns at a fast rate. The test loss remains lower than the training loss almost throughout the entire set of epochs which is unusual, this may be due to the dropout layers in the model architecture as it introduces noise which may result in the training loss being higher here.</w:t>
+      </w:r>
+    </w:p>
+    <w:p>
+      <w:r>
+        <w:t>The training evaluation suggests that the model has been able learn patterns and generalise well</w:t>
+      </w:r>
+      <w:r>
+        <w:t xml:space="preserve"> and shows no signs of over or underfitting</w:t>
+      </w:r>
+      <w:r>
+        <w:t>.</w:t>
+      </w:r>
+      <w:r>
+        <w:t xml:space="preserve"> Therefore, as a result of the training the model is well tuned for the task of predicting fires and needs to be tested rigorously to confirm that the model is successful. </w:t>
+      </w:r>
+    </w:p>
+    <w:p/>
+    <w:p/>
+    <w:p/>
+    <w:p/>
     <w:p>
       <w:pPr>
         <w:pStyle w:val="Heading3"/>
@@ -6846,20 +7675,32 @@
         <w:rPr>
           <w:u w:val="single"/>
         </w:rPr>
-        <w:t>Training results</w:t>
-      </w:r>
-    </w:p>
-    <w:p>
-      <w:pPr>
+        <w:t>Second</w:t>
+      </w:r>
+      <w:r>
         <w:rPr>
           <w:u w:val="single"/>
         </w:rPr>
-      </w:pPr>
+        <w:t xml:space="preserve"> California</w:t>
+      </w:r>
       <w:r>
         <w:rPr>
           <w:u w:val="single"/>
         </w:rPr>
-        <w:t>Second fire data</w:t>
+        <w:t xml:space="preserve"> fire data</w:t>
+      </w:r>
+    </w:p>
+    <w:p>
+      <w:r>
+        <w:t>To</w:t>
+      </w:r>
+      <w:r>
+        <w:t xml:space="preserve"> further evaluate the model and its performance, data from another fire in southern California must be collected. This is because the model scales the values of thermal anomalies around the pacific palisades fire present in the dataset due to the lack of standard fire data. </w:t>
+      </w:r>
+    </w:p>
+    <w:p>
+      <w:r>
+        <w:t>To do this a small collection of data must be extracted from the google earth engine and given to the model to measure the performance of the model.</w:t>
       </w:r>
     </w:p>
     <w:p>
@@ -6876,6 +7717,22 @@
       </w:r>
     </w:p>
     <w:p>
+      <w:r>
+        <w:t xml:space="preserve">To see if </w:t>
+      </w:r>
+      <w:r>
+        <w:t xml:space="preserve">the model is capable of predicting fires to a good degree in other regions it must be tested with data from another country with a similar climate and then another country with a completely different climate. The result of this test will show whether the model is </w:t>
+      </w:r>
+      <w:r>
+        <w:t>only useful to use in California with the current dataset.</w:t>
+      </w:r>
+    </w:p>
+    <w:p>
+      <w:r>
+        <w:t xml:space="preserve">Again, a data on a fire will be extracted from the google earth engine and given to the model to assess its performance on the new data. </w:t>
+      </w:r>
+    </w:p>
+    <w:p>
       <w:pPr>
         <w:rPr>
           <w:u w:val="single"/>
@@ -6889,6 +7746,14 @@
       </w:r>
     </w:p>
     <w:p>
+      <w:r>
+        <w:t>To test</w:t>
+      </w:r>
+      <w:r>
+        <w:t xml:space="preserve"> the model and the program’s ability to handle incorrect or invalid data some data will be given to the model to assess its performance.</w:t>
+      </w:r>
+    </w:p>
+    <w:p>
       <w:pPr>
         <w:pStyle w:val="Heading3"/>
       </w:pPr>
@@ -6910,23 +7775,31 @@
       </w:r>
     </w:p>
     <w:p>
+      <w:r>
+        <w:t>To</w:t>
+      </w:r>
+      <w:r>
+        <w:t xml:space="preserve"> ensure that the interface cannot be broken by abnormal user inputs and behaviours it must be tested.</w:t>
+      </w:r>
+    </w:p>
+    <w:p>
       <w:pPr>
         <w:pStyle w:val="Heading1"/>
         <w:jc w:val="both"/>
       </w:pPr>
-      <w:bookmarkStart w:id="34" w:name="_Toc194327726"/>
+      <w:bookmarkStart w:id="35" w:name="_Toc194327726"/>
       <w:r>
         <w:lastRenderedPageBreak/>
         <w:t>External concerns</w:t>
       </w:r>
-      <w:bookmarkEnd w:id="34"/>
+      <w:bookmarkEnd w:id="35"/>
     </w:p>
     <w:p>
       <w:pPr>
         <w:pStyle w:val="Heading2"/>
         <w:jc w:val="both"/>
       </w:pPr>
-      <w:bookmarkStart w:id="35" w:name="_Toc194327727"/>
+      <w:bookmarkStart w:id="36" w:name="_Toc194327727"/>
       <w:r>
         <w:t xml:space="preserve">Legal, </w:t>
       </w:r>
@@ -6942,7 +7815,7 @@
       <w:r>
         <w:t>thical issues</w:t>
       </w:r>
-      <w:bookmarkEnd w:id="35"/>
+      <w:bookmarkEnd w:id="36"/>
     </w:p>
     <w:p>
       <w:r>
@@ -6959,7 +7832,21 @@
     </w:p>
     <w:p>
       <w:r>
-        <w:t>The program does not need to take into account user data protection laws as at no point in operating the program does it handle user data. It only handles data extracted from the google earth engine or other ways of collecting landsat 9 data.</w:t>
+        <w:t xml:space="preserve">The program does not need to </w:t>
+      </w:r>
+      <w:proofErr w:type="gramStart"/>
+      <w:r>
+        <w:t>take into account</w:t>
+      </w:r>
+      <w:proofErr w:type="gramEnd"/>
+      <w:r>
+        <w:t xml:space="preserve"> user data protection laws as at no point in operating the program does it handle user data. It only handles data extracted from the google earth engine or other ways of collecting </w:t>
+      </w:r>
+      <w:r>
+        <w:t>Landsat</w:t>
+      </w:r>
+      <w:r>
+        <w:t xml:space="preserve"> 9 data.</w:t>
       </w:r>
     </w:p>
     <w:p>
@@ -6967,11 +7854,11 @@
         <w:pStyle w:val="Heading2"/>
         <w:jc w:val="both"/>
       </w:pPr>
-      <w:bookmarkStart w:id="36" w:name="_Toc194327728"/>
+      <w:bookmarkStart w:id="37" w:name="_Toc194327728"/>
       <w:r>
         <w:t>Commercial issues and exploitation</w:t>
       </w:r>
-      <w:bookmarkEnd w:id="36"/>
+      <w:bookmarkEnd w:id="37"/>
     </w:p>
     <w:p>
       <w:r>
@@ -6981,7 +7868,13 @@
         <w:t>the google earth engine then the program cannot be used to profit from as the data used</w:t>
       </w:r>
       <w:r>
-        <w:t xml:space="preserve"> was not originally created by me. I only extracted the data from the google earth engine.</w:t>
+        <w:t xml:space="preserve"> was not originally created by me. </w:t>
+      </w:r>
+      <w:r>
+        <w:t xml:space="preserve">The data was only extracted </w:t>
+      </w:r>
+      <w:r>
+        <w:t>from the google earth engine.</w:t>
       </w:r>
     </w:p>
     <w:p>
@@ -7012,7 +7905,7 @@
         <w:pStyle w:val="Heading1"/>
         <w:jc w:val="both"/>
       </w:pPr>
-      <w:bookmarkStart w:id="37" w:name="_Toc194327729"/>
+      <w:bookmarkStart w:id="38" w:name="_Toc194327729"/>
       <w:r>
         <w:lastRenderedPageBreak/>
         <w:t>Evaluation</w:t>
@@ -7020,7 +7913,7 @@
       <w:r>
         <w:t xml:space="preserve"> and discussion of results</w:t>
       </w:r>
-      <w:bookmarkEnd w:id="37"/>
+      <w:bookmarkEnd w:id="38"/>
     </w:p>
     <w:p>
       <w:pPr>
@@ -7035,11 +7928,11 @@
       <w:pPr>
         <w:pStyle w:val="Heading2"/>
       </w:pPr>
-      <w:bookmarkStart w:id="38" w:name="_Toc194327730"/>
+      <w:bookmarkStart w:id="39" w:name="_Toc194327730"/>
       <w:r>
         <w:t>Issues with Landsat 9</w:t>
       </w:r>
-      <w:bookmarkEnd w:id="38"/>
+      <w:bookmarkEnd w:id="39"/>
       <w:r>
         <w:t xml:space="preserve"> data</w:t>
       </w:r>
@@ -7069,7 +7962,25 @@
         <w:t>project,</w:t>
       </w:r>
       <w:r>
-        <w:t xml:space="preserve"> I have ignored time of day and used thermal readings and vegetation quality to form a prediction.</w:t>
+        <w:t xml:space="preserve"> </w:t>
+      </w:r>
+      <w:r>
+        <w:t>therefore</w:t>
+      </w:r>
+      <w:r>
+        <w:t xml:space="preserve"> time of day</w:t>
+      </w:r>
+      <w:r>
+        <w:t xml:space="preserve"> and season have been ignored</w:t>
+      </w:r>
+      <w:r>
+        <w:t xml:space="preserve"> and used thermal readings and vegetation quality to form a prediction</w:t>
+      </w:r>
+      <w:r>
+        <w:t xml:space="preserve"> instead</w:t>
+      </w:r>
+      <w:r>
+        <w:t>.</w:t>
       </w:r>
       <w:r>
         <w:t xml:space="preserve"> </w:t>
@@ -7096,45 +8007,45 @@
         <w:pStyle w:val="Heading1"/>
         <w:jc w:val="both"/>
       </w:pPr>
-      <w:bookmarkStart w:id="39" w:name="_Toc194327731"/>
+      <w:bookmarkStart w:id="40" w:name="_Toc194327731"/>
       <w:r>
         <w:lastRenderedPageBreak/>
         <w:t>Conclusion</w:t>
       </w:r>
-      <w:bookmarkEnd w:id="39"/>
+      <w:bookmarkEnd w:id="40"/>
     </w:p>
     <w:p>
       <w:pPr>
         <w:pStyle w:val="Heading2"/>
         <w:jc w:val="both"/>
       </w:pPr>
-      <w:bookmarkStart w:id="40" w:name="_Toc194327732"/>
+      <w:bookmarkStart w:id="41" w:name="_Toc194327732"/>
       <w:r>
         <w:t>Project management</w:t>
       </w:r>
-      <w:bookmarkEnd w:id="40"/>
+      <w:bookmarkEnd w:id="41"/>
     </w:p>
     <w:p>
       <w:pPr>
         <w:pStyle w:val="Heading2"/>
         <w:jc w:val="both"/>
       </w:pPr>
-      <w:bookmarkStart w:id="41" w:name="_Toc194327733"/>
+      <w:bookmarkStart w:id="42" w:name="_Toc194327733"/>
       <w:r>
         <w:t>Risk management</w:t>
       </w:r>
-      <w:bookmarkEnd w:id="41"/>
+      <w:bookmarkEnd w:id="42"/>
     </w:p>
     <w:p>
       <w:pPr>
         <w:pStyle w:val="Heading2"/>
         <w:jc w:val="both"/>
       </w:pPr>
-      <w:bookmarkStart w:id="42" w:name="_Toc194327734"/>
+      <w:bookmarkStart w:id="43" w:name="_Toc194327734"/>
       <w:r>
         <w:t>General conclusions</w:t>
       </w:r>
-      <w:bookmarkEnd w:id="42"/>
+      <w:bookmarkEnd w:id="43"/>
     </w:p>
     <w:p>
       <w:pPr>
@@ -7162,12 +8073,12 @@
         <w:pStyle w:val="UnnumberedHeading1"/>
         <w:jc w:val="both"/>
       </w:pPr>
-      <w:bookmarkStart w:id="43" w:name="_Toc194327735"/>
+      <w:bookmarkStart w:id="44" w:name="_Toc194327735"/>
       <w:r>
         <w:lastRenderedPageBreak/>
         <w:t>References</w:t>
       </w:r>
-      <w:bookmarkEnd w:id="43"/>
+      <w:bookmarkEnd w:id="44"/>
     </w:p>
     <w:sdt>
       <w:sdtPr>
@@ -7219,7 +8130,31 @@
               <w:sz w:val="22"/>
               <w:szCs w:val="22"/>
             </w:rPr>
-            <w:t xml:space="preserve">EFFIS annual statistics for greece. </w:t>
+            <w:t xml:space="preserve">EFFIS annual statistics for </w:t>
+          </w:r>
+          <w:proofErr w:type="spellStart"/>
+          <w:r>
+            <w:rPr>
+              <w:rFonts w:ascii="Calibri" w:hAnsi="Calibri" w:cs="Calibri"/>
+              <w:i/>
+              <w:iCs/>
+              <w:color w:val="000000"/>
+              <w:sz w:val="22"/>
+              <w:szCs w:val="22"/>
+            </w:rPr>
+            <w:t>greece</w:t>
+          </w:r>
+          <w:proofErr w:type="spellEnd"/>
+          <w:r>
+            <w:rPr>
+              <w:rFonts w:ascii="Calibri" w:hAnsi="Calibri" w:cs="Calibri"/>
+              <w:i/>
+              <w:iCs/>
+              <w:color w:val="000000"/>
+              <w:sz w:val="22"/>
+              <w:szCs w:val="22"/>
+            </w:rPr>
+            <w:t xml:space="preserve">. </w:t>
           </w:r>
           <w:r>
             <w:rPr>
@@ -7230,7 +8165,7 @@
             </w:rPr>
             <w:t xml:space="preserve">Available online: </w:t>
           </w:r>
-          <w:hyperlink r:id="rId14" w:tgtFrame="_blank" w:history="1">
+          <w:hyperlink r:id="rId18" w:tgtFrame="_blank" w:history="1">
             <w:r>
               <w:rPr>
                 <w:rStyle w:val="Hyperlink"/>
@@ -7269,7 +8204,47 @@
               <w:sz w:val="22"/>
               <w:szCs w:val="22"/>
             </w:rPr>
-            <w:t xml:space="preserve">D. Rashkovetsky, F. Mauracher, M. Langer &amp; M. Schmitt (2021) Wildfire detection from multisensor satellite imagery using deep semantic segmentation. </w:t>
+            <w:t xml:space="preserve">D. </w:t>
+          </w:r>
+          <w:proofErr w:type="spellStart"/>
+          <w:r>
+            <w:rPr>
+              <w:rFonts w:ascii="Calibri" w:hAnsi="Calibri" w:cs="Calibri"/>
+              <w:color w:val="000000"/>
+              <w:sz w:val="22"/>
+              <w:szCs w:val="22"/>
+            </w:rPr>
+            <w:t>Rashkovetsky</w:t>
+          </w:r>
+          <w:proofErr w:type="spellEnd"/>
+          <w:r>
+            <w:rPr>
+              <w:rFonts w:ascii="Calibri" w:hAnsi="Calibri" w:cs="Calibri"/>
+              <w:color w:val="000000"/>
+              <w:sz w:val="22"/>
+              <w:szCs w:val="22"/>
+            </w:rPr>
+            <w:t xml:space="preserve">, F. Mauracher, M. Langer &amp; M. Schmitt (2021) Wildfire detection from </w:t>
+          </w:r>
+          <w:proofErr w:type="spellStart"/>
+          <w:r>
+            <w:rPr>
+              <w:rFonts w:ascii="Calibri" w:hAnsi="Calibri" w:cs="Calibri"/>
+              <w:color w:val="000000"/>
+              <w:sz w:val="22"/>
+              <w:szCs w:val="22"/>
+            </w:rPr>
+            <w:t>multisensor</w:t>
+          </w:r>
+          <w:proofErr w:type="spellEnd"/>
+          <w:r>
+            <w:rPr>
+              <w:rFonts w:ascii="Calibri" w:hAnsi="Calibri" w:cs="Calibri"/>
+              <w:color w:val="000000"/>
+              <w:sz w:val="22"/>
+              <w:szCs w:val="22"/>
+            </w:rPr>
+            <w:t xml:space="preserve"> satellite imagery using deep semantic segmentation. </w:t>
           </w:r>
           <w:r>
             <w:rPr>
@@ -7351,7 +8326,47 @@
               <w:sz w:val="22"/>
               <w:szCs w:val="22"/>
             </w:rPr>
-            <w:t xml:space="preserve">Fu, Y., Li, R., Wang, X., Bergeron, Y., Valeria, O., Chavardès, R. D., Wang, Y. &amp; Hu, J. (2020) Fire detection and fire radiative power in forests and low-biomass lands in northeast asia: MODIS versus VIIRS fire products. </w:t>
+            <w:t xml:space="preserve">Fu, Y., Li, R., Wang, X., Bergeron, Y., Valeria, O., </w:t>
+          </w:r>
+          <w:proofErr w:type="spellStart"/>
+          <w:r>
+            <w:rPr>
+              <w:rFonts w:ascii="Calibri" w:hAnsi="Calibri" w:cs="Calibri"/>
+              <w:color w:val="000000"/>
+              <w:sz w:val="22"/>
+              <w:szCs w:val="22"/>
+            </w:rPr>
+            <w:t>Chavardès</w:t>
+          </w:r>
+          <w:proofErr w:type="spellEnd"/>
+          <w:r>
+            <w:rPr>
+              <w:rFonts w:ascii="Calibri" w:hAnsi="Calibri" w:cs="Calibri"/>
+              <w:color w:val="000000"/>
+              <w:sz w:val="22"/>
+              <w:szCs w:val="22"/>
+            </w:rPr>
+            <w:t xml:space="preserve">, R. D., Wang, Y. &amp; Hu, J. (2020) Fire detection and fire radiative power in forests and low-biomass lands in northeast </w:t>
+          </w:r>
+          <w:proofErr w:type="spellStart"/>
+          <w:r>
+            <w:rPr>
+              <w:rFonts w:ascii="Calibri" w:hAnsi="Calibri" w:cs="Calibri"/>
+              <w:color w:val="000000"/>
+              <w:sz w:val="22"/>
+              <w:szCs w:val="22"/>
+            </w:rPr>
+            <w:t>asia</w:t>
+          </w:r>
+          <w:proofErr w:type="spellEnd"/>
+          <w:r>
+            <w:rPr>
+              <w:rFonts w:ascii="Calibri" w:hAnsi="Calibri" w:cs="Calibri"/>
+              <w:color w:val="000000"/>
+              <w:sz w:val="22"/>
+              <w:szCs w:val="22"/>
+            </w:rPr>
+            <w:t xml:space="preserve">: MODIS versus VIIRS fire products. </w:t>
           </w:r>
           <w:r>
             <w:rPr>
@@ -7433,7 +8448,27 @@
               <w:sz w:val="22"/>
               <w:szCs w:val="22"/>
             </w:rPr>
-            <w:t xml:space="preserve">Kanwal, R., Rafaqat, W., Iqbal, M. &amp; Weiguo, S. (2023) Data-driven approaches for wildfire mapping and prediction assessment using a convolutional neural network (CNN). </w:t>
+            <w:t xml:space="preserve">Kanwal, R., Rafaqat, W., Iqbal, M. &amp; </w:t>
+          </w:r>
+          <w:proofErr w:type="spellStart"/>
+          <w:r>
+            <w:rPr>
+              <w:rFonts w:ascii="Calibri" w:hAnsi="Calibri" w:cs="Calibri"/>
+              <w:color w:val="000000"/>
+              <w:sz w:val="22"/>
+              <w:szCs w:val="22"/>
+            </w:rPr>
+            <w:t>Weiguo</w:t>
+          </w:r>
+          <w:proofErr w:type="spellEnd"/>
+          <w:r>
+            <w:rPr>
+              <w:rFonts w:ascii="Calibri" w:hAnsi="Calibri" w:cs="Calibri"/>
+              <w:color w:val="000000"/>
+              <w:sz w:val="22"/>
+              <w:szCs w:val="22"/>
+            </w:rPr>
+            <w:t xml:space="preserve">, S. (2023) Data-driven approaches for wildfire mapping and prediction assessment using a convolutional neural network (CNN). </w:t>
           </w:r>
           <w:r>
             <w:rPr>
@@ -7496,7 +8531,7 @@
             </w:rPr>
             <w:t xml:space="preserve">Available online: </w:t>
           </w:r>
-          <w:hyperlink r:id="rId15" w:tgtFrame="_blank" w:history="1">
+          <w:hyperlink r:id="rId19" w:tgtFrame="_blank" w:history="1">
             <w:r>
               <w:rPr>
                 <w:rStyle w:val="Hyperlink"/>
@@ -7535,7 +8570,27 @@
               <w:sz w:val="22"/>
               <w:szCs w:val="22"/>
             </w:rPr>
-            <w:t xml:space="preserve">MacCarthy James, Richter Jessica, Tyukavina Sasha, Weisse Mikaela &amp; Harris Nancy (2024) </w:t>
+            <w:t xml:space="preserve">MacCarthy James, Richter Jessica, </w:t>
+          </w:r>
+          <w:proofErr w:type="spellStart"/>
+          <w:r>
+            <w:rPr>
+              <w:rFonts w:ascii="Calibri" w:hAnsi="Calibri" w:cs="Calibri"/>
+              <w:color w:val="000000"/>
+              <w:sz w:val="22"/>
+              <w:szCs w:val="22"/>
+            </w:rPr>
+            <w:t>Tyukavina</w:t>
+          </w:r>
+          <w:proofErr w:type="spellEnd"/>
+          <w:r>
+            <w:rPr>
+              <w:rFonts w:ascii="Calibri" w:hAnsi="Calibri" w:cs="Calibri"/>
+              <w:color w:val="000000"/>
+              <w:sz w:val="22"/>
+              <w:szCs w:val="22"/>
+            </w:rPr>
+            <w:t xml:space="preserve"> Sasha, Weisse Mikaela &amp; Harris Nancy (2024) </w:t>
           </w:r>
           <w:r>
             <w:rPr>
@@ -7557,7 +8612,7 @@
             </w:rPr>
             <w:t xml:space="preserve">Available online: </w:t>
           </w:r>
-          <w:hyperlink r:id="rId16" w:tgtFrame="_blank" w:history="1">
+          <w:hyperlink r:id="rId20" w:tgtFrame="_blank" w:history="1">
             <w:r>
               <w:rPr>
                 <w:rStyle w:val="Hyperlink"/>
@@ -7596,7 +8651,47 @@
               <w:sz w:val="22"/>
               <w:szCs w:val="22"/>
             </w:rPr>
-            <w:t xml:space="preserve">Malik, A., Rao, M. R., Puppala, N., Koouri, P., Thota, V. A., Liu, Q., Chiao, S. &amp; Gao, J. (2021) Data-driven wildfire risk prediction in northern california. </w:t>
+            <w:t xml:space="preserve">Malik, A., Rao, M. R., Puppala, N., </w:t>
+          </w:r>
+          <w:proofErr w:type="spellStart"/>
+          <w:r>
+            <w:rPr>
+              <w:rFonts w:ascii="Calibri" w:hAnsi="Calibri" w:cs="Calibri"/>
+              <w:color w:val="000000"/>
+              <w:sz w:val="22"/>
+              <w:szCs w:val="22"/>
+            </w:rPr>
+            <w:t>Koouri</w:t>
+          </w:r>
+          <w:proofErr w:type="spellEnd"/>
+          <w:r>
+            <w:rPr>
+              <w:rFonts w:ascii="Calibri" w:hAnsi="Calibri" w:cs="Calibri"/>
+              <w:color w:val="000000"/>
+              <w:sz w:val="22"/>
+              <w:szCs w:val="22"/>
+            </w:rPr>
+            <w:t xml:space="preserve">, P., Thota, V. A., Liu, Q., Chiao, S. &amp; Gao, J. (2021) Data-driven wildfire risk prediction in northern </w:t>
+          </w:r>
+          <w:proofErr w:type="spellStart"/>
+          <w:r>
+            <w:rPr>
+              <w:rFonts w:ascii="Calibri" w:hAnsi="Calibri" w:cs="Calibri"/>
+              <w:color w:val="000000"/>
+              <w:sz w:val="22"/>
+              <w:szCs w:val="22"/>
+            </w:rPr>
+            <w:t>california</w:t>
+          </w:r>
+          <w:proofErr w:type="spellEnd"/>
+          <w:r>
+            <w:rPr>
+              <w:rFonts w:ascii="Calibri" w:hAnsi="Calibri" w:cs="Calibri"/>
+              <w:color w:val="000000"/>
+              <w:sz w:val="22"/>
+              <w:szCs w:val="22"/>
+            </w:rPr>
+            <w:t xml:space="preserve">. </w:t>
           </w:r>
           <w:r>
             <w:rPr>
@@ -7659,7 +8754,7 @@
             </w:rPr>
             <w:t xml:space="preserve">Available online: </w:t>
           </w:r>
-          <w:hyperlink r:id="rId17" w:tgtFrame="_blank" w:history="1">
+          <w:hyperlink r:id="rId21" w:tgtFrame="_blank" w:history="1">
             <w:r>
               <w:rPr>
                 <w:rStyle w:val="Hyperlink"/>
@@ -7698,7 +8793,47 @@
               <w:sz w:val="22"/>
               <w:szCs w:val="22"/>
             </w:rPr>
-            <w:t xml:space="preserve">Peng, W., Wei, Y., Chen, G., Lu, G., Ye, Q., Ding, R., Hu, P. &amp; Cheng, Z. (2023) Analysis of wildfire danger level using logistic regression model in sichuan province, china. </w:t>
+            <w:t xml:space="preserve">Peng, W., Wei, Y., Chen, G., Lu, G., Ye, Q., Ding, R., Hu, P. &amp; Cheng, Z. (2023) Analysis of wildfire danger level using logistic regression model in </w:t>
+          </w:r>
+          <w:proofErr w:type="spellStart"/>
+          <w:r>
+            <w:rPr>
+              <w:rFonts w:ascii="Calibri" w:hAnsi="Calibri" w:cs="Calibri"/>
+              <w:color w:val="000000"/>
+              <w:sz w:val="22"/>
+              <w:szCs w:val="22"/>
+            </w:rPr>
+            <w:t>sichuan</w:t>
+          </w:r>
+          <w:proofErr w:type="spellEnd"/>
+          <w:r>
+            <w:rPr>
+              <w:rFonts w:ascii="Calibri" w:hAnsi="Calibri" w:cs="Calibri"/>
+              <w:color w:val="000000"/>
+              <w:sz w:val="22"/>
+              <w:szCs w:val="22"/>
+            </w:rPr>
+            <w:t xml:space="preserve"> province, </w:t>
+          </w:r>
+          <w:proofErr w:type="spellStart"/>
+          <w:r>
+            <w:rPr>
+              <w:rFonts w:ascii="Calibri" w:hAnsi="Calibri" w:cs="Calibri"/>
+              <w:color w:val="000000"/>
+              <w:sz w:val="22"/>
+              <w:szCs w:val="22"/>
+            </w:rPr>
+            <w:t>china</w:t>
+          </w:r>
+          <w:proofErr w:type="spellEnd"/>
+          <w:r>
+            <w:rPr>
+              <w:rFonts w:ascii="Calibri" w:hAnsi="Calibri" w:cs="Calibri"/>
+              <w:color w:val="000000"/>
+              <w:sz w:val="22"/>
+              <w:szCs w:val="22"/>
+            </w:rPr>
+            <w:t xml:space="preserve">. </w:t>
           </w:r>
           <w:r>
             <w:rPr>
@@ -7739,7 +8874,67 @@
               <w:sz w:val="22"/>
               <w:szCs w:val="22"/>
             </w:rPr>
-            <w:t xml:space="preserve">Rezaei Barzani, A., Pahlavani, P. &amp; Ghorbanzadeh, O. (2023) Ensembling of decision trees, knn, and logistic regression with soft-voting method for wildfire susceptibility mapping. </w:t>
+            <w:t xml:space="preserve">Rezaei Barzani, A., </w:t>
+          </w:r>
+          <w:proofErr w:type="spellStart"/>
+          <w:r>
+            <w:rPr>
+              <w:rFonts w:ascii="Calibri" w:hAnsi="Calibri" w:cs="Calibri"/>
+              <w:color w:val="000000"/>
+              <w:sz w:val="22"/>
+              <w:szCs w:val="22"/>
+            </w:rPr>
+            <w:t>Pahlavani</w:t>
+          </w:r>
+          <w:proofErr w:type="spellEnd"/>
+          <w:r>
+            <w:rPr>
+              <w:rFonts w:ascii="Calibri" w:hAnsi="Calibri" w:cs="Calibri"/>
+              <w:color w:val="000000"/>
+              <w:sz w:val="22"/>
+              <w:szCs w:val="22"/>
+            </w:rPr>
+            <w:t xml:space="preserve">, P. &amp; Ghorbanzadeh, O. (2023) </w:t>
+          </w:r>
+          <w:proofErr w:type="spellStart"/>
+          <w:r>
+            <w:rPr>
+              <w:rFonts w:ascii="Calibri" w:hAnsi="Calibri" w:cs="Calibri"/>
+              <w:color w:val="000000"/>
+              <w:sz w:val="22"/>
+              <w:szCs w:val="22"/>
+            </w:rPr>
+            <w:t>Ensembling</w:t>
+          </w:r>
+          <w:proofErr w:type="spellEnd"/>
+          <w:r>
+            <w:rPr>
+              <w:rFonts w:ascii="Calibri" w:hAnsi="Calibri" w:cs="Calibri"/>
+              <w:color w:val="000000"/>
+              <w:sz w:val="22"/>
+              <w:szCs w:val="22"/>
+            </w:rPr>
+            <w:t xml:space="preserve"> of decision trees, </w:t>
+          </w:r>
+          <w:proofErr w:type="spellStart"/>
+          <w:r>
+            <w:rPr>
+              <w:rFonts w:ascii="Calibri" w:hAnsi="Calibri" w:cs="Calibri"/>
+              <w:color w:val="000000"/>
+              <w:sz w:val="22"/>
+              <w:szCs w:val="22"/>
+            </w:rPr>
+            <w:t>knn</w:t>
+          </w:r>
+          <w:proofErr w:type="spellEnd"/>
+          <w:r>
+            <w:rPr>
+              <w:rFonts w:ascii="Calibri" w:hAnsi="Calibri" w:cs="Calibri"/>
+              <w:color w:val="000000"/>
+              <w:sz w:val="22"/>
+              <w:szCs w:val="22"/>
+            </w:rPr>
+            <w:t xml:space="preserve">, and logistic regression with soft-voting method for wildfire susceptibility mapping. </w:t>
           </w:r>
           <w:r>
             <w:rPr>
@@ -7750,7 +8945,79 @@
               <w:sz w:val="22"/>
               <w:szCs w:val="22"/>
             </w:rPr>
-            <w:t xml:space="preserve">ISPRS Ann.Photogramm.Remote Sens.Spatial Inf.Sci., </w:t>
+            <w:t xml:space="preserve">ISPRS </w:t>
+          </w:r>
+          <w:proofErr w:type="spellStart"/>
+          <w:r>
+            <w:rPr>
+              <w:rFonts w:ascii="Calibri" w:hAnsi="Calibri" w:cs="Calibri"/>
+              <w:i/>
+              <w:iCs/>
+              <w:color w:val="000000"/>
+              <w:sz w:val="22"/>
+              <w:szCs w:val="22"/>
+            </w:rPr>
+            <w:t>Ann.Photogramm.Remote</w:t>
+          </w:r>
+          <w:proofErr w:type="spellEnd"/>
+          <w:r>
+            <w:rPr>
+              <w:rFonts w:ascii="Calibri" w:hAnsi="Calibri" w:cs="Calibri"/>
+              <w:i/>
+              <w:iCs/>
+              <w:color w:val="000000"/>
+              <w:sz w:val="22"/>
+              <w:szCs w:val="22"/>
+            </w:rPr>
+            <w:t xml:space="preserve"> </w:t>
+          </w:r>
+          <w:proofErr w:type="spellStart"/>
+          <w:r>
+            <w:rPr>
+              <w:rFonts w:ascii="Calibri" w:hAnsi="Calibri" w:cs="Calibri"/>
+              <w:i/>
+              <w:iCs/>
+              <w:color w:val="000000"/>
+              <w:sz w:val="22"/>
+              <w:szCs w:val="22"/>
+            </w:rPr>
+            <w:t>Sens.Spatial</w:t>
+          </w:r>
+          <w:proofErr w:type="spellEnd"/>
+          <w:r>
+            <w:rPr>
+              <w:rFonts w:ascii="Calibri" w:hAnsi="Calibri" w:cs="Calibri"/>
+              <w:i/>
+              <w:iCs/>
+              <w:color w:val="000000"/>
+              <w:sz w:val="22"/>
+              <w:szCs w:val="22"/>
+            </w:rPr>
+            <w:t xml:space="preserve"> </w:t>
+          </w:r>
+          <w:proofErr w:type="spellStart"/>
+          <w:r>
+            <w:rPr>
+              <w:rFonts w:ascii="Calibri" w:hAnsi="Calibri" w:cs="Calibri"/>
+              <w:i/>
+              <w:iCs/>
+              <w:color w:val="000000"/>
+              <w:sz w:val="22"/>
+              <w:szCs w:val="22"/>
+            </w:rPr>
+            <w:t>Inf.Sci</w:t>
+          </w:r>
+          <w:proofErr w:type="spellEnd"/>
+          <w:r>
+            <w:rPr>
+              <w:rFonts w:ascii="Calibri" w:hAnsi="Calibri" w:cs="Calibri"/>
+              <w:i/>
+              <w:iCs/>
+              <w:color w:val="000000"/>
+              <w:sz w:val="22"/>
+              <w:szCs w:val="22"/>
+            </w:rPr>
+            <w:t xml:space="preserve">., </w:t>
           </w:r>
           <w:r>
             <w:rPr>
@@ -7802,7 +9069,7 @@
             </w:rPr>
             <w:t xml:space="preserve">Available online: </w:t>
           </w:r>
-          <w:hyperlink r:id="rId18" w:tgtFrame="_blank" w:history="1">
+          <w:hyperlink r:id="rId22" w:tgtFrame="_blank" w:history="1">
             <w:r>
               <w:rPr>
                 <w:rStyle w:val="Hyperlink"/>
@@ -7864,7 +9131,7 @@
             </w:rPr>
             <w:t xml:space="preserve">Available online: </w:t>
           </w:r>
-          <w:hyperlink r:id="rId19" w:tgtFrame="_blank" w:history="1">
+          <w:hyperlink r:id="rId23" w:tgtFrame="_blank" w:history="1">
             <w:r>
               <w:rPr>
                 <w:rStyle w:val="Hyperlink"/>
@@ -7905,12 +9172,12 @@
         <w:pStyle w:val="UnnumberedHeading1"/>
         <w:jc w:val="both"/>
       </w:pPr>
-      <w:bookmarkStart w:id="44" w:name="_Toc194327736"/>
+      <w:bookmarkStart w:id="45" w:name="_Toc194327736"/>
       <w:r>
         <w:lastRenderedPageBreak/>
         <w:t>Appendix A</w:t>
       </w:r>
-      <w:bookmarkEnd w:id="44"/>
+      <w:bookmarkEnd w:id="45"/>
       <w:r>
         <w:t xml:space="preserve"> </w:t>
       </w:r>
@@ -7920,12 +9187,12 @@
         <w:pStyle w:val="UnnumberedHeading1"/>
         <w:jc w:val="both"/>
       </w:pPr>
-      <w:bookmarkStart w:id="45" w:name="_Toc194327737"/>
+      <w:bookmarkStart w:id="46" w:name="_Toc194327737"/>
       <w:r>
         <w:lastRenderedPageBreak/>
         <w:t>Appendix B</w:t>
       </w:r>
-      <w:bookmarkEnd w:id="45"/>
+      <w:bookmarkEnd w:id="46"/>
       <w:r>
         <w:t xml:space="preserve"> </w:t>
       </w:r>
@@ -7936,7 +9203,7 @@
       </w:pPr>
     </w:p>
     <w:sectPr>
-      <w:footerReference w:type="default" r:id="rId20"/>
+      <w:footerReference w:type="default" r:id="rId24"/>
       <w:pgSz w:w="11906" w:h="16838"/>
       <w:pgMar w:top="1440" w:right="1440" w:bottom="1440" w:left="1440" w:header="708" w:footer="708" w:gutter="0"/>
       <w:pgNumType w:start="1"/>
@@ -8703,6 +9970,119 @@
       </w:rPr>
     </w:lvl>
   </w:abstractNum>
+  <w:abstractNum w:abstractNumId="5" w15:restartNumberingAfterBreak="0">
+    <w:nsid w:val="49AC0881"/>
+    <w:multiLevelType w:val="hybridMultilevel"/>
+    <w:tmpl w:val="897CCD6C"/>
+    <w:lvl w:ilvl="0" w:tplc="08090001">
+      <w:start w:val="1"/>
+      <w:numFmt w:val="bullet"/>
+      <w:lvlText w:val=""/>
+      <w:lvlJc w:val="left"/>
+      <w:pPr>
+        <w:ind w:left="720" w:hanging="360"/>
+      </w:pPr>
+      <w:rPr>
+        <w:rFonts w:ascii="Symbol" w:hAnsi="Symbol" w:hint="default"/>
+      </w:rPr>
+    </w:lvl>
+    <w:lvl w:ilvl="1" w:tplc="08090003" w:tentative="1">
+      <w:start w:val="1"/>
+      <w:numFmt w:val="bullet"/>
+      <w:lvlText w:val="o"/>
+      <w:lvlJc w:val="left"/>
+      <w:pPr>
+        <w:ind w:left="1440" w:hanging="360"/>
+      </w:pPr>
+      <w:rPr>
+        <w:rFonts w:ascii="Courier New" w:hAnsi="Courier New" w:cs="Courier New" w:hint="default"/>
+      </w:rPr>
+    </w:lvl>
+    <w:lvl w:ilvl="2" w:tplc="08090005" w:tentative="1">
+      <w:start w:val="1"/>
+      <w:numFmt w:val="bullet"/>
+      <w:lvlText w:val=""/>
+      <w:lvlJc w:val="left"/>
+      <w:pPr>
+        <w:ind w:left="2160" w:hanging="360"/>
+      </w:pPr>
+      <w:rPr>
+        <w:rFonts w:ascii="Wingdings" w:hAnsi="Wingdings" w:hint="default"/>
+      </w:rPr>
+    </w:lvl>
+    <w:lvl w:ilvl="3" w:tplc="08090001" w:tentative="1">
+      <w:start w:val="1"/>
+      <w:numFmt w:val="bullet"/>
+      <w:lvlText w:val=""/>
+      <w:lvlJc w:val="left"/>
+      <w:pPr>
+        <w:ind w:left="2880" w:hanging="360"/>
+      </w:pPr>
+      <w:rPr>
+        <w:rFonts w:ascii="Symbol" w:hAnsi="Symbol" w:hint="default"/>
+      </w:rPr>
+    </w:lvl>
+    <w:lvl w:ilvl="4" w:tplc="08090003" w:tentative="1">
+      <w:start w:val="1"/>
+      <w:numFmt w:val="bullet"/>
+      <w:lvlText w:val="o"/>
+      <w:lvlJc w:val="left"/>
+      <w:pPr>
+        <w:ind w:left="3600" w:hanging="360"/>
+      </w:pPr>
+      <w:rPr>
+        <w:rFonts w:ascii="Courier New" w:hAnsi="Courier New" w:cs="Courier New" w:hint="default"/>
+      </w:rPr>
+    </w:lvl>
+    <w:lvl w:ilvl="5" w:tplc="08090005" w:tentative="1">
+      <w:start w:val="1"/>
+      <w:numFmt w:val="bullet"/>
+      <w:lvlText w:val=""/>
+      <w:lvlJc w:val="left"/>
+      <w:pPr>
+        <w:ind w:left="4320" w:hanging="360"/>
+      </w:pPr>
+      <w:rPr>
+        <w:rFonts w:ascii="Wingdings" w:hAnsi="Wingdings" w:hint="default"/>
+      </w:rPr>
+    </w:lvl>
+    <w:lvl w:ilvl="6" w:tplc="08090001" w:tentative="1">
+      <w:start w:val="1"/>
+      <w:numFmt w:val="bullet"/>
+      <w:lvlText w:val=""/>
+      <w:lvlJc w:val="left"/>
+      <w:pPr>
+        <w:ind w:left="5040" w:hanging="360"/>
+      </w:pPr>
+      <w:rPr>
+        <w:rFonts w:ascii="Symbol" w:hAnsi="Symbol" w:hint="default"/>
+      </w:rPr>
+    </w:lvl>
+    <w:lvl w:ilvl="7" w:tplc="08090003" w:tentative="1">
+      <w:start w:val="1"/>
+      <w:numFmt w:val="bullet"/>
+      <w:lvlText w:val="o"/>
+      <w:lvlJc w:val="left"/>
+      <w:pPr>
+        <w:ind w:left="5760" w:hanging="360"/>
+      </w:pPr>
+      <w:rPr>
+        <w:rFonts w:ascii="Courier New" w:hAnsi="Courier New" w:cs="Courier New" w:hint="default"/>
+      </w:rPr>
+    </w:lvl>
+    <w:lvl w:ilvl="8" w:tplc="08090005" w:tentative="1">
+      <w:start w:val="1"/>
+      <w:numFmt w:val="bullet"/>
+      <w:lvlText w:val=""/>
+      <w:lvlJc w:val="left"/>
+      <w:pPr>
+        <w:ind w:left="6480" w:hanging="360"/>
+      </w:pPr>
+      <w:rPr>
+        <w:rFonts w:ascii="Wingdings" w:hAnsi="Wingdings" w:hint="default"/>
+      </w:rPr>
+    </w:lvl>
+  </w:abstractNum>
   <w:num w:numId="1" w16cid:durableId="188295724">
     <w:abstractNumId w:val="0"/>
   </w:num>
@@ -8717,6 +10097,9 @@
   </w:num>
   <w:num w:numId="5" w16cid:durableId="1475679024">
     <w:abstractNumId w:val="4"/>
+  </w:num>
+  <w:num w:numId="6" w16cid:durableId="1782799417">
+    <w:abstractNumId w:val="5"/>
   </w:num>
 </w:numbering>
 </file>
@@ -10317,14 +11700,14 @@
     <w:charset w:val="00"/>
     <w:family w:val="swiss"/>
     <w:pitch w:val="variable"/>
-    <w:sig w:usb0="E4002EFF" w:usb1="C000247B" w:usb2="00000009" w:usb3="00000000" w:csb0="000001FF" w:csb1="00000000"/>
+    <w:sig w:usb0="E4002EFF" w:usb1="C200247B" w:usb2="00000009" w:usb3="00000000" w:csb0="000001FF" w:csb1="00000000"/>
   </w:font>
   <w:font w:name="Calibri Light">
     <w:panose1 w:val="020F0302020204030204"/>
     <w:charset w:val="00"/>
     <w:family w:val="swiss"/>
     <w:pitch w:val="variable"/>
-    <w:sig w:usb0="E4002EFF" w:usb1="C000247B" w:usb2="00000009" w:usb3="00000000" w:csb0="000001FF" w:csb1="00000000"/>
+    <w:sig w:usb0="E4002EFF" w:usb1="C200247B" w:usb2="00000009" w:usb3="00000000" w:csb0="000001FF" w:csb1="00000000"/>
   </w:font>
   <w:font w:name="Segoe UI">
     <w:panose1 w:val="020B0502040204020203"/>
@@ -10364,12 +11747,16 @@
   </w:compat>
   <w:rsids>
     <w:rsidRoot w:val="004C6E87"/>
+    <w:rsid w:val="0002337C"/>
+    <w:rsid w:val="00067916"/>
     <w:rsid w:val="00077713"/>
     <w:rsid w:val="000B329E"/>
     <w:rsid w:val="000F3AC7"/>
     <w:rsid w:val="001D481F"/>
     <w:rsid w:val="00240D0F"/>
+    <w:rsid w:val="00263237"/>
     <w:rsid w:val="002B578D"/>
+    <w:rsid w:val="00461907"/>
     <w:rsid w:val="004C6E87"/>
     <w:rsid w:val="005402E5"/>
     <w:rsid w:val="0059222A"/>
@@ -10378,12 +11765,19 @@
     <w:rsid w:val="00863566"/>
     <w:rsid w:val="008E0277"/>
     <w:rsid w:val="00927701"/>
+    <w:rsid w:val="00A86E43"/>
     <w:rsid w:val="00A950EE"/>
     <w:rsid w:val="00AD5207"/>
     <w:rsid w:val="00B534F8"/>
     <w:rsid w:val="00C704FB"/>
+    <w:rsid w:val="00CB3445"/>
+    <w:rsid w:val="00CF6848"/>
     <w:rsid w:val="00D2233E"/>
+    <w:rsid w:val="00D6770B"/>
+    <w:rsid w:val="00D678A8"/>
+    <w:rsid w:val="00DD1A81"/>
     <w:rsid w:val="00F56188"/>
+    <w:rsid w:val="00F968A4"/>
   </w:rsids>
   <m:mathPr>
     <m:mathFont m:val="Cambria Math"/>

</xml_diff>

<commit_message>
Added more to the report
+1000 words
</commit_message>
<xml_diff>
--- a/HonoursStageFinal.docx
+++ b/HonoursStageFinal.docx
@@ -107,7 +107,7 @@
         <w:pStyle w:val="UnnumberedHeading1"/>
         <w:jc w:val="both"/>
       </w:pPr>
-      <w:bookmarkStart w:id="0" w:name="_Toc194327696"/>
+      <w:bookmarkStart w:id="0" w:name="_Toc194759756"/>
       <w:r>
         <w:lastRenderedPageBreak/>
         <w:t>Abstract</w:t>
@@ -124,7 +124,7 @@
         <w:pStyle w:val="UnnumberedHeading1"/>
         <w:jc w:val="both"/>
       </w:pPr>
-      <w:bookmarkStart w:id="1" w:name="_Toc194327697"/>
+      <w:bookmarkStart w:id="1" w:name="_Toc194759757"/>
       <w:r>
         <w:lastRenderedPageBreak/>
         <w:t>Acknowledgements</w:t>
@@ -217,7 +217,7 @@
               <w:kern w:val="2"/>
               <w:sz w:val="24"/>
               <w:szCs w:val="24"/>
-              <w:lang w:eastAsia="en-GB"/>
+              <w:lang w:val="en-US"/>
               <w14:ligatures w14:val="standardContextual"/>
             </w:rPr>
           </w:pPr>
@@ -230,7 +230,7 @@
           <w:r>
             <w:fldChar w:fldCharType="separate"/>
           </w:r>
-          <w:hyperlink w:anchor="_Toc194327696" w:history="1">
+          <w:hyperlink w:anchor="_Toc194759756" w:history="1">
             <w:r>
               <w:rPr>
                 <w:rStyle w:val="Hyperlink"/>
@@ -257,7 +257,7 @@
                 <w:noProof/>
                 <w:webHidden/>
               </w:rPr>
-              <w:instrText xml:space="preserve"> PAGEREF _Toc194327696 \h </w:instrText>
+              <w:instrText xml:space="preserve"> PAGEREF _Toc194759756 \h </w:instrText>
             </w:r>
             <w:r>
               <w:rPr>
@@ -300,11 +300,11 @@
               <w:kern w:val="2"/>
               <w:sz w:val="24"/>
               <w:szCs w:val="24"/>
-              <w:lang w:eastAsia="en-GB"/>
+              <w:lang w:val="en-US"/>
               <w14:ligatures w14:val="standardContextual"/>
             </w:rPr>
           </w:pPr>
-          <w:hyperlink w:anchor="_Toc194327697" w:history="1">
+          <w:hyperlink w:anchor="_Toc194759757" w:history="1">
             <w:r>
               <w:rPr>
                 <w:rStyle w:val="Hyperlink"/>
@@ -331,7 +331,7 @@
                 <w:noProof/>
                 <w:webHidden/>
               </w:rPr>
-              <w:instrText xml:space="preserve"> PAGEREF _Toc194327697 \h </w:instrText>
+              <w:instrText xml:space="preserve"> PAGEREF _Toc194759757 \h </w:instrText>
             </w:r>
             <w:r>
               <w:rPr>
@@ -375,11 +375,11 @@
               <w:kern w:val="2"/>
               <w:sz w:val="24"/>
               <w:szCs w:val="24"/>
-              <w:lang w:eastAsia="en-GB"/>
+              <w:lang w:val="en-US"/>
               <w14:ligatures w14:val="standardContextual"/>
             </w:rPr>
           </w:pPr>
-          <w:hyperlink w:anchor="_Toc194327698" w:history="1">
+          <w:hyperlink w:anchor="_Toc194759758" w:history="1">
             <w:r>
               <w:rPr>
                 <w:rStyle w:val="Hyperlink"/>
@@ -394,7 +394,7 @@
                 <w:kern w:val="2"/>
                 <w:sz w:val="24"/>
                 <w:szCs w:val="24"/>
-                <w:lang w:eastAsia="en-GB"/>
+                <w:lang w:val="en-US"/>
                 <w14:ligatures w14:val="standardContextual"/>
               </w:rPr>
               <w:tab/>
@@ -425,7 +425,7 @@
                 <w:noProof/>
                 <w:webHidden/>
               </w:rPr>
-              <w:instrText xml:space="preserve"> PAGEREF _Toc194327698 \h </w:instrText>
+              <w:instrText xml:space="preserve"> PAGEREF _Toc194759758 \h </w:instrText>
             </w:r>
             <w:r>
               <w:rPr>
@@ -469,11 +469,11 @@
               <w:kern w:val="2"/>
               <w:sz w:val="24"/>
               <w:szCs w:val="24"/>
-              <w:lang w:eastAsia="en-GB"/>
+              <w:lang w:val="en-US"/>
               <w14:ligatures w14:val="standardContextual"/>
             </w:rPr>
           </w:pPr>
-          <w:hyperlink w:anchor="_Toc194327699" w:history="1">
+          <w:hyperlink w:anchor="_Toc194759759" w:history="1">
             <w:r>
               <w:rPr>
                 <w:rStyle w:val="Hyperlink"/>
@@ -488,7 +488,7 @@
                 <w:kern w:val="2"/>
                 <w:sz w:val="24"/>
                 <w:szCs w:val="24"/>
-                <w:lang w:eastAsia="en-GB"/>
+                <w:lang w:val="en-US"/>
                 <w14:ligatures w14:val="standardContextual"/>
               </w:rPr>
               <w:tab/>
@@ -519,7 +519,7 @@
                 <w:noProof/>
                 <w:webHidden/>
               </w:rPr>
-              <w:instrText xml:space="preserve"> PAGEREF _Toc194327699 \h </w:instrText>
+              <w:instrText xml:space="preserve"> PAGEREF _Toc194759759 \h </w:instrText>
             </w:r>
             <w:r>
               <w:rPr>
@@ -563,11 +563,11 @@
               <w:kern w:val="2"/>
               <w:sz w:val="24"/>
               <w:szCs w:val="24"/>
-              <w:lang w:eastAsia="en-GB"/>
+              <w:lang w:val="en-US"/>
               <w14:ligatures w14:val="standardContextual"/>
             </w:rPr>
           </w:pPr>
-          <w:hyperlink w:anchor="_Toc194327700" w:history="1">
+          <w:hyperlink w:anchor="_Toc194759760" w:history="1">
             <w:r>
               <w:rPr>
                 <w:rStyle w:val="Hyperlink"/>
@@ -582,7 +582,7 @@
                 <w:kern w:val="2"/>
                 <w:sz w:val="24"/>
                 <w:szCs w:val="24"/>
-                <w:lang w:eastAsia="en-GB"/>
+                <w:lang w:val="en-US"/>
                 <w14:ligatures w14:val="standardContextual"/>
               </w:rPr>
               <w:tab/>
@@ -613,7 +613,7 @@
                 <w:noProof/>
                 <w:webHidden/>
               </w:rPr>
-              <w:instrText xml:space="preserve"> PAGEREF _Toc194327700 \h </w:instrText>
+              <w:instrText xml:space="preserve"> PAGEREF _Toc194759760 \h </w:instrText>
             </w:r>
             <w:r>
               <w:rPr>
@@ -634,6 +634,194 @@
                 <w:webHidden/>
               </w:rPr>
               <w:t>3</w:t>
+            </w:r>
+            <w:r>
+              <w:rPr>
+                <w:noProof/>
+                <w:webHidden/>
+              </w:rPr>
+              <w:fldChar w:fldCharType="end"/>
+            </w:r>
+          </w:hyperlink>
+        </w:p>
+        <w:p>
+          <w:pPr>
+            <w:pStyle w:val="TOC3"/>
+            <w:tabs>
+              <w:tab w:val="left" w:pos="1200"/>
+              <w:tab w:val="right" w:leader="dot" w:pos="9016"/>
+            </w:tabs>
+            <w:rPr>
+              <w:rFonts w:eastAsiaTheme="minorEastAsia"/>
+              <w:noProof/>
+              <w:kern w:val="2"/>
+              <w:sz w:val="24"/>
+              <w:szCs w:val="24"/>
+              <w:lang w:val="en-US"/>
+              <w14:ligatures w14:val="standardContextual"/>
+            </w:rPr>
+          </w:pPr>
+          <w:hyperlink w:anchor="_Toc194759761" w:history="1">
+            <w:r>
+              <w:rPr>
+                <w:rStyle w:val="Hyperlink"/>
+                <w:noProof/>
+              </w:rPr>
+              <w:t>1.2.1</w:t>
+            </w:r>
+            <w:r>
+              <w:rPr>
+                <w:rFonts w:eastAsiaTheme="minorEastAsia"/>
+                <w:noProof/>
+                <w:kern w:val="2"/>
+                <w:sz w:val="24"/>
+                <w:szCs w:val="24"/>
+                <w:lang w:val="en-US"/>
+                <w14:ligatures w14:val="standardContextual"/>
+              </w:rPr>
+              <w:tab/>
+            </w:r>
+            <w:r>
+              <w:rPr>
+                <w:rStyle w:val="Hyperlink"/>
+                <w:noProof/>
+              </w:rPr>
+              <w:t>Aims</w:t>
+            </w:r>
+            <w:r>
+              <w:rPr>
+                <w:noProof/>
+                <w:webHidden/>
+              </w:rPr>
+              <w:tab/>
+            </w:r>
+            <w:r>
+              <w:rPr>
+                <w:noProof/>
+                <w:webHidden/>
+              </w:rPr>
+              <w:fldChar w:fldCharType="begin"/>
+            </w:r>
+            <w:r>
+              <w:rPr>
+                <w:noProof/>
+                <w:webHidden/>
+              </w:rPr>
+              <w:instrText xml:space="preserve"> PAGEREF _Toc194759761 \h </w:instrText>
+            </w:r>
+            <w:r>
+              <w:rPr>
+                <w:noProof/>
+                <w:webHidden/>
+              </w:rPr>
+            </w:r>
+            <w:r>
+              <w:rPr>
+                <w:noProof/>
+                <w:webHidden/>
+              </w:rPr>
+              <w:fldChar w:fldCharType="separate"/>
+            </w:r>
+            <w:r>
+              <w:rPr>
+                <w:noProof/>
+                <w:webHidden/>
+              </w:rPr>
+              <w:t>3</w:t>
+            </w:r>
+            <w:r>
+              <w:rPr>
+                <w:noProof/>
+                <w:webHidden/>
+              </w:rPr>
+              <w:fldChar w:fldCharType="end"/>
+            </w:r>
+          </w:hyperlink>
+        </w:p>
+        <w:p>
+          <w:pPr>
+            <w:pStyle w:val="TOC3"/>
+            <w:tabs>
+              <w:tab w:val="left" w:pos="1200"/>
+              <w:tab w:val="right" w:leader="dot" w:pos="9016"/>
+            </w:tabs>
+            <w:rPr>
+              <w:rFonts w:eastAsiaTheme="minorEastAsia"/>
+              <w:noProof/>
+              <w:kern w:val="2"/>
+              <w:sz w:val="24"/>
+              <w:szCs w:val="24"/>
+              <w:lang w:val="en-US"/>
+              <w14:ligatures w14:val="standardContextual"/>
+            </w:rPr>
+          </w:pPr>
+          <w:hyperlink w:anchor="_Toc194759762" w:history="1">
+            <w:r>
+              <w:rPr>
+                <w:rStyle w:val="Hyperlink"/>
+                <w:noProof/>
+              </w:rPr>
+              <w:t>1.2.2</w:t>
+            </w:r>
+            <w:r>
+              <w:rPr>
+                <w:rFonts w:eastAsiaTheme="minorEastAsia"/>
+                <w:noProof/>
+                <w:kern w:val="2"/>
+                <w:sz w:val="24"/>
+                <w:szCs w:val="24"/>
+                <w:lang w:val="en-US"/>
+                <w14:ligatures w14:val="standardContextual"/>
+              </w:rPr>
+              <w:tab/>
+            </w:r>
+            <w:r>
+              <w:rPr>
+                <w:rStyle w:val="Hyperlink"/>
+                <w:noProof/>
+              </w:rPr>
+              <w:t>Objectives</w:t>
+            </w:r>
+            <w:r>
+              <w:rPr>
+                <w:noProof/>
+                <w:webHidden/>
+              </w:rPr>
+              <w:tab/>
+            </w:r>
+            <w:r>
+              <w:rPr>
+                <w:noProof/>
+                <w:webHidden/>
+              </w:rPr>
+              <w:fldChar w:fldCharType="begin"/>
+            </w:r>
+            <w:r>
+              <w:rPr>
+                <w:noProof/>
+                <w:webHidden/>
+              </w:rPr>
+              <w:instrText xml:space="preserve"> PAGEREF _Toc194759762 \h </w:instrText>
+            </w:r>
+            <w:r>
+              <w:rPr>
+                <w:noProof/>
+                <w:webHidden/>
+              </w:rPr>
+            </w:r>
+            <w:r>
+              <w:rPr>
+                <w:noProof/>
+                <w:webHidden/>
+              </w:rPr>
+              <w:fldChar w:fldCharType="separate"/>
+            </w:r>
+            <w:r>
+              <w:rPr>
+                <w:noProof/>
+                <w:webHidden/>
+              </w:rPr>
+              <w:t>4</w:t>
             </w:r>
             <w:r>
               <w:rPr>
@@ -657,11 +845,11 @@
               <w:kern w:val="2"/>
               <w:sz w:val="24"/>
               <w:szCs w:val="24"/>
-              <w:lang w:eastAsia="en-GB"/>
+              <w:lang w:val="en-US"/>
               <w14:ligatures w14:val="standardContextual"/>
             </w:rPr>
           </w:pPr>
-          <w:hyperlink w:anchor="_Toc194327701" w:history="1">
+          <w:hyperlink w:anchor="_Toc194759763" w:history="1">
             <w:r>
               <w:rPr>
                 <w:rStyle w:val="Hyperlink"/>
@@ -676,7 +864,7 @@
                 <w:kern w:val="2"/>
                 <w:sz w:val="24"/>
                 <w:szCs w:val="24"/>
-                <w:lang w:eastAsia="en-GB"/>
+                <w:lang w:val="en-US"/>
                 <w14:ligatures w14:val="standardContextual"/>
               </w:rPr>
               <w:tab/>
@@ -707,7 +895,7 @@
                 <w:noProof/>
                 <w:webHidden/>
               </w:rPr>
-              <w:instrText xml:space="preserve"> PAGEREF _Toc194327701 \h </w:instrText>
+              <w:instrText xml:space="preserve"> PAGEREF _Toc194759763 \h </w:instrText>
             </w:r>
             <w:r>
               <w:rPr>
@@ -727,7 +915,101 @@
                 <w:noProof/>
                 <w:webHidden/>
               </w:rPr>
-              <w:t>3</w:t>
+              <w:t>4</w:t>
+            </w:r>
+            <w:r>
+              <w:rPr>
+                <w:noProof/>
+                <w:webHidden/>
+              </w:rPr>
+              <w:fldChar w:fldCharType="end"/>
+            </w:r>
+          </w:hyperlink>
+        </w:p>
+        <w:p>
+          <w:pPr>
+            <w:pStyle w:val="TOC2"/>
+            <w:tabs>
+              <w:tab w:val="left" w:pos="960"/>
+              <w:tab w:val="right" w:leader="dot" w:pos="9016"/>
+            </w:tabs>
+            <w:rPr>
+              <w:rFonts w:eastAsiaTheme="minorEastAsia"/>
+              <w:noProof/>
+              <w:kern w:val="2"/>
+              <w:sz w:val="24"/>
+              <w:szCs w:val="24"/>
+              <w:lang w:val="en-US"/>
+              <w14:ligatures w14:val="standardContextual"/>
+            </w:rPr>
+          </w:pPr>
+          <w:hyperlink w:anchor="_Toc194759764" w:history="1">
+            <w:r>
+              <w:rPr>
+                <w:rStyle w:val="Hyperlink"/>
+                <w:noProof/>
+              </w:rPr>
+              <w:t>1.4</w:t>
+            </w:r>
+            <w:r>
+              <w:rPr>
+                <w:rFonts w:eastAsiaTheme="minorEastAsia"/>
+                <w:noProof/>
+                <w:kern w:val="2"/>
+                <w:sz w:val="24"/>
+                <w:szCs w:val="24"/>
+                <w:lang w:val="en-US"/>
+                <w14:ligatures w14:val="standardContextual"/>
+              </w:rPr>
+              <w:tab/>
+            </w:r>
+            <w:r>
+              <w:rPr>
+                <w:rStyle w:val="Hyperlink"/>
+                <w:noProof/>
+              </w:rPr>
+              <w:t>Report structure</w:t>
+            </w:r>
+            <w:r>
+              <w:rPr>
+                <w:noProof/>
+                <w:webHidden/>
+              </w:rPr>
+              <w:tab/>
+            </w:r>
+            <w:r>
+              <w:rPr>
+                <w:noProof/>
+                <w:webHidden/>
+              </w:rPr>
+              <w:fldChar w:fldCharType="begin"/>
+            </w:r>
+            <w:r>
+              <w:rPr>
+                <w:noProof/>
+                <w:webHidden/>
+              </w:rPr>
+              <w:instrText xml:space="preserve"> PAGEREF _Toc194759764 \h </w:instrText>
+            </w:r>
+            <w:r>
+              <w:rPr>
+                <w:noProof/>
+                <w:webHidden/>
+              </w:rPr>
+            </w:r>
+            <w:r>
+              <w:rPr>
+                <w:noProof/>
+                <w:webHidden/>
+              </w:rPr>
+              <w:fldChar w:fldCharType="separate"/>
+            </w:r>
+            <w:r>
+              <w:rPr>
+                <w:noProof/>
+                <w:webHidden/>
+              </w:rPr>
+              <w:t>4</w:t>
             </w:r>
             <w:r>
               <w:rPr>
@@ -751,11 +1033,11 @@
               <w:kern w:val="2"/>
               <w:sz w:val="24"/>
               <w:szCs w:val="24"/>
-              <w:lang w:eastAsia="en-GB"/>
+              <w:lang w:val="en-US"/>
               <w14:ligatures w14:val="standardContextual"/>
             </w:rPr>
           </w:pPr>
-          <w:hyperlink w:anchor="_Toc194327702" w:history="1">
+          <w:hyperlink w:anchor="_Toc194759765" w:history="1">
             <w:r>
               <w:rPr>
                 <w:rStyle w:val="Hyperlink"/>
@@ -770,7 +1052,7 @@
                 <w:kern w:val="2"/>
                 <w:sz w:val="24"/>
                 <w:szCs w:val="24"/>
-                <w:lang w:eastAsia="en-GB"/>
+                <w:lang w:val="en-US"/>
                 <w14:ligatures w14:val="standardContextual"/>
               </w:rPr>
               <w:tab/>
@@ -801,7 +1083,7 @@
                 <w:noProof/>
                 <w:webHidden/>
               </w:rPr>
-              <w:instrText xml:space="preserve"> PAGEREF _Toc194327702 \h </w:instrText>
+              <w:instrText xml:space="preserve"> PAGEREF _Toc194759765 \h </w:instrText>
             </w:r>
             <w:r>
               <w:rPr>
@@ -821,7 +1103,7 @@
                 <w:noProof/>
                 <w:webHidden/>
               </w:rPr>
-              <w:t>4</w:t>
+              <w:t>5</w:t>
             </w:r>
             <w:r>
               <w:rPr>
@@ -845,11 +1127,11 @@
               <w:kern w:val="2"/>
               <w:sz w:val="24"/>
               <w:szCs w:val="24"/>
-              <w:lang w:eastAsia="en-GB"/>
+              <w:lang w:val="en-US"/>
               <w14:ligatures w14:val="standardContextual"/>
             </w:rPr>
           </w:pPr>
-          <w:hyperlink w:anchor="_Toc194327703" w:history="1">
+          <w:hyperlink w:anchor="_Toc194759766" w:history="1">
             <w:r>
               <w:rPr>
                 <w:rStyle w:val="Hyperlink"/>
@@ -864,7 +1146,7 @@
                 <w:kern w:val="2"/>
                 <w:sz w:val="24"/>
                 <w:szCs w:val="24"/>
-                <w:lang w:eastAsia="en-GB"/>
+                <w:lang w:val="en-US"/>
                 <w14:ligatures w14:val="standardContextual"/>
               </w:rPr>
               <w:tab/>
@@ -895,7 +1177,7 @@
                 <w:noProof/>
                 <w:webHidden/>
               </w:rPr>
-              <w:instrText xml:space="preserve"> PAGEREF _Toc194327703 \h </w:instrText>
+              <w:instrText xml:space="preserve"> PAGEREF _Toc194759766 \h </w:instrText>
             </w:r>
             <w:r>
               <w:rPr>
@@ -915,7 +1197,7 @@
                 <w:noProof/>
                 <w:webHidden/>
               </w:rPr>
-              <w:t>4</w:t>
+              <w:t>5</w:t>
             </w:r>
             <w:r>
               <w:rPr>
@@ -939,11 +1221,11 @@
               <w:kern w:val="2"/>
               <w:sz w:val="24"/>
               <w:szCs w:val="24"/>
-              <w:lang w:eastAsia="en-GB"/>
+              <w:lang w:val="en-US"/>
               <w14:ligatures w14:val="standardContextual"/>
             </w:rPr>
           </w:pPr>
-          <w:hyperlink w:anchor="_Toc194327704" w:history="1">
+          <w:hyperlink w:anchor="_Toc194759767" w:history="1">
             <w:r>
               <w:rPr>
                 <w:rStyle w:val="Hyperlink"/>
@@ -958,7 +1240,7 @@
                 <w:kern w:val="2"/>
                 <w:sz w:val="24"/>
                 <w:szCs w:val="24"/>
-                <w:lang w:eastAsia="en-GB"/>
+                <w:lang w:val="en-US"/>
                 <w14:ligatures w14:val="standardContextual"/>
               </w:rPr>
               <w:tab/>
@@ -989,7 +1271,7 @@
                 <w:noProof/>
                 <w:webHidden/>
               </w:rPr>
-              <w:instrText xml:space="preserve"> PAGEREF _Toc194327704 \h </w:instrText>
+              <w:instrText xml:space="preserve"> PAGEREF _Toc194759767 \h </w:instrText>
             </w:r>
             <w:r>
               <w:rPr>
@@ -1009,7 +1291,7 @@
                 <w:noProof/>
                 <w:webHidden/>
               </w:rPr>
-              <w:t>5</w:t>
+              <w:t>6</w:t>
             </w:r>
             <w:r>
               <w:rPr>
@@ -1033,11 +1315,11 @@
               <w:kern w:val="2"/>
               <w:sz w:val="24"/>
               <w:szCs w:val="24"/>
-              <w:lang w:eastAsia="en-GB"/>
+              <w:lang w:val="en-US"/>
               <w14:ligatures w14:val="standardContextual"/>
             </w:rPr>
           </w:pPr>
-          <w:hyperlink w:anchor="_Toc194327705" w:history="1">
+          <w:hyperlink w:anchor="_Toc194759768" w:history="1">
             <w:r>
               <w:rPr>
                 <w:rStyle w:val="Hyperlink"/>
@@ -1052,7 +1334,7 @@
                 <w:kern w:val="2"/>
                 <w:sz w:val="24"/>
                 <w:szCs w:val="24"/>
-                <w:lang w:eastAsia="en-GB"/>
+                <w:lang w:val="en-US"/>
                 <w14:ligatures w14:val="standardContextual"/>
               </w:rPr>
               <w:tab/>
@@ -1083,7 +1365,7 @@
                 <w:noProof/>
                 <w:webHidden/>
               </w:rPr>
-              <w:instrText xml:space="preserve"> PAGEREF _Toc194327705 \h </w:instrText>
+              <w:instrText xml:space="preserve"> PAGEREF _Toc194759768 \h </w:instrText>
             </w:r>
             <w:r>
               <w:rPr>
@@ -1103,7 +1385,7 @@
                 <w:noProof/>
                 <w:webHidden/>
               </w:rPr>
-              <w:t>6</w:t>
+              <w:t>7</w:t>
             </w:r>
             <w:r>
               <w:rPr>
@@ -1127,11 +1409,11 @@
               <w:kern w:val="2"/>
               <w:sz w:val="24"/>
               <w:szCs w:val="24"/>
-              <w:lang w:eastAsia="en-GB"/>
+              <w:lang w:val="en-US"/>
               <w14:ligatures w14:val="standardContextual"/>
             </w:rPr>
           </w:pPr>
-          <w:hyperlink w:anchor="_Toc194327706" w:history="1">
+          <w:hyperlink w:anchor="_Toc194759769" w:history="1">
             <w:r>
               <w:rPr>
                 <w:rStyle w:val="Hyperlink"/>
@@ -1146,7 +1428,7 @@
                 <w:kern w:val="2"/>
                 <w:sz w:val="24"/>
                 <w:szCs w:val="24"/>
-                <w:lang w:eastAsia="en-GB"/>
+                <w:lang w:val="en-US"/>
                 <w14:ligatures w14:val="standardContextual"/>
               </w:rPr>
               <w:tab/>
@@ -1177,7 +1459,7 @@
                 <w:noProof/>
                 <w:webHidden/>
               </w:rPr>
-              <w:instrText xml:space="preserve"> PAGEREF _Toc194327706 \h </w:instrText>
+              <w:instrText xml:space="preserve"> PAGEREF _Toc194759769 \h </w:instrText>
             </w:r>
             <w:r>
               <w:rPr>
@@ -1197,7 +1479,7 @@
                 <w:noProof/>
                 <w:webHidden/>
               </w:rPr>
-              <w:t>6</w:t>
+              <w:t>7</w:t>
             </w:r>
             <w:r>
               <w:rPr>
@@ -1221,11 +1503,11 @@
               <w:kern w:val="2"/>
               <w:sz w:val="24"/>
               <w:szCs w:val="24"/>
-              <w:lang w:eastAsia="en-GB"/>
+              <w:lang w:val="en-US"/>
               <w14:ligatures w14:val="standardContextual"/>
             </w:rPr>
           </w:pPr>
-          <w:hyperlink w:anchor="_Toc194327707" w:history="1">
+          <w:hyperlink w:anchor="_Toc194759770" w:history="1">
             <w:r>
               <w:rPr>
                 <w:rStyle w:val="Hyperlink"/>
@@ -1240,7 +1522,7 @@
                 <w:kern w:val="2"/>
                 <w:sz w:val="24"/>
                 <w:szCs w:val="24"/>
-                <w:lang w:eastAsia="en-GB"/>
+                <w:lang w:val="en-US"/>
                 <w14:ligatures w14:val="standardContextual"/>
               </w:rPr>
               <w:tab/>
@@ -1271,7 +1553,7 @@
                 <w:noProof/>
                 <w:webHidden/>
               </w:rPr>
-              <w:instrText xml:space="preserve"> PAGEREF _Toc194327707 \h </w:instrText>
+              <w:instrText xml:space="preserve"> PAGEREF _Toc194759770 \h </w:instrText>
             </w:r>
             <w:r>
               <w:rPr>
@@ -1291,7 +1573,7 @@
                 <w:noProof/>
                 <w:webHidden/>
               </w:rPr>
-              <w:t>7</w:t>
+              <w:t>8</w:t>
             </w:r>
             <w:r>
               <w:rPr>
@@ -1315,11 +1597,11 @@
               <w:kern w:val="2"/>
               <w:sz w:val="24"/>
               <w:szCs w:val="24"/>
-              <w:lang w:eastAsia="en-GB"/>
+              <w:lang w:val="en-US"/>
               <w14:ligatures w14:val="standardContextual"/>
             </w:rPr>
           </w:pPr>
-          <w:hyperlink w:anchor="_Toc194327708" w:history="1">
+          <w:hyperlink w:anchor="_Toc194759771" w:history="1">
             <w:r>
               <w:rPr>
                 <w:rStyle w:val="Hyperlink"/>
@@ -1334,7 +1616,7 @@
                 <w:kern w:val="2"/>
                 <w:sz w:val="24"/>
                 <w:szCs w:val="24"/>
-                <w:lang w:eastAsia="en-GB"/>
+                <w:lang w:val="en-US"/>
                 <w14:ligatures w14:val="standardContextual"/>
               </w:rPr>
               <w:tab/>
@@ -1365,7 +1647,7 @@
                 <w:noProof/>
                 <w:webHidden/>
               </w:rPr>
-              <w:instrText xml:space="preserve"> PAGEREF _Toc194327708 \h </w:instrText>
+              <w:instrText xml:space="preserve"> PAGEREF _Toc194759771 \h </w:instrText>
             </w:r>
             <w:r>
               <w:rPr>
@@ -1385,7 +1667,7 @@
                 <w:noProof/>
                 <w:webHidden/>
               </w:rPr>
-              <w:t>8</w:t>
+              <w:t>9</w:t>
             </w:r>
             <w:r>
               <w:rPr>
@@ -1409,11 +1691,11 @@
               <w:kern w:val="2"/>
               <w:sz w:val="24"/>
               <w:szCs w:val="24"/>
-              <w:lang w:eastAsia="en-GB"/>
+              <w:lang w:val="en-US"/>
               <w14:ligatures w14:val="standardContextual"/>
             </w:rPr>
           </w:pPr>
-          <w:hyperlink w:anchor="_Toc194327709" w:history="1">
+          <w:hyperlink w:anchor="_Toc194759772" w:history="1">
             <w:r>
               <w:rPr>
                 <w:rStyle w:val="Hyperlink"/>
@@ -1428,7 +1710,7 @@
                 <w:kern w:val="2"/>
                 <w:sz w:val="24"/>
                 <w:szCs w:val="24"/>
-                <w:lang w:eastAsia="en-GB"/>
+                <w:lang w:val="en-US"/>
                 <w14:ligatures w14:val="standardContextual"/>
               </w:rPr>
               <w:tab/>
@@ -1438,7 +1720,7 @@
                 <w:rStyle w:val="Hyperlink"/>
                 <w:noProof/>
               </w:rPr>
-              <w:t>Functional requirements</w:t>
+              <w:t>System requirements</w:t>
             </w:r>
             <w:r>
               <w:rPr>
@@ -1459,7 +1741,7 @@
                 <w:noProof/>
                 <w:webHidden/>
               </w:rPr>
-              <w:instrText xml:space="preserve"> PAGEREF _Toc194327709 \h </w:instrText>
+              <w:instrText xml:space="preserve"> PAGEREF _Toc194759772 \h </w:instrText>
             </w:r>
             <w:r>
               <w:rPr>
@@ -1479,7 +1761,7 @@
                 <w:noProof/>
                 <w:webHidden/>
               </w:rPr>
-              <w:t>8</w:t>
+              <w:t>9</w:t>
             </w:r>
             <w:r>
               <w:rPr>
@@ -1503,11 +1785,11 @@
               <w:kern w:val="2"/>
               <w:sz w:val="24"/>
               <w:szCs w:val="24"/>
-              <w:lang w:eastAsia="en-GB"/>
+              <w:lang w:val="en-US"/>
               <w14:ligatures w14:val="standardContextual"/>
             </w:rPr>
           </w:pPr>
-          <w:hyperlink w:anchor="_Toc194327710" w:history="1">
+          <w:hyperlink w:anchor="_Toc194759773" w:history="1">
             <w:r>
               <w:rPr>
                 <w:rStyle w:val="Hyperlink"/>
@@ -1522,7 +1804,7 @@
                 <w:kern w:val="2"/>
                 <w:sz w:val="24"/>
                 <w:szCs w:val="24"/>
-                <w:lang w:eastAsia="en-GB"/>
+                <w:lang w:val="en-US"/>
                 <w14:ligatures w14:val="standardContextual"/>
               </w:rPr>
               <w:tab/>
@@ -1532,7 +1814,7 @@
                 <w:rStyle w:val="Hyperlink"/>
                 <w:noProof/>
               </w:rPr>
-              <w:t>Non-Functional requirements</w:t>
+              <w:t>Dataset requirements</w:t>
             </w:r>
             <w:r>
               <w:rPr>
@@ -1553,7 +1835,7 @@
                 <w:noProof/>
                 <w:webHidden/>
               </w:rPr>
-              <w:instrText xml:space="preserve"> PAGEREF _Toc194327710 \h </w:instrText>
+              <w:instrText xml:space="preserve"> PAGEREF _Toc194759773 \h </w:instrText>
             </w:r>
             <w:r>
               <w:rPr>
@@ -1573,7 +1855,7 @@
                 <w:noProof/>
                 <w:webHidden/>
               </w:rPr>
-              <w:t>8</w:t>
+              <w:t>9</w:t>
             </w:r>
             <w:r>
               <w:rPr>
@@ -1597,11 +1879,11 @@
               <w:kern w:val="2"/>
               <w:sz w:val="24"/>
               <w:szCs w:val="24"/>
-              <w:lang w:eastAsia="en-GB"/>
+              <w:lang w:val="en-US"/>
               <w14:ligatures w14:val="standardContextual"/>
             </w:rPr>
           </w:pPr>
-          <w:hyperlink w:anchor="_Toc194327711" w:history="1">
+          <w:hyperlink w:anchor="_Toc194759774" w:history="1">
             <w:r>
               <w:rPr>
                 <w:rStyle w:val="Hyperlink"/>
@@ -1616,7 +1898,7 @@
                 <w:kern w:val="2"/>
                 <w:sz w:val="24"/>
                 <w:szCs w:val="24"/>
-                <w:lang w:eastAsia="en-GB"/>
+                <w:lang w:val="en-US"/>
                 <w14:ligatures w14:val="standardContextual"/>
               </w:rPr>
               <w:tab/>
@@ -1626,6 +1908,288 @@
                 <w:rStyle w:val="Hyperlink"/>
                 <w:noProof/>
               </w:rPr>
+              <w:t>Input requirements</w:t>
+            </w:r>
+            <w:r>
+              <w:rPr>
+                <w:noProof/>
+                <w:webHidden/>
+              </w:rPr>
+              <w:tab/>
+            </w:r>
+            <w:r>
+              <w:rPr>
+                <w:noProof/>
+                <w:webHidden/>
+              </w:rPr>
+              <w:fldChar w:fldCharType="begin"/>
+            </w:r>
+            <w:r>
+              <w:rPr>
+                <w:noProof/>
+                <w:webHidden/>
+              </w:rPr>
+              <w:instrText xml:space="preserve"> PAGEREF _Toc194759774 \h </w:instrText>
+            </w:r>
+            <w:r>
+              <w:rPr>
+                <w:noProof/>
+                <w:webHidden/>
+              </w:rPr>
+            </w:r>
+            <w:r>
+              <w:rPr>
+                <w:noProof/>
+                <w:webHidden/>
+              </w:rPr>
+              <w:fldChar w:fldCharType="separate"/>
+            </w:r>
+            <w:r>
+              <w:rPr>
+                <w:noProof/>
+                <w:webHidden/>
+              </w:rPr>
+              <w:t>9</w:t>
+            </w:r>
+            <w:r>
+              <w:rPr>
+                <w:noProof/>
+                <w:webHidden/>
+              </w:rPr>
+              <w:fldChar w:fldCharType="end"/>
+            </w:r>
+          </w:hyperlink>
+        </w:p>
+        <w:p>
+          <w:pPr>
+            <w:pStyle w:val="TOC2"/>
+            <w:tabs>
+              <w:tab w:val="left" w:pos="960"/>
+              <w:tab w:val="right" w:leader="dot" w:pos="9016"/>
+            </w:tabs>
+            <w:rPr>
+              <w:rFonts w:eastAsiaTheme="minorEastAsia"/>
+              <w:noProof/>
+              <w:kern w:val="2"/>
+              <w:sz w:val="24"/>
+              <w:szCs w:val="24"/>
+              <w:lang w:val="en-US"/>
+              <w14:ligatures w14:val="standardContextual"/>
+            </w:rPr>
+          </w:pPr>
+          <w:hyperlink w:anchor="_Toc194759775" w:history="1">
+            <w:r>
+              <w:rPr>
+                <w:rStyle w:val="Hyperlink"/>
+                <w:noProof/>
+              </w:rPr>
+              <w:t>3.4</w:t>
+            </w:r>
+            <w:r>
+              <w:rPr>
+                <w:rFonts w:eastAsiaTheme="minorEastAsia"/>
+                <w:noProof/>
+                <w:kern w:val="2"/>
+                <w:sz w:val="24"/>
+                <w:szCs w:val="24"/>
+                <w:lang w:val="en-US"/>
+                <w14:ligatures w14:val="standardContextual"/>
+              </w:rPr>
+              <w:tab/>
+            </w:r>
+            <w:r>
+              <w:rPr>
+                <w:rStyle w:val="Hyperlink"/>
+                <w:noProof/>
+              </w:rPr>
+              <w:t>Model Requirements</w:t>
+            </w:r>
+            <w:r>
+              <w:rPr>
+                <w:noProof/>
+                <w:webHidden/>
+              </w:rPr>
+              <w:tab/>
+            </w:r>
+            <w:r>
+              <w:rPr>
+                <w:noProof/>
+                <w:webHidden/>
+              </w:rPr>
+              <w:fldChar w:fldCharType="begin"/>
+            </w:r>
+            <w:r>
+              <w:rPr>
+                <w:noProof/>
+                <w:webHidden/>
+              </w:rPr>
+              <w:instrText xml:space="preserve"> PAGEREF _Toc194759775 \h </w:instrText>
+            </w:r>
+            <w:r>
+              <w:rPr>
+                <w:noProof/>
+                <w:webHidden/>
+              </w:rPr>
+            </w:r>
+            <w:r>
+              <w:rPr>
+                <w:noProof/>
+                <w:webHidden/>
+              </w:rPr>
+              <w:fldChar w:fldCharType="separate"/>
+            </w:r>
+            <w:r>
+              <w:rPr>
+                <w:noProof/>
+                <w:webHidden/>
+              </w:rPr>
+              <w:t>9</w:t>
+            </w:r>
+            <w:r>
+              <w:rPr>
+                <w:noProof/>
+                <w:webHidden/>
+              </w:rPr>
+              <w:fldChar w:fldCharType="end"/>
+            </w:r>
+          </w:hyperlink>
+        </w:p>
+        <w:p>
+          <w:pPr>
+            <w:pStyle w:val="TOC2"/>
+            <w:tabs>
+              <w:tab w:val="left" w:pos="960"/>
+              <w:tab w:val="right" w:leader="dot" w:pos="9016"/>
+            </w:tabs>
+            <w:rPr>
+              <w:rFonts w:eastAsiaTheme="minorEastAsia"/>
+              <w:noProof/>
+              <w:kern w:val="2"/>
+              <w:sz w:val="24"/>
+              <w:szCs w:val="24"/>
+              <w:lang w:val="en-US"/>
+              <w14:ligatures w14:val="standardContextual"/>
+            </w:rPr>
+          </w:pPr>
+          <w:hyperlink w:anchor="_Toc194759776" w:history="1">
+            <w:r>
+              <w:rPr>
+                <w:rStyle w:val="Hyperlink"/>
+                <w:noProof/>
+              </w:rPr>
+              <w:t>3.5</w:t>
+            </w:r>
+            <w:r>
+              <w:rPr>
+                <w:rFonts w:eastAsiaTheme="minorEastAsia"/>
+                <w:noProof/>
+                <w:kern w:val="2"/>
+                <w:sz w:val="24"/>
+                <w:szCs w:val="24"/>
+                <w:lang w:val="en-US"/>
+                <w14:ligatures w14:val="standardContextual"/>
+              </w:rPr>
+              <w:tab/>
+            </w:r>
+            <w:r>
+              <w:rPr>
+                <w:rStyle w:val="Hyperlink"/>
+                <w:noProof/>
+              </w:rPr>
+              <w:t>Interface requirements</w:t>
+            </w:r>
+            <w:r>
+              <w:rPr>
+                <w:noProof/>
+                <w:webHidden/>
+              </w:rPr>
+              <w:tab/>
+            </w:r>
+            <w:r>
+              <w:rPr>
+                <w:noProof/>
+                <w:webHidden/>
+              </w:rPr>
+              <w:fldChar w:fldCharType="begin"/>
+            </w:r>
+            <w:r>
+              <w:rPr>
+                <w:noProof/>
+                <w:webHidden/>
+              </w:rPr>
+              <w:instrText xml:space="preserve"> PAGEREF _Toc194759776 \h </w:instrText>
+            </w:r>
+            <w:r>
+              <w:rPr>
+                <w:noProof/>
+                <w:webHidden/>
+              </w:rPr>
+            </w:r>
+            <w:r>
+              <w:rPr>
+                <w:noProof/>
+                <w:webHidden/>
+              </w:rPr>
+              <w:fldChar w:fldCharType="separate"/>
+            </w:r>
+            <w:r>
+              <w:rPr>
+                <w:noProof/>
+                <w:webHidden/>
+              </w:rPr>
+              <w:t>9</w:t>
+            </w:r>
+            <w:r>
+              <w:rPr>
+                <w:noProof/>
+                <w:webHidden/>
+              </w:rPr>
+              <w:fldChar w:fldCharType="end"/>
+            </w:r>
+          </w:hyperlink>
+        </w:p>
+        <w:p>
+          <w:pPr>
+            <w:pStyle w:val="TOC2"/>
+            <w:tabs>
+              <w:tab w:val="left" w:pos="960"/>
+              <w:tab w:val="right" w:leader="dot" w:pos="9016"/>
+            </w:tabs>
+            <w:rPr>
+              <w:rFonts w:eastAsiaTheme="minorEastAsia"/>
+              <w:noProof/>
+              <w:kern w:val="2"/>
+              <w:sz w:val="24"/>
+              <w:szCs w:val="24"/>
+              <w:lang w:val="en-US"/>
+              <w14:ligatures w14:val="standardContextual"/>
+            </w:rPr>
+          </w:pPr>
+          <w:hyperlink w:anchor="_Toc194759777" w:history="1">
+            <w:r>
+              <w:rPr>
+                <w:rStyle w:val="Hyperlink"/>
+                <w:noProof/>
+              </w:rPr>
+              <w:t>3.6</w:t>
+            </w:r>
+            <w:r>
+              <w:rPr>
+                <w:rFonts w:eastAsiaTheme="minorEastAsia"/>
+                <w:noProof/>
+                <w:kern w:val="2"/>
+                <w:sz w:val="24"/>
+                <w:szCs w:val="24"/>
+                <w:lang w:val="en-US"/>
+                <w14:ligatures w14:val="standardContextual"/>
+              </w:rPr>
+              <w:tab/>
+            </w:r>
+            <w:r>
+              <w:rPr>
+                <w:rStyle w:val="Hyperlink"/>
+                <w:noProof/>
+              </w:rPr>
               <w:t>Design constraints</w:t>
             </w:r>
             <w:r>
@@ -1647,7 +2211,7 @@
                 <w:noProof/>
                 <w:webHidden/>
               </w:rPr>
-              <w:instrText xml:space="preserve"> PAGEREF _Toc194327711 \h </w:instrText>
+              <w:instrText xml:space="preserve"> PAGEREF _Toc194759777 \h </w:instrText>
             </w:r>
             <w:r>
               <w:rPr>
@@ -1667,7 +2231,7 @@
                 <w:noProof/>
                 <w:webHidden/>
               </w:rPr>
-              <w:t>8</w:t>
+              <w:t>10</w:t>
             </w:r>
             <w:r>
               <w:rPr>
@@ -1691,11 +2255,11 @@
               <w:kern w:val="2"/>
               <w:sz w:val="24"/>
               <w:szCs w:val="24"/>
-              <w:lang w:eastAsia="en-GB"/>
+              <w:lang w:val="en-US"/>
               <w14:ligatures w14:val="standardContextual"/>
             </w:rPr>
           </w:pPr>
-          <w:hyperlink w:anchor="_Toc194327712" w:history="1">
+          <w:hyperlink w:anchor="_Toc194759778" w:history="1">
             <w:r>
               <w:rPr>
                 <w:rStyle w:val="Hyperlink"/>
@@ -1710,7 +2274,7 @@
                 <w:kern w:val="2"/>
                 <w:sz w:val="24"/>
                 <w:szCs w:val="24"/>
-                <w:lang w:eastAsia="en-GB"/>
+                <w:lang w:val="en-US"/>
                 <w14:ligatures w14:val="standardContextual"/>
               </w:rPr>
               <w:tab/>
@@ -1741,7 +2305,7 @@
                 <w:noProof/>
                 <w:webHidden/>
               </w:rPr>
-              <w:instrText xml:space="preserve"> PAGEREF _Toc194327712 \h </w:instrText>
+              <w:instrText xml:space="preserve"> PAGEREF _Toc194759778 \h </w:instrText>
             </w:r>
             <w:r>
               <w:rPr>
@@ -1761,7 +2325,7 @@
                 <w:noProof/>
                 <w:webHidden/>
               </w:rPr>
-              <w:t>9</w:t>
+              <w:t>11</w:t>
             </w:r>
             <w:r>
               <w:rPr>
@@ -1785,11 +2349,11 @@
               <w:kern w:val="2"/>
               <w:sz w:val="24"/>
               <w:szCs w:val="24"/>
-              <w:lang w:eastAsia="en-GB"/>
+              <w:lang w:val="en-US"/>
               <w14:ligatures w14:val="standardContextual"/>
             </w:rPr>
           </w:pPr>
-          <w:hyperlink w:anchor="_Toc194327713" w:history="1">
+          <w:hyperlink w:anchor="_Toc194759779" w:history="1">
             <w:r>
               <w:rPr>
                 <w:rStyle w:val="Hyperlink"/>
@@ -1804,7 +2368,7 @@
                 <w:kern w:val="2"/>
                 <w:sz w:val="24"/>
                 <w:szCs w:val="24"/>
-                <w:lang w:eastAsia="en-GB"/>
+                <w:lang w:val="en-US"/>
                 <w14:ligatures w14:val="standardContextual"/>
               </w:rPr>
               <w:tab/>
@@ -1814,7 +2378,7 @@
                 <w:rStyle w:val="Hyperlink"/>
                 <w:noProof/>
               </w:rPr>
-              <w:t>Software design</w:t>
+              <w:t>Dataset design</w:t>
             </w:r>
             <w:r>
               <w:rPr>
@@ -1835,7 +2399,7 @@
                 <w:noProof/>
                 <w:webHidden/>
               </w:rPr>
-              <w:instrText xml:space="preserve"> PAGEREF _Toc194327713 \h </w:instrText>
+              <w:instrText xml:space="preserve"> PAGEREF _Toc194759779 \h </w:instrText>
             </w:r>
             <w:r>
               <w:rPr>
@@ -1855,7 +2419,7 @@
                 <w:noProof/>
                 <w:webHidden/>
               </w:rPr>
-              <w:t>9</w:t>
+              <w:t>11</w:t>
             </w:r>
             <w:r>
               <w:rPr>
@@ -1879,11 +2443,11 @@
               <w:kern w:val="2"/>
               <w:sz w:val="24"/>
               <w:szCs w:val="24"/>
-              <w:lang w:eastAsia="en-GB"/>
+              <w:lang w:val="en-US"/>
               <w14:ligatures w14:val="standardContextual"/>
             </w:rPr>
           </w:pPr>
-          <w:hyperlink w:anchor="_Toc194327714" w:history="1">
+          <w:hyperlink w:anchor="_Toc194759780" w:history="1">
             <w:r>
               <w:rPr>
                 <w:rStyle w:val="Hyperlink"/>
@@ -1898,7 +2462,7 @@
                 <w:kern w:val="2"/>
                 <w:sz w:val="24"/>
                 <w:szCs w:val="24"/>
-                <w:lang w:eastAsia="en-GB"/>
+                <w:lang w:val="en-US"/>
                 <w14:ligatures w14:val="standardContextual"/>
               </w:rPr>
               <w:tab/>
@@ -1908,7 +2472,7 @@
                 <w:rStyle w:val="Hyperlink"/>
                 <w:noProof/>
               </w:rPr>
-              <w:t>Experimental design</w:t>
+              <w:t>Interface design</w:t>
             </w:r>
             <w:r>
               <w:rPr>
@@ -1929,7 +2493,7 @@
                 <w:noProof/>
                 <w:webHidden/>
               </w:rPr>
-              <w:instrText xml:space="preserve"> PAGEREF _Toc194327714 \h </w:instrText>
+              <w:instrText xml:space="preserve"> PAGEREF _Toc194759780 \h </w:instrText>
             </w:r>
             <w:r>
               <w:rPr>
@@ -1949,7 +2513,7 @@
                 <w:noProof/>
                 <w:webHidden/>
               </w:rPr>
-              <w:t>9</w:t>
+              <w:t>11</w:t>
             </w:r>
             <w:r>
               <w:rPr>
@@ -1973,11 +2537,11 @@
               <w:kern w:val="2"/>
               <w:sz w:val="24"/>
               <w:szCs w:val="24"/>
-              <w:lang w:eastAsia="en-GB"/>
+              <w:lang w:val="en-US"/>
               <w14:ligatures w14:val="standardContextual"/>
             </w:rPr>
           </w:pPr>
-          <w:hyperlink w:anchor="_Toc194327715" w:history="1">
+          <w:hyperlink w:anchor="_Toc194759781" w:history="1">
             <w:r>
               <w:rPr>
                 <w:rStyle w:val="Hyperlink"/>
@@ -1992,7 +2556,7 @@
                 <w:kern w:val="2"/>
                 <w:sz w:val="24"/>
                 <w:szCs w:val="24"/>
-                <w:lang w:eastAsia="en-GB"/>
+                <w:lang w:val="en-US"/>
                 <w14:ligatures w14:val="standardContextual"/>
               </w:rPr>
               <w:tab/>
@@ -2023,7 +2587,7 @@
                 <w:noProof/>
                 <w:webHidden/>
               </w:rPr>
-              <w:instrText xml:space="preserve"> PAGEREF _Toc194327715 \h </w:instrText>
+              <w:instrText xml:space="preserve"> PAGEREF _Toc194759781 \h </w:instrText>
             </w:r>
             <w:r>
               <w:rPr>
@@ -2043,7 +2607,7 @@
                 <w:noProof/>
                 <w:webHidden/>
               </w:rPr>
-              <w:t>10</w:t>
+              <w:t>15</w:t>
             </w:r>
             <w:r>
               <w:rPr>
@@ -2067,11 +2631,11 @@
               <w:kern w:val="2"/>
               <w:sz w:val="24"/>
               <w:szCs w:val="24"/>
-              <w:lang w:eastAsia="en-GB"/>
+              <w:lang w:val="en-US"/>
               <w14:ligatures w14:val="standardContextual"/>
             </w:rPr>
           </w:pPr>
-          <w:hyperlink w:anchor="_Toc194327716" w:history="1">
+          <w:hyperlink w:anchor="_Toc194759782" w:history="1">
             <w:r>
               <w:rPr>
                 <w:rStyle w:val="Hyperlink"/>
@@ -2086,7 +2650,7 @@
                 <w:kern w:val="2"/>
                 <w:sz w:val="24"/>
                 <w:szCs w:val="24"/>
-                <w:lang w:eastAsia="en-GB"/>
+                <w:lang w:val="en-US"/>
                 <w14:ligatures w14:val="standardContextual"/>
               </w:rPr>
               <w:tab/>
@@ -2117,7 +2681,7 @@
                 <w:noProof/>
                 <w:webHidden/>
               </w:rPr>
-              <w:instrText xml:space="preserve"> PAGEREF _Toc194327716 \h </w:instrText>
+              <w:instrText xml:space="preserve"> PAGEREF _Toc194759782 \h </w:instrText>
             </w:r>
             <w:r>
               <w:rPr>
@@ -2137,7 +2701,7 @@
                 <w:noProof/>
                 <w:webHidden/>
               </w:rPr>
-              <w:t>10</w:t>
+              <w:t>15</w:t>
             </w:r>
             <w:r>
               <w:rPr>
@@ -2161,11 +2725,11 @@
               <w:kern w:val="2"/>
               <w:sz w:val="24"/>
               <w:szCs w:val="24"/>
-              <w:lang w:eastAsia="en-GB"/>
+              <w:lang w:val="en-US"/>
               <w14:ligatures w14:val="standardContextual"/>
             </w:rPr>
           </w:pPr>
-          <w:hyperlink w:anchor="_Toc194327717" w:history="1">
+          <w:hyperlink w:anchor="_Toc194759783" w:history="1">
             <w:r>
               <w:rPr>
                 <w:rStyle w:val="Hyperlink"/>
@@ -2180,7 +2744,7 @@
                 <w:kern w:val="2"/>
                 <w:sz w:val="24"/>
                 <w:szCs w:val="24"/>
-                <w:lang w:eastAsia="en-GB"/>
+                <w:lang w:val="en-US"/>
                 <w14:ligatures w14:val="standardContextual"/>
               </w:rPr>
               <w:tab/>
@@ -2211,7 +2775,7 @@
                 <w:noProof/>
                 <w:webHidden/>
               </w:rPr>
-              <w:instrText xml:space="preserve"> PAGEREF _Toc194327717 \h </w:instrText>
+              <w:instrText xml:space="preserve"> PAGEREF _Toc194759783 \h </w:instrText>
             </w:r>
             <w:r>
               <w:rPr>
@@ -2231,7 +2795,7 @@
                 <w:noProof/>
                 <w:webHidden/>
               </w:rPr>
-              <w:t>10</w:t>
+              <w:t>15</w:t>
             </w:r>
             <w:r>
               <w:rPr>
@@ -2255,11 +2819,11 @@
               <w:kern w:val="2"/>
               <w:sz w:val="24"/>
               <w:szCs w:val="24"/>
-              <w:lang w:eastAsia="en-GB"/>
+              <w:lang w:val="en-US"/>
               <w14:ligatures w14:val="standardContextual"/>
             </w:rPr>
           </w:pPr>
-          <w:hyperlink w:anchor="_Toc194327718" w:history="1">
+          <w:hyperlink w:anchor="_Toc194759784" w:history="1">
             <w:r>
               <w:rPr>
                 <w:rStyle w:val="Hyperlink"/>
@@ -2274,7 +2838,7 @@
                 <w:kern w:val="2"/>
                 <w:sz w:val="24"/>
                 <w:szCs w:val="24"/>
-                <w:lang w:eastAsia="en-GB"/>
+                <w:lang w:val="en-US"/>
                 <w14:ligatures w14:val="standardContextual"/>
               </w:rPr>
               <w:tab/>
@@ -2305,7 +2869,7 @@
                 <w:noProof/>
                 <w:webHidden/>
               </w:rPr>
-              <w:instrText xml:space="preserve"> PAGEREF _Toc194327718 \h </w:instrText>
+              <w:instrText xml:space="preserve"> PAGEREF _Toc194759784 \h </w:instrText>
             </w:r>
             <w:r>
               <w:rPr>
@@ -2325,7 +2889,7 @@
                 <w:noProof/>
                 <w:webHidden/>
               </w:rPr>
-              <w:t>10</w:t>
+              <w:t>15</w:t>
             </w:r>
             <w:r>
               <w:rPr>
@@ -2349,11 +2913,11 @@
               <w:kern w:val="2"/>
               <w:sz w:val="24"/>
               <w:szCs w:val="24"/>
-              <w:lang w:eastAsia="en-GB"/>
+              <w:lang w:val="en-US"/>
               <w14:ligatures w14:val="standardContextual"/>
             </w:rPr>
           </w:pPr>
-          <w:hyperlink w:anchor="_Toc194327719" w:history="1">
+          <w:hyperlink w:anchor="_Toc194759785" w:history="1">
             <w:r>
               <w:rPr>
                 <w:rStyle w:val="Hyperlink"/>
@@ -2368,7 +2932,7 @@
                 <w:kern w:val="2"/>
                 <w:sz w:val="24"/>
                 <w:szCs w:val="24"/>
-                <w:lang w:eastAsia="en-GB"/>
+                <w:lang w:val="en-US"/>
                 <w14:ligatures w14:val="standardContextual"/>
               </w:rPr>
               <w:tab/>
@@ -2399,7 +2963,7 @@
                 <w:noProof/>
                 <w:webHidden/>
               </w:rPr>
-              <w:instrText xml:space="preserve"> PAGEREF _Toc194327719 \h </w:instrText>
+              <w:instrText xml:space="preserve"> PAGEREF _Toc194759785 \h </w:instrText>
             </w:r>
             <w:r>
               <w:rPr>
@@ -2419,7 +2983,7 @@
                 <w:noProof/>
                 <w:webHidden/>
               </w:rPr>
-              <w:t>10</w:t>
+              <w:t>16</w:t>
             </w:r>
             <w:r>
               <w:rPr>
@@ -2443,11 +3007,11 @@
               <w:kern w:val="2"/>
               <w:sz w:val="24"/>
               <w:szCs w:val="24"/>
-              <w:lang w:eastAsia="en-GB"/>
+              <w:lang w:val="en-US"/>
               <w14:ligatures w14:val="standardContextual"/>
             </w:rPr>
           </w:pPr>
-          <w:hyperlink w:anchor="_Toc194327720" w:history="1">
+          <w:hyperlink w:anchor="_Toc194759786" w:history="1">
             <w:r>
               <w:rPr>
                 <w:rStyle w:val="Hyperlink"/>
@@ -2462,7 +3026,7 @@
                 <w:kern w:val="2"/>
                 <w:sz w:val="24"/>
                 <w:szCs w:val="24"/>
-                <w:lang w:eastAsia="en-GB"/>
+                <w:lang w:val="en-US"/>
                 <w14:ligatures w14:val="standardContextual"/>
               </w:rPr>
               <w:tab/>
@@ -2493,7 +3057,7 @@
                 <w:noProof/>
                 <w:webHidden/>
               </w:rPr>
-              <w:instrText xml:space="preserve"> PAGEREF _Toc194327720 \h </w:instrText>
+              <w:instrText xml:space="preserve"> PAGEREF _Toc194759786 \h </w:instrText>
             </w:r>
             <w:r>
               <w:rPr>
@@ -2513,7 +3077,7 @@
                 <w:noProof/>
                 <w:webHidden/>
               </w:rPr>
-              <w:t>11</w:t>
+              <w:t>17</w:t>
             </w:r>
             <w:r>
               <w:rPr>
@@ -2537,11 +3101,11 @@
               <w:kern w:val="2"/>
               <w:sz w:val="24"/>
               <w:szCs w:val="24"/>
-              <w:lang w:eastAsia="en-GB"/>
+              <w:lang w:val="en-US"/>
               <w14:ligatures w14:val="standardContextual"/>
             </w:rPr>
           </w:pPr>
-          <w:hyperlink w:anchor="_Toc194327721" w:history="1">
+          <w:hyperlink w:anchor="_Toc194759787" w:history="1">
             <w:r>
               <w:rPr>
                 <w:rStyle w:val="Hyperlink"/>
@@ -2556,7 +3120,7 @@
                 <w:kern w:val="2"/>
                 <w:sz w:val="24"/>
                 <w:szCs w:val="24"/>
-                <w:lang w:eastAsia="en-GB"/>
+                <w:lang w:val="en-US"/>
                 <w14:ligatures w14:val="standardContextual"/>
               </w:rPr>
               <w:tab/>
@@ -2587,7 +3151,7 @@
                 <w:noProof/>
                 <w:webHidden/>
               </w:rPr>
-              <w:instrText xml:space="preserve"> PAGEREF _Toc194327721 \h </w:instrText>
+              <w:instrText xml:space="preserve"> PAGEREF _Toc194759787 \h </w:instrText>
             </w:r>
             <w:r>
               <w:rPr>
@@ -2607,7 +3171,7 @@
                 <w:noProof/>
                 <w:webHidden/>
               </w:rPr>
-              <w:t>11</w:t>
+              <w:t>18</w:t>
             </w:r>
             <w:r>
               <w:rPr>
@@ -2631,11 +3195,11 @@
               <w:kern w:val="2"/>
               <w:sz w:val="24"/>
               <w:szCs w:val="24"/>
-              <w:lang w:eastAsia="en-GB"/>
+              <w:lang w:val="en-US"/>
               <w14:ligatures w14:val="standardContextual"/>
             </w:rPr>
           </w:pPr>
-          <w:hyperlink w:anchor="_Toc194327722" w:history="1">
+          <w:hyperlink w:anchor="_Toc194759788" w:history="1">
             <w:r>
               <w:rPr>
                 <w:rStyle w:val="Hyperlink"/>
@@ -2650,7 +3214,7 @@
                 <w:kern w:val="2"/>
                 <w:sz w:val="24"/>
                 <w:szCs w:val="24"/>
-                <w:lang w:eastAsia="en-GB"/>
+                <w:lang w:val="en-US"/>
                 <w14:ligatures w14:val="standardContextual"/>
               </w:rPr>
               <w:tab/>
@@ -2681,7 +3245,7 @@
                 <w:noProof/>
                 <w:webHidden/>
               </w:rPr>
-              <w:instrText xml:space="preserve"> PAGEREF _Toc194327722 \h </w:instrText>
+              <w:instrText xml:space="preserve"> PAGEREF _Toc194759788 \h </w:instrText>
             </w:r>
             <w:r>
               <w:rPr>
@@ -2701,7 +3265,7 @@
                 <w:noProof/>
                 <w:webHidden/>
               </w:rPr>
-              <w:t>11</w:t>
+              <w:t>18</w:t>
             </w:r>
             <w:r>
               <w:rPr>
@@ -2725,11 +3289,11 @@
               <w:kern w:val="2"/>
               <w:sz w:val="24"/>
               <w:szCs w:val="24"/>
-              <w:lang w:eastAsia="en-GB"/>
+              <w:lang w:val="en-US"/>
               <w14:ligatures w14:val="standardContextual"/>
             </w:rPr>
           </w:pPr>
-          <w:hyperlink w:anchor="_Toc194327723" w:history="1">
+          <w:hyperlink w:anchor="_Toc194759789" w:history="1">
             <w:r>
               <w:rPr>
                 <w:rStyle w:val="Hyperlink"/>
@@ -2744,7 +3308,7 @@
                 <w:kern w:val="2"/>
                 <w:sz w:val="24"/>
                 <w:szCs w:val="24"/>
-                <w:lang w:eastAsia="en-GB"/>
+                <w:lang w:val="en-US"/>
                 <w14:ligatures w14:val="standardContextual"/>
               </w:rPr>
               <w:tab/>
@@ -2775,7 +3339,7 @@
                 <w:noProof/>
                 <w:webHidden/>
               </w:rPr>
-              <w:instrText xml:space="preserve"> PAGEREF _Toc194327723 \h </w:instrText>
+              <w:instrText xml:space="preserve"> PAGEREF _Toc194759789 \h </w:instrText>
             </w:r>
             <w:r>
               <w:rPr>
@@ -2795,7 +3359,7 @@
                 <w:noProof/>
                 <w:webHidden/>
               </w:rPr>
-              <w:t>11</w:t>
+              <w:t>18</w:t>
             </w:r>
             <w:r>
               <w:rPr>
@@ -2819,11 +3383,11 @@
               <w:kern w:val="2"/>
               <w:sz w:val="24"/>
               <w:szCs w:val="24"/>
-              <w:lang w:eastAsia="en-GB"/>
+              <w:lang w:val="en-US"/>
               <w14:ligatures w14:val="standardContextual"/>
             </w:rPr>
           </w:pPr>
-          <w:hyperlink w:anchor="_Toc194327724" w:history="1">
+          <w:hyperlink w:anchor="_Toc194759790" w:history="1">
             <w:r>
               <w:rPr>
                 <w:rStyle w:val="Hyperlink"/>
@@ -2838,7 +3402,7 @@
                 <w:kern w:val="2"/>
                 <w:sz w:val="24"/>
                 <w:szCs w:val="24"/>
-                <w:lang w:eastAsia="en-GB"/>
+                <w:lang w:val="en-US"/>
                 <w14:ligatures w14:val="standardContextual"/>
               </w:rPr>
               <w:tab/>
@@ -2869,7 +3433,7 @@
                 <w:noProof/>
                 <w:webHidden/>
               </w:rPr>
-              <w:instrText xml:space="preserve"> PAGEREF _Toc194327724 \h </w:instrText>
+              <w:instrText xml:space="preserve"> PAGEREF _Toc194759790 \h </w:instrText>
             </w:r>
             <w:r>
               <w:rPr>
@@ -2889,7 +3453,7 @@
                 <w:noProof/>
                 <w:webHidden/>
               </w:rPr>
-              <w:t>11</w:t>
+              <w:t>19</w:t>
             </w:r>
             <w:r>
               <w:rPr>
@@ -2913,11 +3477,11 @@
               <w:kern w:val="2"/>
               <w:sz w:val="24"/>
               <w:szCs w:val="24"/>
-              <w:lang w:eastAsia="en-GB"/>
+              <w:lang w:val="en-US"/>
               <w14:ligatures w14:val="standardContextual"/>
             </w:rPr>
           </w:pPr>
-          <w:hyperlink w:anchor="_Toc194327725" w:history="1">
+          <w:hyperlink w:anchor="_Toc194759791" w:history="1">
             <w:r>
               <w:rPr>
                 <w:rStyle w:val="Hyperlink"/>
@@ -2932,7 +3496,7 @@
                 <w:kern w:val="2"/>
                 <w:sz w:val="24"/>
                 <w:szCs w:val="24"/>
-                <w:lang w:eastAsia="en-GB"/>
+                <w:lang w:val="en-US"/>
                 <w14:ligatures w14:val="standardContextual"/>
               </w:rPr>
               <w:tab/>
@@ -2963,7 +3527,7 @@
                 <w:noProof/>
                 <w:webHidden/>
               </w:rPr>
-              <w:instrText xml:space="preserve"> PAGEREF _Toc194327725 \h </w:instrText>
+              <w:instrText xml:space="preserve"> PAGEREF _Toc194759791 \h </w:instrText>
             </w:r>
             <w:r>
               <w:rPr>
@@ -2983,7 +3547,383 @@
                 <w:noProof/>
                 <w:webHidden/>
               </w:rPr>
-              <w:t>11</w:t>
+              <w:t>21</w:t>
+            </w:r>
+            <w:r>
+              <w:rPr>
+                <w:noProof/>
+                <w:webHidden/>
+              </w:rPr>
+              <w:fldChar w:fldCharType="end"/>
+            </w:r>
+          </w:hyperlink>
+        </w:p>
+        <w:p>
+          <w:pPr>
+            <w:pStyle w:val="TOC3"/>
+            <w:tabs>
+              <w:tab w:val="left" w:pos="1200"/>
+              <w:tab w:val="right" w:leader="dot" w:pos="9016"/>
+            </w:tabs>
+            <w:rPr>
+              <w:rFonts w:eastAsiaTheme="minorEastAsia"/>
+              <w:noProof/>
+              <w:kern w:val="2"/>
+              <w:sz w:val="24"/>
+              <w:szCs w:val="24"/>
+              <w:lang w:val="en-US"/>
+              <w14:ligatures w14:val="standardContextual"/>
+            </w:rPr>
+          </w:pPr>
+          <w:hyperlink w:anchor="_Toc194759792" w:history="1">
+            <w:r>
+              <w:rPr>
+                <w:rStyle w:val="Hyperlink"/>
+                <w:noProof/>
+              </w:rPr>
+              <w:t>5.3.1</w:t>
+            </w:r>
+            <w:r>
+              <w:rPr>
+                <w:rFonts w:eastAsiaTheme="minorEastAsia"/>
+                <w:noProof/>
+                <w:kern w:val="2"/>
+                <w:sz w:val="24"/>
+                <w:szCs w:val="24"/>
+                <w:lang w:val="en-US"/>
+                <w14:ligatures w14:val="standardContextual"/>
+              </w:rPr>
+              <w:tab/>
+            </w:r>
+            <w:r>
+              <w:rPr>
+                <w:rStyle w:val="Hyperlink"/>
+                <w:noProof/>
+              </w:rPr>
+              <w:t>Model Training Performance</w:t>
+            </w:r>
+            <w:r>
+              <w:rPr>
+                <w:noProof/>
+                <w:webHidden/>
+              </w:rPr>
+              <w:tab/>
+            </w:r>
+            <w:r>
+              <w:rPr>
+                <w:noProof/>
+                <w:webHidden/>
+              </w:rPr>
+              <w:fldChar w:fldCharType="begin"/>
+            </w:r>
+            <w:r>
+              <w:rPr>
+                <w:noProof/>
+                <w:webHidden/>
+              </w:rPr>
+              <w:instrText xml:space="preserve"> PAGEREF _Toc194759792 \h </w:instrText>
+            </w:r>
+            <w:r>
+              <w:rPr>
+                <w:noProof/>
+                <w:webHidden/>
+              </w:rPr>
+            </w:r>
+            <w:r>
+              <w:rPr>
+                <w:noProof/>
+                <w:webHidden/>
+              </w:rPr>
+              <w:fldChar w:fldCharType="separate"/>
+            </w:r>
+            <w:r>
+              <w:rPr>
+                <w:noProof/>
+                <w:webHidden/>
+              </w:rPr>
+              <w:t>21</w:t>
+            </w:r>
+            <w:r>
+              <w:rPr>
+                <w:noProof/>
+                <w:webHidden/>
+              </w:rPr>
+              <w:fldChar w:fldCharType="end"/>
+            </w:r>
+          </w:hyperlink>
+        </w:p>
+        <w:p>
+          <w:pPr>
+            <w:pStyle w:val="TOC3"/>
+            <w:tabs>
+              <w:tab w:val="left" w:pos="1200"/>
+              <w:tab w:val="right" w:leader="dot" w:pos="9016"/>
+            </w:tabs>
+            <w:rPr>
+              <w:rFonts w:eastAsiaTheme="minorEastAsia"/>
+              <w:noProof/>
+              <w:kern w:val="2"/>
+              <w:sz w:val="24"/>
+              <w:szCs w:val="24"/>
+              <w:lang w:val="en-US"/>
+              <w14:ligatures w14:val="standardContextual"/>
+            </w:rPr>
+          </w:pPr>
+          <w:hyperlink w:anchor="_Toc194759793" w:history="1">
+            <w:r>
+              <w:rPr>
+                <w:rStyle w:val="Hyperlink"/>
+                <w:noProof/>
+              </w:rPr>
+              <w:t>5.3.2</w:t>
+            </w:r>
+            <w:r>
+              <w:rPr>
+                <w:rFonts w:eastAsiaTheme="minorEastAsia"/>
+                <w:noProof/>
+                <w:kern w:val="2"/>
+                <w:sz w:val="24"/>
+                <w:szCs w:val="24"/>
+                <w:lang w:val="en-US"/>
+                <w14:ligatures w14:val="standardContextual"/>
+              </w:rPr>
+              <w:tab/>
+            </w:r>
+            <w:r>
+              <w:rPr>
+                <w:rStyle w:val="Hyperlink"/>
+                <w:noProof/>
+              </w:rPr>
+              <w:t>Model Testing</w:t>
+            </w:r>
+            <w:r>
+              <w:rPr>
+                <w:noProof/>
+                <w:webHidden/>
+              </w:rPr>
+              <w:tab/>
+            </w:r>
+            <w:r>
+              <w:rPr>
+                <w:noProof/>
+                <w:webHidden/>
+              </w:rPr>
+              <w:fldChar w:fldCharType="begin"/>
+            </w:r>
+            <w:r>
+              <w:rPr>
+                <w:noProof/>
+                <w:webHidden/>
+              </w:rPr>
+              <w:instrText xml:space="preserve"> PAGEREF _Toc194759793 \h </w:instrText>
+            </w:r>
+            <w:r>
+              <w:rPr>
+                <w:noProof/>
+                <w:webHidden/>
+              </w:rPr>
+            </w:r>
+            <w:r>
+              <w:rPr>
+                <w:noProof/>
+                <w:webHidden/>
+              </w:rPr>
+              <w:fldChar w:fldCharType="separate"/>
+            </w:r>
+            <w:r>
+              <w:rPr>
+                <w:noProof/>
+                <w:webHidden/>
+              </w:rPr>
+              <w:t>23</w:t>
+            </w:r>
+            <w:r>
+              <w:rPr>
+                <w:noProof/>
+                <w:webHidden/>
+              </w:rPr>
+              <w:fldChar w:fldCharType="end"/>
+            </w:r>
+          </w:hyperlink>
+        </w:p>
+        <w:p>
+          <w:pPr>
+            <w:pStyle w:val="TOC3"/>
+            <w:tabs>
+              <w:tab w:val="left" w:pos="1200"/>
+              <w:tab w:val="right" w:leader="dot" w:pos="9016"/>
+            </w:tabs>
+            <w:rPr>
+              <w:rFonts w:eastAsiaTheme="minorEastAsia"/>
+              <w:noProof/>
+              <w:kern w:val="2"/>
+              <w:sz w:val="24"/>
+              <w:szCs w:val="24"/>
+              <w:lang w:val="en-US"/>
+              <w14:ligatures w14:val="standardContextual"/>
+            </w:rPr>
+          </w:pPr>
+          <w:hyperlink w:anchor="_Toc194759794" w:history="1">
+            <w:r>
+              <w:rPr>
+                <w:rStyle w:val="Hyperlink"/>
+                <w:noProof/>
+              </w:rPr>
+              <w:t>5.3.3</w:t>
+            </w:r>
+            <w:r>
+              <w:rPr>
+                <w:rFonts w:eastAsiaTheme="minorEastAsia"/>
+                <w:noProof/>
+                <w:kern w:val="2"/>
+                <w:sz w:val="24"/>
+                <w:szCs w:val="24"/>
+                <w:lang w:val="en-US"/>
+                <w14:ligatures w14:val="standardContextual"/>
+              </w:rPr>
+              <w:tab/>
+            </w:r>
+            <w:r>
+              <w:rPr>
+                <w:rStyle w:val="Hyperlink"/>
+                <w:noProof/>
+              </w:rPr>
+              <w:t>Interface Testing</w:t>
+            </w:r>
+            <w:r>
+              <w:rPr>
+                <w:noProof/>
+                <w:webHidden/>
+              </w:rPr>
+              <w:tab/>
+            </w:r>
+            <w:r>
+              <w:rPr>
+                <w:noProof/>
+                <w:webHidden/>
+              </w:rPr>
+              <w:fldChar w:fldCharType="begin"/>
+            </w:r>
+            <w:r>
+              <w:rPr>
+                <w:noProof/>
+                <w:webHidden/>
+              </w:rPr>
+              <w:instrText xml:space="preserve"> PAGEREF _Toc194759794 \h </w:instrText>
+            </w:r>
+            <w:r>
+              <w:rPr>
+                <w:noProof/>
+                <w:webHidden/>
+              </w:rPr>
+            </w:r>
+            <w:r>
+              <w:rPr>
+                <w:noProof/>
+                <w:webHidden/>
+              </w:rPr>
+              <w:fldChar w:fldCharType="separate"/>
+            </w:r>
+            <w:r>
+              <w:rPr>
+                <w:noProof/>
+                <w:webHidden/>
+              </w:rPr>
+              <w:t>25</w:t>
+            </w:r>
+            <w:r>
+              <w:rPr>
+                <w:noProof/>
+                <w:webHidden/>
+              </w:rPr>
+              <w:fldChar w:fldCharType="end"/>
+            </w:r>
+          </w:hyperlink>
+        </w:p>
+        <w:p>
+          <w:pPr>
+            <w:pStyle w:val="TOC2"/>
+            <w:tabs>
+              <w:tab w:val="left" w:pos="960"/>
+              <w:tab w:val="right" w:leader="dot" w:pos="9016"/>
+            </w:tabs>
+            <w:rPr>
+              <w:rFonts w:eastAsiaTheme="minorEastAsia"/>
+              <w:noProof/>
+              <w:kern w:val="2"/>
+              <w:sz w:val="24"/>
+              <w:szCs w:val="24"/>
+              <w:lang w:val="en-US"/>
+              <w14:ligatures w14:val="standardContextual"/>
+            </w:rPr>
+          </w:pPr>
+          <w:hyperlink w:anchor="_Toc194759795" w:history="1">
+            <w:r>
+              <w:rPr>
+                <w:rStyle w:val="Hyperlink"/>
+                <w:noProof/>
+              </w:rPr>
+              <w:t>5.4</w:t>
+            </w:r>
+            <w:r>
+              <w:rPr>
+                <w:rFonts w:eastAsiaTheme="minorEastAsia"/>
+                <w:noProof/>
+                <w:kern w:val="2"/>
+                <w:sz w:val="24"/>
+                <w:szCs w:val="24"/>
+                <w:lang w:val="en-US"/>
+                <w14:ligatures w14:val="standardContextual"/>
+              </w:rPr>
+              <w:tab/>
+            </w:r>
+            <w:r>
+              <w:rPr>
+                <w:rStyle w:val="Hyperlink"/>
+                <w:noProof/>
+              </w:rPr>
+              <w:t>Requirements to use the program</w:t>
+            </w:r>
+            <w:r>
+              <w:rPr>
+                <w:noProof/>
+                <w:webHidden/>
+              </w:rPr>
+              <w:tab/>
+            </w:r>
+            <w:r>
+              <w:rPr>
+                <w:noProof/>
+                <w:webHidden/>
+              </w:rPr>
+              <w:fldChar w:fldCharType="begin"/>
+            </w:r>
+            <w:r>
+              <w:rPr>
+                <w:noProof/>
+                <w:webHidden/>
+              </w:rPr>
+              <w:instrText xml:space="preserve"> PAGEREF _Toc194759795 \h </w:instrText>
+            </w:r>
+            <w:r>
+              <w:rPr>
+                <w:noProof/>
+                <w:webHidden/>
+              </w:rPr>
+            </w:r>
+            <w:r>
+              <w:rPr>
+                <w:noProof/>
+                <w:webHidden/>
+              </w:rPr>
+              <w:fldChar w:fldCharType="separate"/>
+            </w:r>
+            <w:r>
+              <w:rPr>
+                <w:noProof/>
+                <w:webHidden/>
+              </w:rPr>
+              <w:t>25</w:t>
             </w:r>
             <w:r>
               <w:rPr>
@@ -3007,11 +3947,11 @@
               <w:kern w:val="2"/>
               <w:sz w:val="24"/>
               <w:szCs w:val="24"/>
-              <w:lang w:eastAsia="en-GB"/>
+              <w:lang w:val="en-US"/>
               <w14:ligatures w14:val="standardContextual"/>
             </w:rPr>
           </w:pPr>
-          <w:hyperlink w:anchor="_Toc194327726" w:history="1">
+          <w:hyperlink w:anchor="_Toc194759796" w:history="1">
             <w:r>
               <w:rPr>
                 <w:rStyle w:val="Hyperlink"/>
@@ -3026,7 +3966,7 @@
                 <w:kern w:val="2"/>
                 <w:sz w:val="24"/>
                 <w:szCs w:val="24"/>
-                <w:lang w:eastAsia="en-GB"/>
+                <w:lang w:val="en-US"/>
                 <w14:ligatures w14:val="standardContextual"/>
               </w:rPr>
               <w:tab/>
@@ -3057,7 +3997,7 @@
                 <w:noProof/>
                 <w:webHidden/>
               </w:rPr>
-              <w:instrText xml:space="preserve"> PAGEREF _Toc194327726 \h </w:instrText>
+              <w:instrText xml:space="preserve"> PAGEREF _Toc194759796 \h </w:instrText>
             </w:r>
             <w:r>
               <w:rPr>
@@ -3077,7 +4017,7 @@
                 <w:noProof/>
                 <w:webHidden/>
               </w:rPr>
-              <w:t>12</w:t>
+              <w:t>26</w:t>
             </w:r>
             <w:r>
               <w:rPr>
@@ -3101,11 +4041,11 @@
               <w:kern w:val="2"/>
               <w:sz w:val="24"/>
               <w:szCs w:val="24"/>
-              <w:lang w:eastAsia="en-GB"/>
+              <w:lang w:val="en-US"/>
               <w14:ligatures w14:val="standardContextual"/>
             </w:rPr>
           </w:pPr>
-          <w:hyperlink w:anchor="_Toc194327727" w:history="1">
+          <w:hyperlink w:anchor="_Toc194759797" w:history="1">
             <w:r>
               <w:rPr>
                 <w:rStyle w:val="Hyperlink"/>
@@ -3120,7 +4060,7 @@
                 <w:kern w:val="2"/>
                 <w:sz w:val="24"/>
                 <w:szCs w:val="24"/>
-                <w:lang w:eastAsia="en-GB"/>
+                <w:lang w:val="en-US"/>
                 <w14:ligatures w14:val="standardContextual"/>
               </w:rPr>
               <w:tab/>
@@ -3151,7 +4091,7 @@
                 <w:noProof/>
                 <w:webHidden/>
               </w:rPr>
-              <w:instrText xml:space="preserve"> PAGEREF _Toc194327727 \h </w:instrText>
+              <w:instrText xml:space="preserve"> PAGEREF _Toc194759797 \h </w:instrText>
             </w:r>
             <w:r>
               <w:rPr>
@@ -3171,7 +4111,7 @@
                 <w:noProof/>
                 <w:webHidden/>
               </w:rPr>
-              <w:t>12</w:t>
+              <w:t>26</w:t>
             </w:r>
             <w:r>
               <w:rPr>
@@ -3195,11 +4135,11 @@
               <w:kern w:val="2"/>
               <w:sz w:val="24"/>
               <w:szCs w:val="24"/>
-              <w:lang w:eastAsia="en-GB"/>
+              <w:lang w:val="en-US"/>
               <w14:ligatures w14:val="standardContextual"/>
             </w:rPr>
           </w:pPr>
-          <w:hyperlink w:anchor="_Toc194327728" w:history="1">
+          <w:hyperlink w:anchor="_Toc194759798" w:history="1">
             <w:r>
               <w:rPr>
                 <w:rStyle w:val="Hyperlink"/>
@@ -3214,7 +4154,7 @@
                 <w:kern w:val="2"/>
                 <w:sz w:val="24"/>
                 <w:szCs w:val="24"/>
-                <w:lang w:eastAsia="en-GB"/>
+                <w:lang w:val="en-US"/>
                 <w14:ligatures w14:val="standardContextual"/>
               </w:rPr>
               <w:tab/>
@@ -3245,7 +4185,7 @@
                 <w:noProof/>
                 <w:webHidden/>
               </w:rPr>
-              <w:instrText xml:space="preserve"> PAGEREF _Toc194327728 \h </w:instrText>
+              <w:instrText xml:space="preserve"> PAGEREF _Toc194759798 \h </w:instrText>
             </w:r>
             <w:r>
               <w:rPr>
@@ -3265,7 +4205,7 @@
                 <w:noProof/>
                 <w:webHidden/>
               </w:rPr>
-              <w:t>12</w:t>
+              <w:t>26</w:t>
             </w:r>
             <w:r>
               <w:rPr>
@@ -3289,11 +4229,11 @@
               <w:kern w:val="2"/>
               <w:sz w:val="24"/>
               <w:szCs w:val="24"/>
-              <w:lang w:eastAsia="en-GB"/>
+              <w:lang w:val="en-US"/>
               <w14:ligatures w14:val="standardContextual"/>
             </w:rPr>
           </w:pPr>
-          <w:hyperlink w:anchor="_Toc194327729" w:history="1">
+          <w:hyperlink w:anchor="_Toc194759799" w:history="1">
             <w:r>
               <w:rPr>
                 <w:rStyle w:val="Hyperlink"/>
@@ -3308,7 +4248,7 @@
                 <w:kern w:val="2"/>
                 <w:sz w:val="24"/>
                 <w:szCs w:val="24"/>
-                <w:lang w:eastAsia="en-GB"/>
+                <w:lang w:val="en-US"/>
                 <w14:ligatures w14:val="standardContextual"/>
               </w:rPr>
               <w:tab/>
@@ -3318,7 +4258,7 @@
                 <w:rStyle w:val="Hyperlink"/>
                 <w:noProof/>
               </w:rPr>
-              <w:t>Evaluation and discussion of results</w:t>
+              <w:t>Evaluation</w:t>
             </w:r>
             <w:r>
               <w:rPr>
@@ -3339,7 +4279,7 @@
                 <w:noProof/>
                 <w:webHidden/>
               </w:rPr>
-              <w:instrText xml:space="preserve"> PAGEREF _Toc194327729 \h </w:instrText>
+              <w:instrText xml:space="preserve"> PAGEREF _Toc194759799 \h </w:instrText>
             </w:r>
             <w:r>
               <w:rPr>
@@ -3359,7 +4299,7 @@
                 <w:noProof/>
                 <w:webHidden/>
               </w:rPr>
-              <w:t>13</w:t>
+              <w:t>27</w:t>
             </w:r>
             <w:r>
               <w:rPr>
@@ -3383,11 +4323,11 @@
               <w:kern w:val="2"/>
               <w:sz w:val="24"/>
               <w:szCs w:val="24"/>
-              <w:lang w:eastAsia="en-GB"/>
+              <w:lang w:val="en-US"/>
               <w14:ligatures w14:val="standardContextual"/>
             </w:rPr>
           </w:pPr>
-          <w:hyperlink w:anchor="_Toc194327730" w:history="1">
+          <w:hyperlink w:anchor="_Toc194759800" w:history="1">
             <w:r>
               <w:rPr>
                 <w:rStyle w:val="Hyperlink"/>
@@ -3402,7 +4342,7 @@
                 <w:kern w:val="2"/>
                 <w:sz w:val="24"/>
                 <w:szCs w:val="24"/>
-                <w:lang w:eastAsia="en-GB"/>
+                <w:lang w:val="en-US"/>
                 <w14:ligatures w14:val="standardContextual"/>
               </w:rPr>
               <w:tab/>
@@ -3412,7 +4352,7 @@
                 <w:rStyle w:val="Hyperlink"/>
                 <w:noProof/>
               </w:rPr>
-              <w:t>Issues with Landsat 9</w:t>
+              <w:t>Model evaluation</w:t>
             </w:r>
             <w:r>
               <w:rPr>
@@ -3433,7 +4373,7 @@
                 <w:noProof/>
                 <w:webHidden/>
               </w:rPr>
-              <w:instrText xml:space="preserve"> PAGEREF _Toc194327730 \h </w:instrText>
+              <w:instrText xml:space="preserve"> PAGEREF _Toc194759800 \h </w:instrText>
             </w:r>
             <w:r>
               <w:rPr>
@@ -3453,7 +4393,195 @@
                 <w:noProof/>
                 <w:webHidden/>
               </w:rPr>
-              <w:t>13</w:t>
+              <w:t>27</w:t>
+            </w:r>
+            <w:r>
+              <w:rPr>
+                <w:noProof/>
+                <w:webHidden/>
+              </w:rPr>
+              <w:fldChar w:fldCharType="end"/>
+            </w:r>
+          </w:hyperlink>
+        </w:p>
+        <w:p>
+          <w:pPr>
+            <w:pStyle w:val="TOC2"/>
+            <w:tabs>
+              <w:tab w:val="left" w:pos="960"/>
+              <w:tab w:val="right" w:leader="dot" w:pos="9016"/>
+            </w:tabs>
+            <w:rPr>
+              <w:rFonts w:eastAsiaTheme="minorEastAsia"/>
+              <w:noProof/>
+              <w:kern w:val="2"/>
+              <w:sz w:val="24"/>
+              <w:szCs w:val="24"/>
+              <w:lang w:val="en-US"/>
+              <w14:ligatures w14:val="standardContextual"/>
+            </w:rPr>
+          </w:pPr>
+          <w:hyperlink w:anchor="_Toc194759801" w:history="1">
+            <w:r>
+              <w:rPr>
+                <w:rStyle w:val="Hyperlink"/>
+                <w:noProof/>
+              </w:rPr>
+              <w:t>7.2</w:t>
+            </w:r>
+            <w:r>
+              <w:rPr>
+                <w:rFonts w:eastAsiaTheme="minorEastAsia"/>
+                <w:noProof/>
+                <w:kern w:val="2"/>
+                <w:sz w:val="24"/>
+                <w:szCs w:val="24"/>
+                <w:lang w:val="en-US"/>
+                <w14:ligatures w14:val="standardContextual"/>
+              </w:rPr>
+              <w:tab/>
+            </w:r>
+            <w:r>
+              <w:rPr>
+                <w:rStyle w:val="Hyperlink"/>
+                <w:noProof/>
+              </w:rPr>
+              <w:t>Dataset evaluation</w:t>
+            </w:r>
+            <w:r>
+              <w:rPr>
+                <w:noProof/>
+                <w:webHidden/>
+              </w:rPr>
+              <w:tab/>
+            </w:r>
+            <w:r>
+              <w:rPr>
+                <w:noProof/>
+                <w:webHidden/>
+              </w:rPr>
+              <w:fldChar w:fldCharType="begin"/>
+            </w:r>
+            <w:r>
+              <w:rPr>
+                <w:noProof/>
+                <w:webHidden/>
+              </w:rPr>
+              <w:instrText xml:space="preserve"> PAGEREF _Toc194759801 \h </w:instrText>
+            </w:r>
+            <w:r>
+              <w:rPr>
+                <w:noProof/>
+                <w:webHidden/>
+              </w:rPr>
+            </w:r>
+            <w:r>
+              <w:rPr>
+                <w:noProof/>
+                <w:webHidden/>
+              </w:rPr>
+              <w:fldChar w:fldCharType="separate"/>
+            </w:r>
+            <w:r>
+              <w:rPr>
+                <w:noProof/>
+                <w:webHidden/>
+              </w:rPr>
+              <w:t>27</w:t>
+            </w:r>
+            <w:r>
+              <w:rPr>
+                <w:noProof/>
+                <w:webHidden/>
+              </w:rPr>
+              <w:fldChar w:fldCharType="end"/>
+            </w:r>
+          </w:hyperlink>
+        </w:p>
+        <w:p>
+          <w:pPr>
+            <w:pStyle w:val="TOC2"/>
+            <w:tabs>
+              <w:tab w:val="left" w:pos="960"/>
+              <w:tab w:val="right" w:leader="dot" w:pos="9016"/>
+            </w:tabs>
+            <w:rPr>
+              <w:rFonts w:eastAsiaTheme="minorEastAsia"/>
+              <w:noProof/>
+              <w:kern w:val="2"/>
+              <w:sz w:val="24"/>
+              <w:szCs w:val="24"/>
+              <w:lang w:val="en-US"/>
+              <w14:ligatures w14:val="standardContextual"/>
+            </w:rPr>
+          </w:pPr>
+          <w:hyperlink w:anchor="_Toc194759802" w:history="1">
+            <w:r>
+              <w:rPr>
+                <w:rStyle w:val="Hyperlink"/>
+                <w:noProof/>
+              </w:rPr>
+              <w:t>7.3</w:t>
+            </w:r>
+            <w:r>
+              <w:rPr>
+                <w:rFonts w:eastAsiaTheme="minorEastAsia"/>
+                <w:noProof/>
+                <w:kern w:val="2"/>
+                <w:sz w:val="24"/>
+                <w:szCs w:val="24"/>
+                <w:lang w:val="en-US"/>
+                <w14:ligatures w14:val="standardContextual"/>
+              </w:rPr>
+              <w:tab/>
+            </w:r>
+            <w:r>
+              <w:rPr>
+                <w:rStyle w:val="Hyperlink"/>
+                <w:noProof/>
+              </w:rPr>
+              <w:t>Evaluation</w:t>
+            </w:r>
+            <w:r>
+              <w:rPr>
+                <w:noProof/>
+                <w:webHidden/>
+              </w:rPr>
+              <w:tab/>
+            </w:r>
+            <w:r>
+              <w:rPr>
+                <w:noProof/>
+                <w:webHidden/>
+              </w:rPr>
+              <w:fldChar w:fldCharType="begin"/>
+            </w:r>
+            <w:r>
+              <w:rPr>
+                <w:noProof/>
+                <w:webHidden/>
+              </w:rPr>
+              <w:instrText xml:space="preserve"> PAGEREF _Toc194759802 \h </w:instrText>
+            </w:r>
+            <w:r>
+              <w:rPr>
+                <w:noProof/>
+                <w:webHidden/>
+              </w:rPr>
+            </w:r>
+            <w:r>
+              <w:rPr>
+                <w:noProof/>
+                <w:webHidden/>
+              </w:rPr>
+              <w:fldChar w:fldCharType="separate"/>
+            </w:r>
+            <w:r>
+              <w:rPr>
+                <w:noProof/>
+                <w:webHidden/>
+              </w:rPr>
+              <w:t>27</w:t>
             </w:r>
             <w:r>
               <w:rPr>
@@ -3477,11 +4605,11 @@
               <w:kern w:val="2"/>
               <w:sz w:val="24"/>
               <w:szCs w:val="24"/>
-              <w:lang w:eastAsia="en-GB"/>
+              <w:lang w:val="en-US"/>
               <w14:ligatures w14:val="standardContextual"/>
             </w:rPr>
           </w:pPr>
-          <w:hyperlink w:anchor="_Toc194327731" w:history="1">
+          <w:hyperlink w:anchor="_Toc194759803" w:history="1">
             <w:r>
               <w:rPr>
                 <w:rStyle w:val="Hyperlink"/>
@@ -3496,7 +4624,7 @@
                 <w:kern w:val="2"/>
                 <w:sz w:val="24"/>
                 <w:szCs w:val="24"/>
-                <w:lang w:eastAsia="en-GB"/>
+                <w:lang w:val="en-US"/>
                 <w14:ligatures w14:val="standardContextual"/>
               </w:rPr>
               <w:tab/>
@@ -3506,7 +4634,7 @@
                 <w:rStyle w:val="Hyperlink"/>
                 <w:noProof/>
               </w:rPr>
-              <w:t>Conclusion</w:t>
+              <w:t>Reflection</w:t>
             </w:r>
             <w:r>
               <w:rPr>
@@ -3527,7 +4655,7 @@
                 <w:noProof/>
                 <w:webHidden/>
               </w:rPr>
-              <w:instrText xml:space="preserve"> PAGEREF _Toc194327731 \h </w:instrText>
+              <w:instrText xml:space="preserve"> PAGEREF _Toc194759803 \h </w:instrText>
             </w:r>
             <w:r>
               <w:rPr>
@@ -3547,7 +4675,7 @@
                 <w:noProof/>
                 <w:webHidden/>
               </w:rPr>
-              <w:t>14</w:t>
+              <w:t>28</w:t>
             </w:r>
             <w:r>
               <w:rPr>
@@ -3571,11 +4699,11 @@
               <w:kern w:val="2"/>
               <w:sz w:val="24"/>
               <w:szCs w:val="24"/>
-              <w:lang w:eastAsia="en-GB"/>
+              <w:lang w:val="en-US"/>
               <w14:ligatures w14:val="standardContextual"/>
             </w:rPr>
           </w:pPr>
-          <w:hyperlink w:anchor="_Toc194327732" w:history="1">
+          <w:hyperlink w:anchor="_Toc194759804" w:history="1">
             <w:r>
               <w:rPr>
                 <w:rStyle w:val="Hyperlink"/>
@@ -3590,7 +4718,7 @@
                 <w:kern w:val="2"/>
                 <w:sz w:val="24"/>
                 <w:szCs w:val="24"/>
-                <w:lang w:eastAsia="en-GB"/>
+                <w:lang w:val="en-US"/>
                 <w14:ligatures w14:val="standardContextual"/>
               </w:rPr>
               <w:tab/>
@@ -3600,7 +4728,7 @@
                 <w:rStyle w:val="Hyperlink"/>
                 <w:noProof/>
               </w:rPr>
-              <w:t>Project management</w:t>
+              <w:t>Development reflection</w:t>
             </w:r>
             <w:r>
               <w:rPr>
@@ -3621,7 +4749,7 @@
                 <w:noProof/>
                 <w:webHidden/>
               </w:rPr>
-              <w:instrText xml:space="preserve"> PAGEREF _Toc194327732 \h </w:instrText>
+              <w:instrText xml:space="preserve"> PAGEREF _Toc194759804 \h </w:instrText>
             </w:r>
             <w:r>
               <w:rPr>
@@ -3641,7 +4769,7 @@
                 <w:noProof/>
                 <w:webHidden/>
               </w:rPr>
-              <w:t>14</w:t>
+              <w:t>28</w:t>
             </w:r>
             <w:r>
               <w:rPr>
@@ -3665,11 +4793,11 @@
               <w:kern w:val="2"/>
               <w:sz w:val="24"/>
               <w:szCs w:val="24"/>
-              <w:lang w:eastAsia="en-GB"/>
+              <w:lang w:val="en-US"/>
               <w14:ligatures w14:val="standardContextual"/>
             </w:rPr>
           </w:pPr>
-          <w:hyperlink w:anchor="_Toc194327733" w:history="1">
+          <w:hyperlink w:anchor="_Toc194759805" w:history="1">
             <w:r>
               <w:rPr>
                 <w:rStyle w:val="Hyperlink"/>
@@ -3684,7 +4812,7 @@
                 <w:kern w:val="2"/>
                 <w:sz w:val="24"/>
                 <w:szCs w:val="24"/>
-                <w:lang w:eastAsia="en-GB"/>
+                <w:lang w:val="en-US"/>
                 <w14:ligatures w14:val="standardContextual"/>
               </w:rPr>
               <w:tab/>
@@ -3694,7 +4822,7 @@
                 <w:rStyle w:val="Hyperlink"/>
                 <w:noProof/>
               </w:rPr>
-              <w:t>Risk management</w:t>
+              <w:t>Future Development</w:t>
             </w:r>
             <w:r>
               <w:rPr>
@@ -3715,7 +4843,7 @@
                 <w:noProof/>
                 <w:webHidden/>
               </w:rPr>
-              <w:instrText xml:space="preserve"> PAGEREF _Toc194327733 \h </w:instrText>
+              <w:instrText xml:space="preserve"> PAGEREF _Toc194759805 \h </w:instrText>
             </w:r>
             <w:r>
               <w:rPr>
@@ -3735,7 +4863,7 @@
                 <w:noProof/>
                 <w:webHidden/>
               </w:rPr>
-              <w:t>14</w:t>
+              <w:t>28</w:t>
             </w:r>
             <w:r>
               <w:rPr>
@@ -3759,11 +4887,11 @@
               <w:kern w:val="2"/>
               <w:sz w:val="24"/>
               <w:szCs w:val="24"/>
-              <w:lang w:eastAsia="en-GB"/>
+              <w:lang w:val="en-US"/>
               <w14:ligatures w14:val="standardContextual"/>
             </w:rPr>
           </w:pPr>
-          <w:hyperlink w:anchor="_Toc194327734" w:history="1">
+          <w:hyperlink w:anchor="_Toc194759806" w:history="1">
             <w:r>
               <w:rPr>
                 <w:rStyle w:val="Hyperlink"/>
@@ -3778,7 +4906,7 @@
                 <w:kern w:val="2"/>
                 <w:sz w:val="24"/>
                 <w:szCs w:val="24"/>
-                <w:lang w:eastAsia="en-GB"/>
+                <w:lang w:val="en-US"/>
                 <w14:ligatures w14:val="standardContextual"/>
               </w:rPr>
               <w:tab/>
@@ -3788,7 +4916,7 @@
                 <w:rStyle w:val="Hyperlink"/>
                 <w:noProof/>
               </w:rPr>
-              <w:t>General conclusions</w:t>
+              <w:t>Future Research</w:t>
             </w:r>
             <w:r>
               <w:rPr>
@@ -3809,7 +4937,7 @@
                 <w:noProof/>
                 <w:webHidden/>
               </w:rPr>
-              <w:instrText xml:space="preserve"> PAGEREF _Toc194327734 \h </w:instrText>
+              <w:instrText xml:space="preserve"> PAGEREF _Toc194759806 \h </w:instrText>
             </w:r>
             <w:r>
               <w:rPr>
@@ -3829,7 +4957,101 @@
                 <w:noProof/>
                 <w:webHidden/>
               </w:rPr>
-              <w:t>14</w:t>
+              <w:t>28</w:t>
+            </w:r>
+            <w:r>
+              <w:rPr>
+                <w:noProof/>
+                <w:webHidden/>
+              </w:rPr>
+              <w:fldChar w:fldCharType="end"/>
+            </w:r>
+          </w:hyperlink>
+        </w:p>
+        <w:p>
+          <w:pPr>
+            <w:pStyle w:val="TOC2"/>
+            <w:tabs>
+              <w:tab w:val="left" w:pos="960"/>
+              <w:tab w:val="right" w:leader="dot" w:pos="9016"/>
+            </w:tabs>
+            <w:rPr>
+              <w:rFonts w:eastAsiaTheme="minorEastAsia"/>
+              <w:noProof/>
+              <w:kern w:val="2"/>
+              <w:sz w:val="24"/>
+              <w:szCs w:val="24"/>
+              <w:lang w:val="en-US"/>
+              <w14:ligatures w14:val="standardContextual"/>
+            </w:rPr>
+          </w:pPr>
+          <w:hyperlink w:anchor="_Toc194759807" w:history="1">
+            <w:r>
+              <w:rPr>
+                <w:rStyle w:val="Hyperlink"/>
+                <w:noProof/>
+              </w:rPr>
+              <w:t>8.4</w:t>
+            </w:r>
+            <w:r>
+              <w:rPr>
+                <w:rFonts w:eastAsiaTheme="minorEastAsia"/>
+                <w:noProof/>
+                <w:kern w:val="2"/>
+                <w:sz w:val="24"/>
+                <w:szCs w:val="24"/>
+                <w:lang w:val="en-US"/>
+                <w14:ligatures w14:val="standardContextual"/>
+              </w:rPr>
+              <w:tab/>
+            </w:r>
+            <w:r>
+              <w:rPr>
+                <w:rStyle w:val="Hyperlink"/>
+                <w:noProof/>
+              </w:rPr>
+              <w:t>Project Conclusions</w:t>
+            </w:r>
+            <w:r>
+              <w:rPr>
+                <w:noProof/>
+                <w:webHidden/>
+              </w:rPr>
+              <w:tab/>
+            </w:r>
+            <w:r>
+              <w:rPr>
+                <w:noProof/>
+                <w:webHidden/>
+              </w:rPr>
+              <w:fldChar w:fldCharType="begin"/>
+            </w:r>
+            <w:r>
+              <w:rPr>
+                <w:noProof/>
+                <w:webHidden/>
+              </w:rPr>
+              <w:instrText xml:space="preserve"> PAGEREF _Toc194759807 \h </w:instrText>
+            </w:r>
+            <w:r>
+              <w:rPr>
+                <w:noProof/>
+                <w:webHidden/>
+              </w:rPr>
+            </w:r>
+            <w:r>
+              <w:rPr>
+                <w:noProof/>
+                <w:webHidden/>
+              </w:rPr>
+              <w:fldChar w:fldCharType="separate"/>
+            </w:r>
+            <w:r>
+              <w:rPr>
+                <w:noProof/>
+                <w:webHidden/>
+              </w:rPr>
+              <w:t>28</w:t>
             </w:r>
             <w:r>
               <w:rPr>
@@ -3852,11 +5074,11 @@
               <w:kern w:val="2"/>
               <w:sz w:val="24"/>
               <w:szCs w:val="24"/>
-              <w:lang w:eastAsia="en-GB"/>
+              <w:lang w:val="en-US"/>
               <w14:ligatures w14:val="standardContextual"/>
             </w:rPr>
           </w:pPr>
-          <w:hyperlink w:anchor="_Toc194327735" w:history="1">
+          <w:hyperlink w:anchor="_Toc194759808" w:history="1">
             <w:r>
               <w:rPr>
                 <w:rStyle w:val="Hyperlink"/>
@@ -3883,7 +5105,7 @@
                 <w:noProof/>
                 <w:webHidden/>
               </w:rPr>
-              <w:instrText xml:space="preserve"> PAGEREF _Toc194327735 \h </w:instrText>
+              <w:instrText xml:space="preserve"> PAGEREF _Toc194759808 \h </w:instrText>
             </w:r>
             <w:r>
               <w:rPr>
@@ -3903,7 +5125,7 @@
                 <w:noProof/>
                 <w:webHidden/>
               </w:rPr>
-              <w:t>15</w:t>
+              <w:t>29</w:t>
             </w:r>
             <w:r>
               <w:rPr>
@@ -3926,11 +5148,11 @@
               <w:kern w:val="2"/>
               <w:sz w:val="24"/>
               <w:szCs w:val="24"/>
-              <w:lang w:eastAsia="en-GB"/>
+              <w:lang w:val="en-US"/>
               <w14:ligatures w14:val="standardContextual"/>
             </w:rPr>
           </w:pPr>
-          <w:hyperlink w:anchor="_Toc194327736" w:history="1">
+          <w:hyperlink w:anchor="_Toc194759809" w:history="1">
             <w:r>
               <w:rPr>
                 <w:rStyle w:val="Hyperlink"/>
@@ -3957,7 +5179,7 @@
                 <w:noProof/>
                 <w:webHidden/>
               </w:rPr>
-              <w:instrText xml:space="preserve"> PAGEREF _Toc194327736 \h </w:instrText>
+              <w:instrText xml:space="preserve"> PAGEREF _Toc194759809 \h </w:instrText>
             </w:r>
             <w:r>
               <w:rPr>
@@ -3977,7 +5199,7 @@
                 <w:noProof/>
                 <w:webHidden/>
               </w:rPr>
-              <w:t>17</w:t>
+              <w:t>31</w:t>
             </w:r>
             <w:r>
               <w:rPr>
@@ -4000,11 +5222,11 @@
               <w:kern w:val="2"/>
               <w:sz w:val="24"/>
               <w:szCs w:val="24"/>
-              <w:lang w:eastAsia="en-GB"/>
+              <w:lang w:val="en-US"/>
               <w14:ligatures w14:val="standardContextual"/>
             </w:rPr>
           </w:pPr>
-          <w:hyperlink w:anchor="_Toc194327737" w:history="1">
+          <w:hyperlink w:anchor="_Toc194759810" w:history="1">
             <w:r>
               <w:rPr>
                 <w:rStyle w:val="Hyperlink"/>
@@ -4031,7 +5253,7 @@
                 <w:noProof/>
                 <w:webHidden/>
               </w:rPr>
-              <w:instrText xml:space="preserve"> PAGEREF _Toc194327737 \h </w:instrText>
+              <w:instrText xml:space="preserve"> PAGEREF _Toc194759810 \h </w:instrText>
             </w:r>
             <w:r>
               <w:rPr>
@@ -4051,7 +5273,7 @@
                 <w:noProof/>
                 <w:webHidden/>
               </w:rPr>
-              <w:t>18</w:t>
+              <w:t>32</w:t>
             </w:r>
             <w:r>
               <w:rPr>
@@ -4082,7 +5304,7 @@
         <w:pStyle w:val="Heading1"/>
         <w:jc w:val="both"/>
       </w:pPr>
-      <w:bookmarkStart w:id="2" w:name="_Toc194327698"/>
+      <w:bookmarkStart w:id="2" w:name="_Toc194759758"/>
       <w:r>
         <w:lastRenderedPageBreak/>
         <w:t>Introduction</w:t>
@@ -4094,7 +5316,7 @@
         <w:pStyle w:val="Heading2"/>
         <w:jc w:val="both"/>
       </w:pPr>
-      <w:bookmarkStart w:id="3" w:name="_Toc194327699"/>
+      <w:bookmarkStart w:id="3" w:name="_Toc194759759"/>
       <w:r>
         <w:t>Background to the project</w:t>
       </w:r>
@@ -4368,7 +5590,7 @@
         <w:pStyle w:val="Heading2"/>
         <w:jc w:val="both"/>
       </w:pPr>
-      <w:bookmarkStart w:id="4" w:name="_Toc194327700"/>
+      <w:bookmarkStart w:id="4" w:name="_Toc194759760"/>
       <w:r>
         <w:t>Aims and objectives</w:t>
       </w:r>
@@ -4378,12 +5600,14 @@
       <w:pPr>
         <w:pStyle w:val="Heading3"/>
       </w:pPr>
+      <w:bookmarkStart w:id="5" w:name="_Toc194759761"/>
       <w:r>
         <w:t>Aim</w:t>
       </w:r>
       <w:r>
         <w:t>s</w:t>
       </w:r>
+      <w:bookmarkEnd w:id="5"/>
     </w:p>
     <w:p>
       <w:pPr>
@@ -4424,10 +5648,6 @@
     <w:p>
       <w:pPr>
         <w:pStyle w:val="ListParagraph"/>
-        <w:numPr>
-          <w:ilvl w:val="0"/>
-          <w:numId w:val="6"/>
-        </w:numPr>
       </w:pPr>
     </w:p>
     <w:p/>
@@ -4442,10 +5662,12 @@
       <w:pPr>
         <w:pStyle w:val="Heading3"/>
       </w:pPr>
+      <w:bookmarkStart w:id="6" w:name="_Toc194759762"/>
       <w:r>
         <w:lastRenderedPageBreak/>
         <w:t>Objectives</w:t>
       </w:r>
+      <w:bookmarkEnd w:id="6"/>
     </w:p>
     <w:p>
       <w:pPr>
@@ -4495,6 +5717,9 @@
       <w:r>
         <w:t xml:space="preserve"> </w:t>
       </w:r>
+      <w:r>
+        <w:t>The model must also retain a high level of accuracy being of over eighty percent to ensure that fires are consistently predicted correctly.</w:t>
+      </w:r>
     </w:p>
     <w:p/>
     <w:p>
@@ -4568,15 +5793,8 @@
     <w:p>
       <w:pPr>
         <w:pStyle w:val="NoSpacing"/>
-        <w:numPr>
-          <w:ilvl w:val="0"/>
-          <w:numId w:val="6"/>
-        </w:numPr>
         <w:jc w:val="both"/>
       </w:pPr>
-      <w:r>
-        <w:t>The model should be fine-tuned to prevent misclassifications which may cause false alarms or fires to slip through undetected.</w:t>
-      </w:r>
     </w:p>
     <w:p>
       <w:pPr>
@@ -4604,12 +5822,6 @@
     </w:p>
     <w:p>
       <w:pPr>
-        <w:pStyle w:val="NoSpacing"/>
-        <w:jc w:val="both"/>
-      </w:pPr>
-    </w:p>
-    <w:p>
-      <w:pPr>
         <w:jc w:val="both"/>
       </w:pPr>
     </w:p>
@@ -4618,11 +5830,11 @@
         <w:pStyle w:val="Heading2"/>
         <w:jc w:val="both"/>
       </w:pPr>
-      <w:bookmarkStart w:id="5" w:name="_Toc194327701"/>
+      <w:bookmarkStart w:id="7" w:name="_Toc194759763"/>
       <w:r>
         <w:t>Research question</w:t>
       </w:r>
-      <w:bookmarkEnd w:id="5"/>
+      <w:bookmarkEnd w:id="7"/>
     </w:p>
     <w:p>
       <w:pPr>
@@ -4655,6 +5867,34 @@
       </w:r>
       <w:r>
         <w:t>local authorities to implement preventative measures that can reduce or eliminate the damages that wildfires cause.</w:t>
+      </w:r>
+    </w:p>
+    <w:p>
+      <w:pPr>
+        <w:jc w:val="both"/>
+      </w:pPr>
+    </w:p>
+    <w:p>
+      <w:pPr>
+        <w:pStyle w:val="Heading2"/>
+      </w:pPr>
+      <w:bookmarkStart w:id="8" w:name="_Toc194759764"/>
+      <w:r>
+        <w:t>Report structure</w:t>
+      </w:r>
+      <w:bookmarkEnd w:id="8"/>
+    </w:p>
+    <w:p>
+      <w:r>
+        <w:t>For the remaining sections of the report, it will have the following structure. Section 2 will cover the literature review which will cover background research of wildfire prediction and explore possible routes for the project to take. Section 3 will cover the requirements and constraints facing the project which will be informed by the literature review.</w:t>
+      </w:r>
+    </w:p>
+    <w:p>
+      <w:r>
+        <w:t>Section 4 will cover the designing of the dataset and interface which will inform the implementation of the project which will be documented in section 5. Section 6 will cover the ethics and commercial aspects of the project. The results of the project will be documented in section 7</w:t>
+      </w:r>
+      <w:r>
+        <w:t>. Finally, the project as a whole will culminate in Section 8 which will evaluate the project and discuss future work which the project can be used to inform</w:t>
       </w:r>
     </w:p>
     <w:p>
@@ -4662,12 +5902,12 @@
         <w:pStyle w:val="Heading1"/>
         <w:jc w:val="both"/>
       </w:pPr>
-      <w:bookmarkStart w:id="6" w:name="_Toc194327702"/>
+      <w:bookmarkStart w:id="9" w:name="_Toc194759765"/>
       <w:r>
         <w:lastRenderedPageBreak/>
         <w:t>Literature review</w:t>
       </w:r>
-      <w:bookmarkEnd w:id="6"/>
+      <w:bookmarkEnd w:id="9"/>
     </w:p>
     <w:p>
       <w:pPr>
@@ -4719,13 +5959,13 @@
         <w:pStyle w:val="Heading3"/>
         <w:jc w:val="both"/>
       </w:pPr>
-      <w:bookmarkStart w:id="7" w:name="_Toc187672383"/>
-      <w:bookmarkStart w:id="8" w:name="_Toc194327703"/>
+      <w:bookmarkStart w:id="10" w:name="_Toc187672383"/>
+      <w:bookmarkStart w:id="11" w:name="_Toc194759766"/>
       <w:r>
         <w:t>Region selection</w:t>
       </w:r>
-      <w:bookmarkEnd w:id="7"/>
-      <w:bookmarkEnd w:id="8"/>
+      <w:bookmarkEnd w:id="10"/>
+      <w:bookmarkEnd w:id="11"/>
     </w:p>
     <w:p>
       <w:pPr>
@@ -5008,13 +6248,13 @@
         <w:pStyle w:val="Heading3"/>
         <w:jc w:val="both"/>
       </w:pPr>
-      <w:bookmarkStart w:id="9" w:name="_Toc187672384"/>
-      <w:bookmarkStart w:id="10" w:name="_Toc194327704"/>
+      <w:bookmarkStart w:id="12" w:name="_Toc187672384"/>
+      <w:bookmarkStart w:id="13" w:name="_Toc194759767"/>
       <w:r>
         <w:t>Satellites</w:t>
       </w:r>
-      <w:bookmarkEnd w:id="9"/>
-      <w:bookmarkEnd w:id="10"/>
+      <w:bookmarkEnd w:id="12"/>
+      <w:bookmarkEnd w:id="13"/>
       <w:r>
         <w:t xml:space="preserve"> </w:t>
       </w:r>
@@ -5312,13 +6552,13 @@
         <w:pStyle w:val="Heading3"/>
         <w:jc w:val="both"/>
       </w:pPr>
-      <w:bookmarkStart w:id="11" w:name="_Toc187672385"/>
-      <w:bookmarkStart w:id="12" w:name="_Toc194327705"/>
+      <w:bookmarkStart w:id="14" w:name="_Toc187672385"/>
+      <w:bookmarkStart w:id="15" w:name="_Toc194759768"/>
       <w:r>
         <w:t>Available Satellite datasets</w:t>
       </w:r>
-      <w:bookmarkEnd w:id="11"/>
-      <w:bookmarkEnd w:id="12"/>
+      <w:bookmarkEnd w:id="14"/>
+      <w:bookmarkEnd w:id="15"/>
     </w:p>
     <w:p>
       <w:pPr>
@@ -5415,13 +6655,13 @@
         <w:pStyle w:val="Heading3"/>
         <w:jc w:val="both"/>
       </w:pPr>
-      <w:bookmarkStart w:id="13" w:name="_Toc187672386"/>
-      <w:bookmarkStart w:id="14" w:name="_Toc194327706"/>
+      <w:bookmarkStart w:id="16" w:name="_Toc187672386"/>
+      <w:bookmarkStart w:id="17" w:name="_Toc194759769"/>
       <w:r>
         <w:t>Models</w:t>
       </w:r>
-      <w:bookmarkEnd w:id="13"/>
-      <w:bookmarkEnd w:id="14"/>
+      <w:bookmarkEnd w:id="16"/>
+      <w:bookmarkEnd w:id="17"/>
     </w:p>
     <w:p>
       <w:pPr>
@@ -5765,11 +7005,11 @@
         <w:pStyle w:val="Heading3"/>
         <w:jc w:val="both"/>
       </w:pPr>
-      <w:bookmarkStart w:id="15" w:name="_Toc194327707"/>
+      <w:bookmarkStart w:id="18" w:name="_Toc194759770"/>
       <w:r>
         <w:t>Conclusion</w:t>
       </w:r>
-      <w:bookmarkEnd w:id="15"/>
+      <w:bookmarkEnd w:id="18"/>
     </w:p>
     <w:p>
       <w:pPr>
@@ -5789,7 +7029,7 @@
         <w:pStyle w:val="Heading1"/>
         <w:jc w:val="both"/>
       </w:pPr>
-      <w:bookmarkStart w:id="16" w:name="_Toc194327708"/>
+      <w:bookmarkStart w:id="19" w:name="_Toc194759771"/>
       <w:r>
         <w:lastRenderedPageBreak/>
         <w:t>R</w:t>
@@ -5800,15 +7040,17 @@
       <w:r>
         <w:t>quirements</w:t>
       </w:r>
-      <w:bookmarkEnd w:id="16"/>
+      <w:bookmarkEnd w:id="19"/>
     </w:p>
     <w:p>
       <w:pPr>
         <w:pStyle w:val="Heading2"/>
       </w:pPr>
+      <w:bookmarkStart w:id="20" w:name="_Toc194759772"/>
       <w:r>
         <w:t>System requirements</w:t>
       </w:r>
+      <w:bookmarkEnd w:id="20"/>
     </w:p>
     <w:p>
       <w:r>
@@ -5862,6 +7104,7 @@
       <w:pPr>
         <w:pStyle w:val="Heading2"/>
       </w:pPr>
+      <w:bookmarkStart w:id="21" w:name="_Toc194759773"/>
       <w:r>
         <w:t>Data</w:t>
       </w:r>
@@ -5871,6 +7114,7 @@
       <w:r>
         <w:t xml:space="preserve"> requirements</w:t>
       </w:r>
+      <w:bookmarkEnd w:id="21"/>
     </w:p>
     <w:p>
       <w:pPr>
@@ -5883,11 +7127,11 @@
       <w:r>
         <w:t xml:space="preserve">The dataset </w:t>
       </w:r>
-      <w:bookmarkStart w:id="17" w:name="_Hlk194505261"/>
+      <w:bookmarkStart w:id="22" w:name="_Hlk194505261"/>
       <w:r>
         <w:t>must</w:t>
       </w:r>
-      <w:bookmarkEnd w:id="17"/>
+      <w:bookmarkEnd w:id="22"/>
       <w:r>
         <w:t xml:space="preserve"> </w:t>
       </w:r>
@@ -6001,14 +7245,14 @@
         <w:pStyle w:val="Heading2"/>
         <w:jc w:val="both"/>
       </w:pPr>
-      <w:bookmarkStart w:id="18" w:name="_Toc194327709"/>
+      <w:bookmarkStart w:id="23" w:name="_Toc194759774"/>
       <w:r>
         <w:t>Input</w:t>
       </w:r>
       <w:r>
         <w:t xml:space="preserve"> requirements</w:t>
       </w:r>
-      <w:bookmarkEnd w:id="18"/>
+      <w:bookmarkEnd w:id="23"/>
     </w:p>
     <w:p>
       <w:pPr>
@@ -6053,9 +7297,11 @@
       <w:pPr>
         <w:pStyle w:val="Heading2"/>
       </w:pPr>
+      <w:bookmarkStart w:id="24" w:name="_Toc194759775"/>
       <w:r>
         <w:t>Model Requirements</w:t>
       </w:r>
+      <w:bookmarkEnd w:id="24"/>
     </w:p>
     <w:p>
       <w:pPr>
@@ -6131,14 +7377,14 @@
         <w:pStyle w:val="Heading2"/>
         <w:jc w:val="both"/>
       </w:pPr>
-      <w:bookmarkStart w:id="19" w:name="_Toc194327710"/>
+      <w:bookmarkStart w:id="25" w:name="_Toc194759776"/>
       <w:r>
         <w:t>Interface</w:t>
       </w:r>
       <w:r>
         <w:t xml:space="preserve"> requirements</w:t>
       </w:r>
-      <w:bookmarkEnd w:id="19"/>
+      <w:bookmarkEnd w:id="25"/>
     </w:p>
     <w:p>
       <w:pPr>
@@ -6287,12 +7533,12 @@
         <w:pStyle w:val="Heading2"/>
         <w:jc w:val="both"/>
       </w:pPr>
-      <w:bookmarkStart w:id="20" w:name="_Toc194327711"/>
+      <w:bookmarkStart w:id="26" w:name="_Toc194759777"/>
       <w:r>
         <w:lastRenderedPageBreak/>
         <w:t>Design constraints</w:t>
       </w:r>
-      <w:bookmarkEnd w:id="20"/>
+      <w:bookmarkEnd w:id="26"/>
     </w:p>
     <w:p>
       <w:r>
@@ -6339,26 +7585,26 @@
         <w:pStyle w:val="Heading1"/>
         <w:jc w:val="both"/>
       </w:pPr>
-      <w:bookmarkStart w:id="21" w:name="_Toc194327712"/>
+      <w:bookmarkStart w:id="27" w:name="_Toc194759778"/>
       <w:r>
         <w:lastRenderedPageBreak/>
         <w:t>Design</w:t>
       </w:r>
-      <w:bookmarkEnd w:id="21"/>
+      <w:bookmarkEnd w:id="27"/>
     </w:p>
     <w:p>
       <w:pPr>
         <w:pStyle w:val="Heading2"/>
         <w:jc w:val="both"/>
       </w:pPr>
-      <w:bookmarkStart w:id="22" w:name="_Toc194327713"/>
+      <w:bookmarkStart w:id="28" w:name="_Toc194759779"/>
       <w:r>
         <w:t>Dataset</w:t>
       </w:r>
       <w:r>
         <w:t xml:space="preserve"> design</w:t>
       </w:r>
-      <w:bookmarkEnd w:id="22"/>
+      <w:bookmarkEnd w:id="28"/>
     </w:p>
     <w:p>
       <w:r>
@@ -6433,14 +7679,22 @@
         <w:pStyle w:val="Heading2"/>
         <w:jc w:val="both"/>
       </w:pPr>
-      <w:bookmarkStart w:id="23" w:name="_Toc194327714"/>
+      <w:bookmarkStart w:id="29" w:name="_Toc194759780"/>
       <w:r>
         <w:t>Interface</w:t>
       </w:r>
       <w:r>
         <w:t xml:space="preserve"> design</w:t>
       </w:r>
-      <w:bookmarkEnd w:id="23"/>
+      <w:bookmarkEnd w:id="29"/>
+    </w:p>
+    <w:p>
+      <w:r>
+        <w:t>Creating a user interface will allow users to operate the program effectively without the use of a console</w:t>
+      </w:r>
+      <w:r>
+        <w:t>. Therefore, the program will be more accessible to use as the user will not need any knowledge or experience with the program before to operate it, all the user will require to use the program is a file to input for a prediction and to download the program and dataset files.</w:t>
+      </w:r>
     </w:p>
     <w:p>
       <w:r>
@@ -6462,7 +7716,6 @@
         <w:rPr>
           <w:u w:val="single"/>
         </w:rPr>
-        <w:lastRenderedPageBreak/>
         <w:t xml:space="preserve">Interface design </w:t>
       </w:r>
     </w:p>
@@ -6489,6 +7742,9 @@
     </w:p>
     <w:p>
       <w:r>
+        <w:rPr>
+          <w:noProof/>
+        </w:rPr>
         <w:drawing>
           <wp:inline distT="0" distB="0" distL="0" distR="0" wp14:anchorId="221590C9" wp14:editId="759936F7">
             <wp:extent cx="2486372" cy="1838582"/>
@@ -6555,6 +7811,9 @@
     </w:p>
     <w:p>
       <w:r>
+        <w:rPr>
+          <w:noProof/>
+        </w:rPr>
         <w:drawing>
           <wp:inline distT="0" distB="0" distL="0" distR="0" wp14:anchorId="40C6E6F5" wp14:editId="27DCFB3E">
             <wp:extent cx="2457793" cy="1705213"/>
@@ -6645,6 +7904,9 @@
     </w:p>
     <w:p>
       <w:r>
+        <w:rPr>
+          <w:noProof/>
+        </w:rPr>
         <w:drawing>
           <wp:inline distT="0" distB="0" distL="0" distR="0" wp14:anchorId="62308ED2" wp14:editId="74D0C32E">
             <wp:extent cx="2457793" cy="1752845"/>
@@ -6684,16 +7946,7 @@
     </w:p>
     <w:p>
       <w:r>
-        <w:t>Following training the model the user will be presented with the option to navigate to a prediction page which will allow the user to select a file on their local storage devices to input into the program</w:t>
-      </w:r>
-      <w:r>
-        <w:t xml:space="preserve">. </w:t>
-      </w:r>
-      <w:r>
-        <w:t>Once the user has inputted a file the interface will navigate to a results page</w:t>
-      </w:r>
-      <w:r>
-        <w:t>.</w:t>
+        <w:t>Following training the model the user will be presented with the option to navigate to a prediction page which will allow the user to select a file on their local storage devices to input into the program. Once the user has inputted a file the interface will navigate to a results page.</w:t>
       </w:r>
       <w:r>
         <w:t xml:space="preserve"> </w:t>
@@ -6731,6 +7984,9 @@
     </w:p>
     <w:p>
       <w:r>
+        <w:rPr>
+          <w:noProof/>
+        </w:rPr>
         <w:drawing>
           <wp:inline distT="0" distB="0" distL="0" distR="0" wp14:anchorId="2D76A262" wp14:editId="2CA76097">
             <wp:extent cx="2467319" cy="1762371"/>
@@ -6770,10 +8026,11 @@
     </w:p>
     <w:p>
       <w:r>
-        <w:t>Once the program has switched to the results page it will present</w:t>
-      </w:r>
-      <w:r>
-        <w:t xml:space="preserve"> the user with the rgb image of the data as well as the prediction made by the model. The user will be given suggested actions based on the outcome of the prediction as well as an option to return to the prediction screen to input another piece of data.</w:t>
+        <w:t xml:space="preserve">Once the program has switched to the results page it will present the user with the rgb image of the data as well as the prediction made by the model. The user will be given suggested actions based on </w:t>
+      </w:r>
+      <w:r>
+        <w:lastRenderedPageBreak/>
+        <w:t>the outcome of the prediction as well as an option to return to the prediction screen to input another piece of data.</w:t>
       </w:r>
       <w:r>
         <w:t xml:space="preserve"> </w:t>
@@ -6791,12 +8048,14 @@
         <w:rPr>
           <w:u w:val="single"/>
         </w:rPr>
-        <w:lastRenderedPageBreak/>
         <w:t>About page</w:t>
       </w:r>
     </w:p>
     <w:p>
       <w:r>
+        <w:rPr>
+          <w:noProof/>
+        </w:rPr>
         <w:drawing>
           <wp:inline distT="0" distB="0" distL="0" distR="0" wp14:anchorId="6923B435" wp14:editId="39B33FDD">
             <wp:extent cx="2486372" cy="1695687"/>
@@ -6857,6 +8116,9 @@
     </w:p>
     <w:p>
       <w:r>
+        <w:rPr>
+          <w:noProof/>
+        </w:rPr>
         <w:drawing>
           <wp:inline distT="0" distB="0" distL="0" distR="0" wp14:anchorId="724F4A50" wp14:editId="2873C743">
             <wp:extent cx="2514951" cy="1724266"/>
@@ -6904,12 +8166,12 @@
         <w:pStyle w:val="Heading1"/>
         <w:jc w:val="both"/>
       </w:pPr>
-      <w:bookmarkStart w:id="24" w:name="_Toc194327715"/>
+      <w:bookmarkStart w:id="30" w:name="_Toc194759781"/>
       <w:r>
         <w:lastRenderedPageBreak/>
         <w:t>Implementation</w:t>
       </w:r>
-      <w:bookmarkEnd w:id="24"/>
+      <w:bookmarkEnd w:id="30"/>
       <w:r>
         <w:t xml:space="preserve"> </w:t>
       </w:r>
@@ -6918,31 +8180,31 @@
       <w:pPr>
         <w:pStyle w:val="Heading2"/>
       </w:pPr>
-      <w:bookmarkStart w:id="25" w:name="_Toc194327716"/>
+      <w:bookmarkStart w:id="31" w:name="_Toc194759782"/>
       <w:r>
         <w:t>Dataset Creation</w:t>
       </w:r>
-      <w:bookmarkEnd w:id="25"/>
+      <w:bookmarkEnd w:id="31"/>
     </w:p>
     <w:p>
       <w:pPr>
         <w:pStyle w:val="Heading3"/>
       </w:pPr>
-      <w:bookmarkStart w:id="26" w:name="_Toc194327717"/>
+      <w:bookmarkStart w:id="32" w:name="_Toc194759783"/>
       <w:r>
         <w:t>Selecting a region</w:t>
       </w:r>
-      <w:bookmarkEnd w:id="26"/>
+      <w:bookmarkEnd w:id="32"/>
     </w:p>
     <w:p>
       <w:r>
         <w:t xml:space="preserve">To begin creating the dataset it must first be captured and exported from the google earth engine. </w:t>
       </w:r>
       <w:r>
-        <w:t xml:space="preserve">To do this, </w:t>
-      </w:r>
-      <w:r>
-        <w:t xml:space="preserve"> </w:t>
+        <w:t xml:space="preserve">To do </w:t>
+      </w:r>
+      <w:r>
+        <w:t xml:space="preserve">this, </w:t>
       </w:r>
       <w:r>
         <w:t>California</w:t>
@@ -7125,11 +8387,11 @@
       <w:pPr>
         <w:pStyle w:val="Heading3"/>
       </w:pPr>
-      <w:bookmarkStart w:id="27" w:name="_Toc194327718"/>
+      <w:bookmarkStart w:id="33" w:name="_Toc194759784"/>
       <w:r>
         <w:t>Finding a fire</w:t>
       </w:r>
-      <w:bookmarkEnd w:id="27"/>
+      <w:bookmarkEnd w:id="33"/>
     </w:p>
     <w:p>
       <w:r>
@@ -7204,11 +8466,11 @@
       <w:pPr>
         <w:pStyle w:val="Heading3"/>
       </w:pPr>
-      <w:bookmarkStart w:id="28" w:name="_Toc194327719"/>
+      <w:bookmarkStart w:id="34" w:name="_Toc194759785"/>
       <w:r>
         <w:t>Extracting data</w:t>
       </w:r>
-      <w:bookmarkEnd w:id="28"/>
+      <w:bookmarkEnd w:id="34"/>
     </w:p>
     <w:p>
       <w:r>
@@ -7275,7 +8537,10 @@
     </w:p>
     <w:p>
       <w:r>
-        <w:t>Additionally,  the data does not include the day that it was taken only the solar angles when the images were captured. This means that time of day cannot be considered as for the time of day to be calculated using solar angles the data would also need to include world coordinates which is not present in the data. This means that the model may struggle with thermal anomalies at night as they may be seen as regular thermal readings in the daytime.</w:t>
+        <w:t>Additionally, the</w:t>
+      </w:r>
+      <w:r>
+        <w:t xml:space="preserve"> data does not include the day that it was taken only the solar angles when the images were captured. This means that time of day cannot be considered as for the time of day to be calculated using solar angles the data would also need to include world coordinates which is not present in the data. This means that the model may struggle with thermal anomalies at night as they may be seen as regular thermal readings in the daytime.</w:t>
       </w:r>
     </w:p>
     <w:p>
@@ -7358,7 +8623,7 @@
       <w:pPr>
         <w:pStyle w:val="Heading3"/>
       </w:pPr>
-      <w:bookmarkStart w:id="29" w:name="_Toc194327720"/>
+      <w:bookmarkStart w:id="35" w:name="_Toc194759786"/>
       <w:r>
         <w:t>D</w:t>
       </w:r>
@@ -7368,7 +8633,7 @@
       <w:r>
         <w:t>preprocessing</w:t>
       </w:r>
-      <w:bookmarkEnd w:id="29"/>
+      <w:bookmarkEnd w:id="35"/>
     </w:p>
     <w:p>
       <w:r>
@@ -7449,7 +8714,7 @@
         <w:pStyle w:val="Heading2"/>
         <w:jc w:val="both"/>
       </w:pPr>
-      <w:bookmarkStart w:id="30" w:name="_Toc194327721"/>
+      <w:bookmarkStart w:id="36" w:name="_Toc194759787"/>
       <w:r>
         <w:lastRenderedPageBreak/>
         <w:t xml:space="preserve">Model </w:t>
@@ -7457,17 +8722,17 @@
       <w:r>
         <w:t>Implementation</w:t>
       </w:r>
-      <w:bookmarkEnd w:id="30"/>
+      <w:bookmarkEnd w:id="36"/>
     </w:p>
     <w:p>
       <w:pPr>
         <w:pStyle w:val="Heading3"/>
       </w:pPr>
-      <w:bookmarkStart w:id="31" w:name="_Toc194327722"/>
+      <w:bookmarkStart w:id="37" w:name="_Toc194759788"/>
       <w:r>
         <w:t>Important Bands in Landsat 9</w:t>
       </w:r>
-      <w:bookmarkEnd w:id="31"/>
+      <w:bookmarkEnd w:id="37"/>
     </w:p>
     <w:p>
       <w:r>
@@ -7570,11 +8835,11 @@
       <w:pPr>
         <w:pStyle w:val="Heading3"/>
       </w:pPr>
-      <w:bookmarkStart w:id="32" w:name="_Toc194327723"/>
+      <w:bookmarkStart w:id="38" w:name="_Toc194759789"/>
       <w:r>
         <w:t>Convolutional Neural Network (CNN)</w:t>
       </w:r>
-      <w:bookmarkEnd w:id="32"/>
+      <w:bookmarkEnd w:id="38"/>
     </w:p>
     <w:p>
       <w:r>
@@ -7701,11 +8966,11 @@
       <w:pPr>
         <w:pStyle w:val="Heading3"/>
       </w:pPr>
-      <w:bookmarkStart w:id="33" w:name="_Toc194327724"/>
+      <w:bookmarkStart w:id="39" w:name="_Toc194759790"/>
       <w:r>
         <w:t>User Interface</w:t>
       </w:r>
-      <w:bookmarkEnd w:id="33"/>
+      <w:bookmarkEnd w:id="39"/>
     </w:p>
     <w:p>
       <w:r>
@@ -7717,6 +8982,9 @@
     </w:p>
     <w:p>
       <w:r>
+        <w:rPr>
+          <w:noProof/>
+        </w:rPr>
         <w:drawing>
           <wp:inline distT="0" distB="0" distL="0" distR="0" wp14:anchorId="6BC0466A" wp14:editId="3B3B58C0">
             <wp:extent cx="4648849" cy="1857634"/>
@@ -7763,6 +9031,9 @@
     <w:p/>
     <w:p>
       <w:r>
+        <w:rPr>
+          <w:noProof/>
+        </w:rPr>
         <w:lastRenderedPageBreak/>
         <w:drawing>
           <wp:inline distT="0" distB="0" distL="0" distR="0" wp14:anchorId="05265A21" wp14:editId="35093EFD">
@@ -7817,6 +9088,9 @@
         <w:t xml:space="preserve"> </w:t>
       </w:r>
       <w:r>
+        <w:rPr>
+          <w:noProof/>
+        </w:rPr>
         <w:drawing>
           <wp:inline distT="0" distB="0" distL="0" distR="0" wp14:anchorId="6F135486" wp14:editId="0F34C7A5">
             <wp:extent cx="4620270" cy="1800476"/>
@@ -7866,6 +9140,12 @@
         </w:rPr>
         <w:t>The prediction page also follows the design and uses a grid based system.</w:t>
       </w:r>
+      <w:r>
+        <w:rPr>
+          <w:noProof/>
+        </w:rPr>
+        <w:t xml:space="preserve"> The predict button opens a pop up window that allows the user to pick any .tif file on their local drives and input it into the model for a prediction to take place.</w:t>
+      </w:r>
     </w:p>
     <w:p>
       <w:pPr>
@@ -7887,6 +9167,18 @@
           <w:noProof/>
         </w:rPr>
         <w:t>Overall, the interface created using Tkinter follows the designs well due to the interface being low fidelity as the program needs to be as smooth to use as possible for a user with no prior experience or knowledge of fire prediction.</w:t>
+      </w:r>
+      <w:r>
+        <w:rPr>
+          <w:noProof/>
+        </w:rPr>
+        <w:t xml:space="preserve"> Additionally, creating a higher fidelity interface may be costly to computing resources and result in the model taking longer to train if more resources are allocated to displaying a </w:t>
+      </w:r>
+      <w:r>
+        <w:rPr>
+          <w:noProof/>
+        </w:rPr>
+        <w:t>user interface.</w:t>
       </w:r>
     </w:p>
     <w:p/>
@@ -7907,19 +9199,21 @@
         <w:pStyle w:val="Heading2"/>
         <w:jc w:val="both"/>
       </w:pPr>
-      <w:bookmarkStart w:id="34" w:name="_Toc194327725"/>
+      <w:bookmarkStart w:id="40" w:name="_Toc194759791"/>
       <w:r>
         <w:t>Testing</w:t>
       </w:r>
-      <w:bookmarkEnd w:id="34"/>
+      <w:bookmarkEnd w:id="40"/>
     </w:p>
     <w:p>
       <w:pPr>
         <w:pStyle w:val="Heading3"/>
       </w:pPr>
+      <w:bookmarkStart w:id="41" w:name="_Toc194759792"/>
       <w:r>
         <w:t>Model Training Performance</w:t>
       </w:r>
+      <w:bookmarkEnd w:id="41"/>
     </w:p>
     <w:p>
       <w:r>
@@ -8125,11 +9419,8 @@
     </w:p>
     <w:p>
       <w:r>
-        <w:t xml:space="preserve">The training evaluation suggests that the model has been able learn patterns and generalise well and shows no signs of over or underfitting. Therefore, as a result of the training the model is well tuned </w:t>
-      </w:r>
-      <w:r>
         <w:lastRenderedPageBreak/>
-        <w:t xml:space="preserve">for the task of predicting fires and needs to be tested rigorously to confirm that the model is successful. </w:t>
+        <w:t xml:space="preserve">The training evaluation suggests that the model has been able learn patterns and generalise well and shows no signs of over or underfitting. Therefore, as a result of the training the model is well tuned for the task of predicting fires and needs to be tested rigorously to confirm that the model is successful. </w:t>
       </w:r>
     </w:p>
     <w:p/>
@@ -8140,9 +9431,11 @@
       <w:pPr>
         <w:pStyle w:val="Heading3"/>
       </w:pPr>
+      <w:bookmarkStart w:id="42" w:name="_Toc194759793"/>
       <w:r>
         <w:t>Model Testing</w:t>
       </w:r>
+      <w:bookmarkEnd w:id="42"/>
     </w:p>
     <w:p>
       <w:pPr>
@@ -8187,7 +9480,13 @@
     </w:p>
     <w:p>
       <w:r>
-        <w:t>To test the model’s ability to predict between Low, High and Live fire conditions data was collected about the Ventura county “Mountain fire” in 2024. This dataset does not include data where there wasn’t a fire so any predictions in that category have been</w:t>
+        <w:t xml:space="preserve">To test the model’s ability to predict between Low, High and Live fire conditions data was collected about the </w:t>
+      </w:r>
+      <w:r>
+        <w:t>Ventura County</w:t>
+      </w:r>
+      <w:r>
+        <w:t xml:space="preserve"> “Mountain fire” in 2024. This dataset does not include data where there wasn’t a fire so any predictions in that category have been</w:t>
       </w:r>
       <w:r>
         <w:t xml:space="preserve"> incorrectly </w:t>
@@ -8198,6 +9497,9 @@
     </w:p>
     <w:p>
       <w:r>
+        <w:rPr>
+          <w:noProof/>
+        </w:rPr>
         <w:drawing>
           <wp:inline distT="0" distB="0" distL="0" distR="0" wp14:anchorId="1D33A470" wp14:editId="689C2888">
             <wp:extent cx="5731510" cy="4300220"/>
@@ -8237,16 +9539,19 @@
     </w:p>
     <w:p>
       <w:r>
-        <w:t xml:space="preserve">The model has struggled to predict well on this new unseen dataset. This may be due to the fire occurring at a different time of the year and elevation to the pacific palisade fire. The model was accurate predicting whether the data did actually contain a fire but inaccurate with the other </w:t>
-      </w:r>
-      <w:r>
         <w:lastRenderedPageBreak/>
-        <w:t>categories. The model may have had a heavy bias towards the live fire category due to the conditions present before, after and during being a lot hotter than the pacific palisades fire.</w:t>
-      </w:r>
-    </w:p>
-    <w:p>
-      <w:r>
-        <w:t>Overall, the model has been confused by the unseen data which may be due to the fact that the mountain in Ventura county is wildly different to the pacific palisades which is much closer to the coast meaning that the model has become confused due to the variance in conditions.</w:t>
+        <w:t>The model has struggled to predict well on this new unseen dataset. This may be due to the fire occurring at a different time of the year and elevation to the pacific palisade fire. The model was accurate predicting whether the data did actually contain a fire but inaccurate with the other categories. The model may have had a heavy bias towards the live fire category due to the conditions present before, after and during being a lot hotter than the pacific palisades fire.</w:t>
+      </w:r>
+    </w:p>
+    <w:p>
+      <w:r>
+        <w:t xml:space="preserve">Overall, the model has been confused by the unseen data which may be due to the fact that the mountain in </w:t>
+      </w:r>
+      <w:r>
+        <w:t>Ventura County</w:t>
+      </w:r>
+      <w:r>
+        <w:t xml:space="preserve"> is wildly different to the pacific palisades which is much closer to the coast meaning that the model has become confused due to the variance in conditions.</w:t>
       </w:r>
     </w:p>
     <w:p>
@@ -8254,29 +9559,14 @@
         <w:t>Additionally, every fire is different meaning that fires that start hotter and burn hotter may be predicted incorrectly a lot of the time.</w:t>
       </w:r>
       <w:r>
-        <w:t xml:space="preserve"> To test this theory d</w:t>
-      </w:r>
-      <w:r>
-        <w:t xml:space="preserve">ata </w:t>
-      </w:r>
-      <w:r>
-        <w:t>will</w:t>
-      </w:r>
-      <w:r>
-        <w:t xml:space="preserve"> be collected from </w:t>
-      </w:r>
-      <w:r>
-        <w:t xml:space="preserve">the summer </w:t>
-      </w:r>
-      <w:r>
-        <w:t>season in the year to check for any inaccuracies due to the higher thermal averages in summer</w:t>
-      </w:r>
-      <w:r>
-        <w:t>.</w:t>
-      </w:r>
-    </w:p>
-    <w:p>
-      <w:r>
+        <w:t xml:space="preserve"> To test this theory data will be collected from the summer season in the year to check for any inaccuracies due to the higher thermal averages in summer.</w:t>
+      </w:r>
+    </w:p>
+    <w:p>
+      <w:r>
+        <w:rPr>
+          <w:noProof/>
+        </w:rPr>
         <w:drawing>
           <wp:inline distT="0" distB="0" distL="0" distR="0" wp14:anchorId="518A3C9A" wp14:editId="28937F52">
             <wp:extent cx="4329240" cy="3296093"/>
@@ -8321,7 +9611,10 @@
     </w:p>
     <w:p>
       <w:r>
-        <w:t>The Ventura county fire dataset that the model was tested occurred in the autumn which results in the baseline thermal activity being much lower than in the height of summer. Therefore, from these tests and experiments the model is not accurate in the warmer months but becomes more accurate towards the winter months. This is easily explained by the dataset purely containing data about a singular fire which occurred in the winter.</w:t>
+        <w:t>The Ventura County</w:t>
+      </w:r>
+      <w:r>
+        <w:t xml:space="preserve"> fire dataset that the model was tested occurred in the autumn which results in the baseline thermal activity being much lower than in the height of summer. Therefore, from these tests and experiments the model is not accurate in the warmer months but becomes more accurate towards the winter months. This is easily explained by the dataset purely containing data about a singular fire which occurred in the winter.</w:t>
       </w:r>
     </w:p>
     <w:p>
@@ -8332,13 +9625,6 @@
         <w:t xml:space="preserve"> This would ensure that fires are captured correctly however, it may also introduce the problem of the model not picking up cooler fires that occur in the winter if it recognises hotter fires but struggles on cooler fires.</w:t>
       </w:r>
     </w:p>
-    <w:p/>
-    <w:p/>
-    <w:p/>
-    <w:p/>
-    <w:p/>
-    <w:p/>
-    <w:p/>
     <w:p/>
     <w:p/>
     <w:p>
@@ -8356,7 +9642,13 @@
     </w:p>
     <w:p>
       <w:r>
-        <w:t xml:space="preserve">To see if </w:t>
+        <w:t xml:space="preserve">To </w:t>
+      </w:r>
+      <w:r>
+        <w:t>test</w:t>
+      </w:r>
+      <w:r>
+        <w:t xml:space="preserve"> if </w:t>
       </w:r>
       <w:r>
         <w:t xml:space="preserve">the model is capable of predicting fires to a good degree in other regions it must be tested with data from another country with a similar climate and then another country with a completely different climate. The result of this test will show whether the model is </w:t>
@@ -8395,9 +9687,11 @@
       <w:pPr>
         <w:pStyle w:val="Heading3"/>
       </w:pPr>
+      <w:bookmarkStart w:id="43" w:name="_Toc194759794"/>
       <w:r>
         <w:t>Interface Testing</w:t>
       </w:r>
+      <w:bookmarkEnd w:id="43"/>
     </w:p>
     <w:p>
       <w:pPr>
@@ -8420,24 +9714,40 @@
         <w:t xml:space="preserve"> ensure that the interface cannot be broken by abnormal user inputs and behaviours it must be tested.</w:t>
       </w:r>
     </w:p>
+    <w:p/>
+    <w:p>
+      <w:pPr>
+        <w:pStyle w:val="Heading2"/>
+      </w:pPr>
+      <w:bookmarkStart w:id="44" w:name="_Toc194759795"/>
+      <w:r>
+        <w:t>Requirements to use the program</w:t>
+      </w:r>
+      <w:bookmarkEnd w:id="44"/>
+    </w:p>
+    <w:p>
+      <w:r>
+        <w:t>To use the program the user must have the following python libraries installed:</w:t>
+      </w:r>
+    </w:p>
     <w:p>
       <w:pPr>
         <w:pStyle w:val="Heading1"/>
         <w:jc w:val="both"/>
       </w:pPr>
-      <w:bookmarkStart w:id="35" w:name="_Toc194327726"/>
+      <w:bookmarkStart w:id="45" w:name="_Toc194759796"/>
       <w:r>
         <w:lastRenderedPageBreak/>
         <w:t>External concerns</w:t>
       </w:r>
-      <w:bookmarkEnd w:id="35"/>
+      <w:bookmarkEnd w:id="45"/>
     </w:p>
     <w:p>
       <w:pPr>
         <w:pStyle w:val="Heading2"/>
         <w:jc w:val="both"/>
       </w:pPr>
-      <w:bookmarkStart w:id="36" w:name="_Toc194327727"/>
+      <w:bookmarkStart w:id="46" w:name="_Toc194759797"/>
       <w:r>
         <w:t xml:space="preserve">Legal, </w:t>
       </w:r>
@@ -8453,7 +9763,7 @@
       <w:r>
         <w:t>thical issues</w:t>
       </w:r>
-      <w:bookmarkEnd w:id="36"/>
+      <w:bookmarkEnd w:id="46"/>
     </w:p>
     <w:p>
       <w:r>
@@ -8484,13 +9794,16 @@
         <w:pStyle w:val="Heading2"/>
         <w:jc w:val="both"/>
       </w:pPr>
-      <w:bookmarkStart w:id="37" w:name="_Toc194327728"/>
+      <w:bookmarkStart w:id="47" w:name="_Toc194759798"/>
       <w:r>
         <w:t>Commercial issues and exploitation</w:t>
       </w:r>
-      <w:bookmarkEnd w:id="37"/>
-    </w:p>
-    <w:p>
+      <w:bookmarkEnd w:id="47"/>
+    </w:p>
+    <w:p>
+      <w:pPr>
+        <w:jc w:val="both"/>
+      </w:pPr>
       <w:r>
         <w:t xml:space="preserve">Due to the data having to be extracted from </w:t>
       </w:r>
@@ -8505,6 +9818,12 @@
       </w:r>
       <w:r>
         <w:t>from the google earth engine.</w:t>
+      </w:r>
+      <w:r>
+        <w:t xml:space="preserve"> </w:t>
+      </w:r>
+      <w:r>
+        <w:t>The project also does not include any material or libraries that require any licenses paid or unpaid to use meaning that the project can be used for free without any financial contribution.</w:t>
       </w:r>
     </w:p>
     <w:p>
@@ -8535,22 +9854,49 @@
         <w:pStyle w:val="Heading1"/>
         <w:jc w:val="both"/>
       </w:pPr>
-      <w:bookmarkStart w:id="38" w:name="_Toc194327729"/>
+      <w:bookmarkStart w:id="48" w:name="_Toc194759799"/>
       <w:r>
         <w:lastRenderedPageBreak/>
         <w:t>Evaluation</w:t>
       </w:r>
-      <w:r>
-        <w:t xml:space="preserve"> and discussion of results</w:t>
-      </w:r>
-      <w:bookmarkEnd w:id="38"/>
+      <w:bookmarkEnd w:id="48"/>
+      <w:r>
+        <w:t xml:space="preserve"> </w:t>
+      </w:r>
     </w:p>
     <w:p>
       <w:pPr>
         <w:pStyle w:val="Heading2"/>
-      </w:pPr>
-      <w:r>
-        <w:t>Results</w:t>
+        <w:numPr>
+          <w:ilvl w:val="0"/>
+          <w:numId w:val="0"/>
+        </w:numPr>
+      </w:pPr>
+    </w:p>
+    <w:p>
+      <w:pPr>
+        <w:pStyle w:val="Heading2"/>
+      </w:pPr>
+      <w:bookmarkStart w:id="49" w:name="_Toc194759800"/>
+      <w:r>
+        <w:t>Model evaluation</w:t>
+      </w:r>
+      <w:bookmarkEnd w:id="49"/>
+    </w:p>
+    <w:p>
+      <w:r>
+        <w:t xml:space="preserve">The model was successful in regard to its accuracy target on the training and testing data where it achieved an accuracy of above 80% on both sets of data. This completes one of the project’s objectives it has maintained a high accuracy score and from this will enable local authorities or agencies to act accordingly to prevent fires. </w:t>
+      </w:r>
+    </w:p>
+    <w:p>
+      <w:r>
+        <w:t xml:space="preserve">However, the model did falter a large amount in tests which included data from a different area of California at a different time of year. This may be to do with the different baseline thermal temperatures in that area at that time of year as well as the fact that there </w:t>
+      </w:r>
+      <w:r>
+        <w:t>are</w:t>
+      </w:r>
+      <w:r>
+        <w:t xml:space="preserve"> no standard values to a fire and the data was normalised around the training dataset resulting in higher average temperatures possibly being falsely predicted as a fire.</w:t>
       </w:r>
     </w:p>
     <w:p/>
@@ -8558,71 +9904,88 @@
       <w:pPr>
         <w:pStyle w:val="Heading2"/>
       </w:pPr>
-      <w:bookmarkStart w:id="39" w:name="_Toc194327730"/>
-      <w:r>
-        <w:t>Issues with Landsat 9</w:t>
-      </w:r>
-      <w:bookmarkEnd w:id="39"/>
-      <w:r>
-        <w:t xml:space="preserve"> data</w:t>
-      </w:r>
-    </w:p>
-    <w:p>
-      <w:r>
-        <w:t xml:space="preserve">Landsat 9 is a satellite that orbits the earth, this can become an issue in collecting data for a specific region. This is because the revisit time of Landsat 9 is </w:t>
-      </w:r>
-      <w:r>
-        <w:t>sixteen</w:t>
-      </w:r>
-      <w:r>
-        <w:t xml:space="preserve"> days. Any thermal activity or disturbances will not be able to be collected and thus no prediction can be made. These blind spots mean that fires that start within that window of time may not have been able to be predicted whatsoever and have slipped through. </w:t>
-      </w:r>
-    </w:p>
-    <w:p>
-      <w:r>
-        <w:t>Additionally, since the data does not include the day that it was taken it is difficult to calculate whether the data is in the day or night from solar angles available in the data. I could calculate this in the dataset I made however the data taken from the user may not include the date the data was taken by the sensor on. This can result in predictions not being as accurate depending on the time of day</w:t>
-      </w:r>
-      <w:r>
-        <w:t xml:space="preserve"> and season</w:t>
-      </w:r>
-      <w:r>
-        <w:t xml:space="preserve"> the data was taken on as it is hard to take that into account so for this </w:t>
-      </w:r>
-      <w:r>
-        <w:t>project,</w:t>
-      </w:r>
-      <w:r>
-        <w:t xml:space="preserve"> </w:t>
-      </w:r>
-      <w:r>
-        <w:t>therefore</w:t>
-      </w:r>
-      <w:r>
-        <w:t xml:space="preserve"> time of day</w:t>
-      </w:r>
-      <w:r>
-        <w:t xml:space="preserve"> and season have been ignored</w:t>
-      </w:r>
-      <w:r>
-        <w:t xml:space="preserve"> and used thermal readings and vegetation quality to form a prediction</w:t>
-      </w:r>
-      <w:r>
-        <w:t xml:space="preserve"> instead</w:t>
-      </w:r>
-      <w:r>
-        <w:t>.</w:t>
-      </w:r>
-      <w:r>
-        <w:t xml:space="preserve"> </w:t>
-      </w:r>
-    </w:p>
+      <w:bookmarkStart w:id="50" w:name="_Toc194759801"/>
+      <w:r>
+        <w:t>Dataset evaluation</w:t>
+      </w:r>
+      <w:bookmarkEnd w:id="50"/>
+    </w:p>
+    <w:p>
+      <w:r>
+        <w:t>The dataset</w:t>
+      </w:r>
+      <w:r>
+        <w:t xml:space="preserve"> creation</w:t>
+      </w:r>
+      <w:r>
+        <w:t xml:space="preserve"> was also </w:t>
+      </w:r>
+      <w:r>
+        <w:t xml:space="preserve">somewhat </w:t>
+      </w:r>
+      <w:r>
+        <w:t xml:space="preserve">successful as it </w:t>
+      </w:r>
+      <w:r>
+        <w:t>includes</w:t>
+      </w:r>
+      <w:r>
+        <w:t xml:space="preserve"> a large amount of </w:t>
+      </w:r>
+      <w:r>
+        <w:t>high-quality</w:t>
+      </w:r>
+      <w:r>
+        <w:t xml:space="preserve"> data that covers a large number of thermal or geological factors that could be used to predict the likelihood of a fire.</w:t>
+      </w:r>
+      <w:r>
+        <w:t xml:space="preserve"> Furthermore, the dataset i</w:t>
+      </w:r>
+      <w:r>
+        <w:t xml:space="preserve">ncludes different states of </w:t>
+      </w:r>
+      <w:r>
+        <w:t>the pacific palisades</w:t>
+      </w:r>
+      <w:r>
+        <w:t xml:space="preserve"> wildfire such as before, during and after the fire</w:t>
+      </w:r>
+      <w:r>
+        <w:t xml:space="preserve"> which allows the model to learn the key differences and patterns to form a prediction.</w:t>
+      </w:r>
+    </w:p>
+    <w:p>
+      <w:r>
+        <w:t>However, s</w:t>
+      </w:r>
+      <w:r>
+        <w:t xml:space="preserve">ince </w:t>
+      </w:r>
+      <w:r>
+        <w:t xml:space="preserve">Landsat 9 is a satellite that orbits the earth, </w:t>
+      </w:r>
+      <w:r>
+        <w:t xml:space="preserve">it </w:t>
+      </w:r>
+      <w:r>
+        <w:t xml:space="preserve">can be an issue in collecting data for a specific region. This is because the revisit time of Landsat 9 is sixteen days. Any thermal activity or disturbances will not be able to be collected and thus no prediction can be made. These blind spots mean that fires that start within that window of time may not have been able to be predicted whatsoever and have slipped through. </w:t>
+      </w:r>
+    </w:p>
+    <w:p>
+      <w:r>
+        <w:t xml:space="preserve">Additionally, since the data does not include the day that it was taken it is difficult to calculate whether the data is in the day or night from solar angles available in the data. I could calculate this in the dataset I made however the data taken from the user may not include the date the data was taken by the sensor on. This can result in predictions not being as accurate depending on the time of day and season the data was taken on as it is hard to take that into account so for this project, therefore time of day and season have been ignored and used thermal readings and vegetation quality to form a prediction instead. </w:t>
+      </w:r>
+    </w:p>
+    <w:p/>
     <w:p>
       <w:pPr>
         <w:pStyle w:val="Heading2"/>
       </w:pPr>
+      <w:bookmarkStart w:id="51" w:name="_Toc194759802"/>
       <w:r>
         <w:t>Evaluation</w:t>
       </w:r>
+      <w:bookmarkEnd w:id="51"/>
     </w:p>
     <w:p>
       <w:r>
@@ -8630,6 +9993,9 @@
       </w:r>
       <w:r>
         <w:t xml:space="preserve"> this project has been</w:t>
+      </w:r>
+      <w:r>
+        <w:t xml:space="preserve"> moderately successful in its aims as a model and dataset were created which can predict fires. However, there are many drawbacks to the data available and so it has exposed weaknesses of the model and dataset. Part of this is due to the data available not being able to be captured within a shorter period of time than the sixteen days revisit time therefore making it hard to capture a large number of fires to use in dataset as fires may occur but not be captured by Landsat 9. This resulted in the dataset only including a single fire which means that fires or thermal activity that is wildly different to the conditions present in this fire being incorrectly predicted by the model.</w:t>
       </w:r>
     </w:p>
     <w:p>
@@ -8637,65 +10003,82 @@
         <w:pStyle w:val="Heading1"/>
         <w:jc w:val="both"/>
       </w:pPr>
-      <w:bookmarkStart w:id="40" w:name="_Toc194327731"/>
+      <w:bookmarkStart w:id="52" w:name="_Toc194759803"/>
       <w:r>
         <w:lastRenderedPageBreak/>
-        <w:t>Conclusion</w:t>
-      </w:r>
-      <w:bookmarkEnd w:id="40"/>
+        <w:t>Reflection</w:t>
+      </w:r>
+      <w:bookmarkEnd w:id="52"/>
     </w:p>
     <w:p>
       <w:pPr>
         <w:pStyle w:val="Heading2"/>
-        <w:jc w:val="both"/>
-      </w:pPr>
-      <w:bookmarkStart w:id="41" w:name="_Toc194327732"/>
-      <w:r>
-        <w:t>Project management</w:t>
-      </w:r>
-      <w:bookmarkEnd w:id="41"/>
+      </w:pPr>
+      <w:bookmarkStart w:id="53" w:name="_Toc194759804"/>
+      <w:r>
+        <w:t>Development reflection</w:t>
+      </w:r>
+      <w:bookmarkEnd w:id="53"/>
+      <w:r>
+        <w:t xml:space="preserve"> </w:t>
+      </w:r>
+    </w:p>
+    <w:p>
+      <w:r>
+        <w:t>The project was able to maintain its schedule due to the use of sprints, this allowed development to be done in multiple different stages. This allowed for development to flow well and reflections after each sprint to inform the next sprint’s development.</w:t>
+      </w:r>
+    </w:p>
+    <w:p>
+      <w:r>
+        <w:t>The model being designed to be lightweight assisted development meaning that it would never take more than a couple of minutes to train or test. However, this may be also partly due to the lack of available data for the palisade region where training data was captured. Due to the lack of available dedicated GPU for the project it was trained on a CPU meaning that training on a dedicated GPU could offset some of the time taken to train if the dataset was larger.</w:t>
+      </w:r>
     </w:p>
     <w:p>
       <w:pPr>
         <w:pStyle w:val="Heading2"/>
-        <w:jc w:val="both"/>
-      </w:pPr>
-      <w:bookmarkStart w:id="42" w:name="_Toc194327733"/>
-      <w:r>
-        <w:t>Risk management</w:t>
-      </w:r>
-      <w:bookmarkEnd w:id="42"/>
+      </w:pPr>
+      <w:bookmarkStart w:id="54" w:name="_Toc194759805"/>
+      <w:r>
+        <w:t>Future Development</w:t>
+      </w:r>
+      <w:bookmarkEnd w:id="54"/>
+    </w:p>
+    <w:p>
+      <w:r>
+        <w:t>To further develop the work on this project, creating a dataset that covers more fires across the different seasons and years will improve the results of the model. Additionally, if the new data included the date and time the data was captured from then the model could learn to differentiate between the seasons as the background thermal values differ between the seasons and the time of day. Having a model that could differentiate between these and a dataset that would include much more data would significantly improve the model’s performance.</w:t>
+      </w:r>
     </w:p>
     <w:p>
       <w:pPr>
         <w:pStyle w:val="Heading2"/>
-        <w:jc w:val="both"/>
-      </w:pPr>
-      <w:bookmarkStart w:id="43" w:name="_Toc194327734"/>
-      <w:r>
-        <w:t>General conclusions</w:t>
-      </w:r>
-      <w:bookmarkEnd w:id="43"/>
-    </w:p>
-    <w:p>
-      <w:pPr>
-        <w:jc w:val="both"/>
-      </w:pPr>
+      </w:pPr>
+      <w:bookmarkStart w:id="55" w:name="_Toc194759806"/>
+      <w:r>
+        <w:t>Future Research</w:t>
+      </w:r>
+      <w:bookmarkEnd w:id="55"/>
+    </w:p>
+    <w:p>
+      <w:r>
+        <w:t>Furthering on from improving the data inside of the dataset, it would also be useful to research different regions and then either use multiple models each tailored to each country/region or expand the model to understand the differences between regions. This would help other regions across the globe protect against wildfires, not just California. A model and dataset that would be useful for entire countries or continents would be an invaluable tool and would save countless lives, ecosystems and infrastructure.</w:t>
+      </w:r>
     </w:p>
     <w:p>
       <w:pPr>
         <w:pStyle w:val="Heading2"/>
       </w:pPr>
-      <w:r>
-        <w:t>Future Development</w:t>
-      </w:r>
-    </w:p>
-    <w:p>
-      <w:pPr>
-        <w:pStyle w:val="Heading2"/>
-      </w:pPr>
-      <w:r>
-        <w:t>Future Research</w:t>
+      <w:bookmarkStart w:id="56" w:name="_Toc194759807"/>
+      <w:r>
+        <w:t>Project Conclusions</w:t>
+      </w:r>
+      <w:bookmarkEnd w:id="56"/>
+    </w:p>
+    <w:p>
+      <w:r>
+        <w:t xml:space="preserve">The project aimed to create both a dataset and a model that would be trained on the dataset </w:t>
+      </w:r>
+      <w:r>
+        <w:t>to predict the likelihood of a wildfire occurring in an area. Based on the results of the project, the model is effective in predicting fires but has clear weaknesses due to the lack of available data resulting in the data only including one fire at one time of the year which results in the model being confused by data that has a higher background thermal reading such as is present in the summer months.</w:t>
       </w:r>
     </w:p>
     <w:p>
@@ -8703,12 +10086,12 @@
         <w:pStyle w:val="UnnumberedHeading1"/>
         <w:jc w:val="both"/>
       </w:pPr>
-      <w:bookmarkStart w:id="44" w:name="_Toc194327735"/>
+      <w:bookmarkStart w:id="57" w:name="_Toc194759808"/>
       <w:r>
         <w:lastRenderedPageBreak/>
         <w:t>References</w:t>
       </w:r>
-      <w:bookmarkEnd w:id="44"/>
+      <w:bookmarkEnd w:id="57"/>
     </w:p>
     <w:sdt>
       <w:sdtPr>
@@ -9446,12 +10829,12 @@
         <w:pStyle w:val="UnnumberedHeading1"/>
         <w:jc w:val="both"/>
       </w:pPr>
-      <w:bookmarkStart w:id="45" w:name="_Toc194327736"/>
+      <w:bookmarkStart w:id="58" w:name="_Toc194759809"/>
       <w:r>
         <w:lastRenderedPageBreak/>
         <w:t>Appendix A</w:t>
       </w:r>
-      <w:bookmarkEnd w:id="45"/>
+      <w:bookmarkEnd w:id="58"/>
       <w:r>
         <w:t xml:space="preserve"> </w:t>
       </w:r>
@@ -9461,12 +10844,12 @@
         <w:pStyle w:val="UnnumberedHeading1"/>
         <w:jc w:val="both"/>
       </w:pPr>
-      <w:bookmarkStart w:id="46" w:name="_Toc194327737"/>
+      <w:bookmarkStart w:id="59" w:name="_Toc194759810"/>
       <w:r>
         <w:lastRenderedPageBreak/>
         <w:t>Appendix B</w:t>
       </w:r>
-      <w:bookmarkEnd w:id="46"/>
+      <w:bookmarkEnd w:id="59"/>
       <w:r>
         <w:t xml:space="preserve"> </w:t>
       </w:r>
@@ -11974,14 +13357,14 @@
     <w:charset w:val="00"/>
     <w:family w:val="swiss"/>
     <w:pitch w:val="variable"/>
-    <w:sig w:usb0="E4002EFF" w:usb1="C200247B" w:usb2="00000009" w:usb3="00000000" w:csb0="000001FF" w:csb1="00000000"/>
+    <w:sig w:usb0="E4002EFF" w:usb1="C000247B" w:usb2="00000009" w:usb3="00000000" w:csb0="000001FF" w:csb1="00000000"/>
   </w:font>
   <w:font w:name="Calibri Light">
     <w:panose1 w:val="020F0302020204030204"/>
     <w:charset w:val="00"/>
     <w:family w:val="swiss"/>
     <w:pitch w:val="variable"/>
-    <w:sig w:usb0="E4002EFF" w:usb1="C200247B" w:usb2="00000009" w:usb3="00000000" w:csb0="000001FF" w:csb1="00000000"/>
+    <w:sig w:usb0="E4002EFF" w:usb1="C000247B" w:usb2="00000009" w:usb3="00000000" w:csb0="000001FF" w:csb1="00000000"/>
   </w:font>
   <w:font w:name="Segoe UI">
     <w:panose1 w:val="020B0502040204020203"/>
@@ -12021,6 +13404,7 @@
   </w:compat>
   <w:rsids>
     <w:rsidRoot w:val="004C6E87"/>
+    <w:rsid w:val="0000559F"/>
     <w:rsid w:val="0002337C"/>
     <w:rsid w:val="00067916"/>
     <w:rsid w:val="00077713"/>
@@ -12053,6 +13437,8 @@
     <w:rsid w:val="00D6770B"/>
     <w:rsid w:val="00D678A8"/>
     <w:rsid w:val="00DD1A81"/>
+    <w:rsid w:val="00EF4197"/>
+    <w:rsid w:val="00F55F27"/>
     <w:rsid w:val="00F56188"/>
     <w:rsid w:val="00F968A4"/>
   </w:rsids>

</xml_diff>